<commit_message>
Revise manuscript: remove machine-prose tells, add quotations and golden moments
Line-edit all thirteen chapters to strip contrast-trick sentences,
punchline fragments, filler intensifiers and repeated mirror lines.
Add two sourced quotations per chapter from figures such as Whitehead,
Dewey, Kahneman, Popper, Polya, Orwell, Emerson, Ginott and Palmer,
with a new Lines Quoted section in the References. Sharpen opening
and closing beats, give children their own lines of dialogue, and tie
the final image back to the question wall of Chapter 3. Rebuild the
Kindle .docx.

Co-Authored-By: Claude Fable 5.1 <noreply@anthropic.com>
Claude-Session: https://claude.ai/code/session_01YJnaUePRGdVDe7a2xdWPnc
</commit_message>
<xml_diff>
--- a/book/Teaching_the_Right_Question__Manuscript.docx
+++ b/book/Teaching_the_Right_Question__Manuscript.docx
@@ -401,31 +401,31 @@
         <w:spacing w:before="120" w:after="120"/>
       </w:pPr>
       <w:r>
-        <w:t xml:space="preserve">That included the three students who usually struggled. Not nearly right. Perfect. Every step shown, every line labelled, every answer boxed. One of them had even written a note beside question eleven explaining why substitution was the sensible method. He had never written a note beside anything before.</w:t>
-      </w:r>
-    </w:p>
-    <w:p>
-      <w:pPr>
-        <w:spacing w:before="120" w:after="120"/>
-      </w:pPr>
-      <w:r>
-        <w:t xml:space="preserve">The next morning, she asked him to come to the board and talk the class through question seven. He stood there with the marker in his hand, looking at the board, then at his book, then at the board again. Nobody laughed. The silence lasted perhaps nine seconds, which is a very long time at the front of a room.</w:t>
-      </w:r>
-    </w:p>
-    <w:p>
-      <w:pPr>
-        <w:spacing w:before="120" w:after="120"/>
-      </w:pPr>
-      <w:r>
-        <w:t xml:space="preserve">She thanked him and let him sit down. Later she told me that was the moment she understood what she'd actually set. The homework hadn't measured understanding. It had measured access to an answer, and now everyone had access.</w:t>
-      </w:r>
-    </w:p>
-    <w:p>
-      <w:pPr>
-        <w:spacing w:before="120" w:after="120"/>
-      </w:pPr>
-      <w:r>
-        <w:t xml:space="preserve">The following week she tried again. Six questions instead of twelve. Beneath each one, a single line for the student to write one sentence about where it felt hardest. And at the bottom of the page, a space for one question of their own about the topic, anything they were still unsure of.</w:t>
+        <w:t xml:space="preserve">That included the three students who usually struggled. Every step shown, every line labelled, every answer boxed. One of them had even written a note beside question eleven explaining why substitution was the sensible method. He had never written a note beside anything before.</w:t>
+      </w:r>
+    </w:p>
+    <w:p>
+      <w:pPr>
+        <w:spacing w:before="120" w:after="120"/>
+      </w:pPr>
+      <w:r>
+        <w:t xml:space="preserve">The next morning, she asked him to come to the board and talk the class through question seven. He stood there with the marker in his hand and never took the cap off. He looked at the board, then at his book, then at the board again. Nobody laughed. The silence lasted perhaps nine seconds, which is a very long time at the front of a room. Then he said, "I did it at home, Miss. I know it's right."</w:t>
+      </w:r>
+    </w:p>
+    <w:p>
+      <w:pPr>
+        <w:spacing w:before="120" w:after="120"/>
+      </w:pPr>
+      <w:r>
+        <w:t xml:space="preserve">She thanked him and let him sit down. Later she told me that was the moment she understood what she had set. The homework had measured access to an answer, and now everyone had access.</w:t>
+      </w:r>
+    </w:p>
+    <w:p>
+      <w:pPr>
+        <w:spacing w:before="120" w:after="120"/>
+      </w:pPr>
+      <w:r>
+        <w:t xml:space="preserve">The following week she tried again. Six questions instead of twelve. Beneath each one, a single line for the student to write one sentence about where it felt hardest, and at the bottom of the page, a space for one question of their own about the topic, anything they were still unsure of.</w:t>
       </w:r>
     </w:p>
     <w:p>
@@ -460,7 +460,7 @@
         <w:t xml:space="preserve">Does it matter which one?</w:t>
       </w:r>
       <w:r>
-        <w:t xml:space="preserve"> It was the best thing he'd handed her all year, and it was his.</w:t>
+        <w:t xml:space="preserve"> It was in pencil, pressed hard enough to read from the back of the page. She kept it. It is pinned above her desk in the staff room.</w:t>
       </w:r>
     </w:p>
     <w:p>
@@ -484,7 +484,7 @@
         <w:spacing w:before="120" w:after="120"/>
       </w:pPr>
       <w:r>
-        <w:t xml:space="preserve">The second book began with a reversal. For most of history, answers were expensive and questions were cheap. Now it's the other way round. An answer to almost anything arrives in seconds, fluent and confident, and the only scarce thing left is the question that summons it.</w:t>
+        <w:t xml:space="preserve">The second book began with a reversal. For most of history, answers were expensive and questions were cheap. Now it's the other way round. An answer to almost anything arrives in seconds, fluent and confident, like the eleven-second lesson plan the second book described, correct in every line and written for a class that didn't exist. The only scarce thing left is the question that summons it.</w:t>
       </w:r>
     </w:p>
     <w:p>
@@ -508,7 +508,24 @@
         <w:spacing w:before="120" w:after="120"/>
       </w:pPr>
       <w:r>
-        <w:t xml:space="preserve">That link has come loose. The answer can now be produced with no thinking at all, by anyone, in the time it takes to photograph a page. The answer is still there. It just no longer tells you anything.</w:t>
+        <w:t xml:space="preserve">That link has come loose. The answer can now be produced with no thinking at all, by anyone, in the time it takes to photograph a page. The answer is still there, boxed and labelled. An answer that cannot be wrong tells you nothing about the person who handed it in.</w:t>
+      </w:r>
+    </w:p>
+    <w:p>
+      <w:pPr>
+        <w:spacing w:before="120" w:after="120"/>
+      </w:pPr>
+      <w:r>
+        <w:t xml:space="preserve">Alfred North Whitehead saw the shape of this a century early. In </w:t>
+      </w:r>
+      <w:r>
+        <w:rPr>
+          <w:i/>
+        </w:rPr>
+        <w:t xml:space="preserve">The Aims of Education</w:t>
+      </w:r>
+      <w:r>
+        <w:t xml:space="preserve">, published in 1929, he put it more bluntly than I would dare to in a staff room: "A merely well-informed man is the most useless bore on God's earth." He was describing a certain kind of graduate. We now have a window on every desk that will make one of anybody, free of charge.</w:t>
       </w:r>
     </w:p>
     <w:p>
@@ -542,7 +559,15 @@
         <w:spacing w:before="120" w:after="120"/>
       </w:pPr>
       <w:r>
-        <w:t xml:space="preserve">I want to be careful here, because it would be easy to hear this as a lament. It isn't. Nothing about the purpose of teaching has changed. We still want children who can think through a problem, notice when they're stuck, and check whether what they've produced is any good. The choosing of what to ask, the weighing of what comes back, the deciding what to do with it, all of that is still ours and still theirs. What changed is only what's scarce. The answer used to be scarce, so we taught towards it and measured it. Now the scarce things are the question, the checking and the judgement. Those were always the point. We used to reach them through the answer, and now we have to teach them on purpose.</w:t>
+        <w:t xml:space="preserve">None of this is a lament. Nothing about the purpose of teaching has changed. We still want children who can think through a problem, notice when they're stuck, and check whether what they've produced is any good. The choosing of what to ask, the weighing of what comes back, the deciding what to do with it, all of that is still ours and still theirs. What changed is only what's scarce. The answer used to be scarce, so we taught towards it and measured it. Now the scarce things are the question, the checking and the judgement. Those were always the point. We used to reach them through the answer, and now we have to teach them on purpose.</w:t>
+      </w:r>
+    </w:p>
+    <w:p>
+      <w:pPr>
+        <w:spacing w:before="120" w:after="120"/>
+      </w:pPr>
+      <w:r>
+        <w:t xml:space="preserve">The physicist Isidor Isaac Rabi, who won a Nobel Prize for his work on the magnetism of atoms, liked to tell a story about his mother. The other mothers on his street asked their children what they had learned at school that day. His asked him, every day, "Did you ask a good question today?" He gave her the credit for making him a scientist. It was a good question in his day. It has become the necessary one in ours.</w:t>
       </w:r>
     </w:p>
     <w:p>
@@ -603,7 +628,7 @@
         <w:spacing w:before="120" w:after="120"/>
       </w:pPr>
       <w:r>
-        <w:t xml:space="preserve">The reply is instant and sensible. Detection software, honour codes, handwritten work in class, clear consequences. It's the list from the last staff meeting, and it's the list that hasn't worked. The question assumed the problem was the students, so the tool solved for the students.</w:t>
+        <w:t xml:space="preserve">The reply is instant and sensible: detection software, honour codes, handwritten work in class, clear consequences. It's the list from the last staff meeting, and it's the list that hasn't worked. The question assumed the problem was the students, so the tool solved for the students.</w:t>
       </w:r>
     </w:p>
     <w:p>
@@ -625,7 +650,7 @@
         <w:spacing w:before="120" w:after="120"/>
       </w:pPr>
       <w:r>
-        <w:t xml:space="preserve">The reply is less comfortable and much more useful. The task has one right answer. The task can be completed without any reference to what happened in the lesson. The marks reward the finished product and give nothing for the route. Nobody is ever asked to explain their work aloud. None of this is about character. All of it is about design, and a department can change design on a Thursday afternoon.</w:t>
+        <w:t xml:space="preserve">The reply is less comfortable and much more useful. The task has one right answer. The task can be completed without any reference to what happened in the lesson. The marks reward the finished product and give nothing for the route. Nobody is ever asked to explain their work aloud. Every item on that list is a matter of design, and a department can change design on a Thursday afternoon.</w:t>
       </w:r>
     </w:p>
     <w:p>
@@ -675,7 +700,7 @@
         <w:spacing w:before="120" w:after="120"/>
       </w:pPr>
       <w:r>
-        <w:t xml:space="preserve">The suggestions turn into questions she could actually ask at the table. Which part of this did you do first? Which part would you rather not have to do at all? It turns out the daughter isn't avoiding the essay, only the first paragraph, because she never knows how to begin and the tool begins for her. That's a smaller problem than the one the parent walked in with, and it can be worked on with a cup of tea and twenty minutes.</w:t>
+        <w:t xml:space="preserve">The suggestions turn into questions she could ask at the table. Which part of this did you do first? Which part would you rather not have to do at all? The daughter shrugs at the first one and answers the second without looking up. "The start. I never know how to start it, so it starts it for me." That's a smaller problem than the one the parent walked in with, and it can be worked on with a cup of tea and twenty minutes.</w:t>
       </w:r>
     </w:p>
     <w:p>
@@ -736,7 +761,7 @@
         <w:spacing w:before="120" w:after="120"/>
       </w:pPr>
       <w:r>
-        <w:t xml:space="preserve">🔍 Takeaway: The tool answered each of these people exactly as well as they asked. The loud question got a policy. The quiet one got a place to start.</w:t>
+        <w:t xml:space="preserve">🔍 Takeaway: The tool answered each of these people as well as they asked. The loud question got a policy. The quiet one got a place to start.</w:t>
       </w:r>
     </w:p>
     <w:p>
@@ -752,7 +777,7 @@
         <w:spacing w:before="120" w:after="120"/>
       </w:pPr>
       <w:r>
-        <w:t xml:space="preserve">If you've read the first book, you already own the tools for this. They need pointing, not replacing, at a classroom where every desk has an answer key.</w:t>
+        <w:t xml:space="preserve">If you've read the first book, you already own the tools for this. They only need pointing at a classroom where every desk has an answer key.</w:t>
       </w:r>
     </w:p>
     <w:p>
@@ -775,7 +800,7 @@
         <w:t xml:space="preserve">What might I be missing?</w:t>
       </w:r>
       <w:r>
-        <w:t xml:space="preserve"> In a classroom this is the moment before you set the task, not the moment after you mark it. The worksheet is ready. The pause is where you ask what thinking this task is supposed to produce, and whether a student could complete it without producing any.</w:t>
+        <w:t xml:space="preserve"> In a classroom this is the moment before you set the task, rather than the moment after you mark it. The worksheet is ready. The pause is where you ask what thinking this task is supposed to produce, and whether a student could complete it without producing any.</w:t>
       </w:r>
     </w:p>
     <w:p>
@@ -830,7 +855,7 @@
         <w:t xml:space="preserve">Why did you use it?</w:t>
       </w:r>
       <w:r>
-        <w:t xml:space="preserve"> closes a conversation before it starts. </w:t>
+        <w:t xml:space="preserve"> produces the small flinch the second book described, and nothing after it. </w:t>
       </w:r>
       <w:r>
         <w:rPr>
@@ -839,7 +864,7 @@
         <w:t xml:space="preserve">Which part did it do, and which part did you do?</w:t>
       </w:r>
       <w:r>
-        <w:t xml:space="preserve"> opens one. I've asked the first version more often than I'd like to admit, and I've never once learnt anything from the answer.</w:t>
+        <w:t xml:space="preserve"> opens a conversation. I've asked the first version more often than I'd like to admit, and I've never once learnt anything from the answer.</w:t>
       </w:r>
     </w:p>
     <w:p>
@@ -853,7 +878,7 @@
         <w:t xml:space="preserve">Staying open.</w:t>
       </w:r>
       <w:r>
-        <w:t xml:space="preserve"> The first task you set won't be right. Neither was hers. Six questions with a sentence each was a second attempt, and she's on her fourth now. The teachers getting somewhere with this aren't the ones who found the perfect assignment. They're the ones willing to say </w:t>
+        <w:t xml:space="preserve"> The first task you set won't be right. Neither was hers. Six questions with a sentence each was a second attempt, and she's on her fourth now. The teachers getting somewhere with this are the ones willing to say </w:t>
       </w:r>
       <w:r>
         <w:rPr>
@@ -884,7 +909,7 @@
         <w:spacing w:before="120" w:after="120"/>
       </w:pPr>
       <w:r>
-        <w:t xml:space="preserve">This isn't new craft. You've been practising it with children for years. What changed is the speed of the feedback. A weak task used to take a term to reveal itself, in a mid-year exam nobody could explain. Now it reveals itself the next morning, in twenty-seven perfect books. The speed of the feedback changed. The craft didn't.</w:t>
+        <w:t xml:space="preserve">You've been practising this craft with children for years. What changed is the speed of the feedback. A weak task used to take a term to reveal itself, in a mid-year exam nobody could explain. Now it reveals itself the next morning, in twenty-seven perfect books.</w:t>
       </w:r>
     </w:p>
     <w:p>
@@ -900,15 +925,15 @@
         <w:spacing w:before="120" w:after="120"/>
       </w:pPr>
       <w:r>
-        <w:t xml:space="preserve">Put the maths teacher, the head of department, the parent and the boy with the bus to catch side by side and the same shape appears each time. The first attempt reached for a finished thing, or for control over someone else. It got exactly that, and it told nobody anything. The second attempt slowed down, said what was true about the situation, and asked for a place where thinking had to happen. It came back messier and less tidy to mark. It also came back belonging to someone.</w:t>
-      </w:r>
-    </w:p>
-    <w:p>
-      <w:pPr>
-        <w:spacing w:before="120" w:after="120"/>
-      </w:pPr>
-      <w:r>
-        <w:t xml:space="preserve">The window on the desk was the same in every case. What it had been asked to do was not.</w:t>
+        <w:t xml:space="preserve">Put the maths teacher, the head of department, the parent and the boy with the bus to catch side by side and the same shape appears each time. The first attempt reached for a finished thing, or for control over someone else. It got what it reached for, and it told nobody anything. The second attempt slowed down, said what was true about the situation, and asked for a place where thinking had to happen. It came back messier and less tidy to mark. It also came back belonging to someone.</w:t>
+      </w:r>
+    </w:p>
+    <w:p>
+      <w:pPr>
+        <w:spacing w:before="120" w:after="120"/>
+      </w:pPr>
+      <w:r>
+        <w:t xml:space="preserve">Nobody changed the window between the first attempt and the second. All that changed was what it was asked for.</w:t>
       </w:r>
     </w:p>
     <w:p>
@@ -932,7 +957,7 @@
         <w:spacing w:before="120" w:after="120"/>
       </w:pPr>
       <w:r>
-        <w:t xml:space="preserve">Not the one that came back wrong. The one that came back right, all the way down the pile, and left you no wiser about any child in the room.</w:t>
+        <w:t xml:space="preserve">I don't mean the one that came back wrong. I mean the one that came back right, all the way down the pile, and left you no wiser about any child in the room.</w:t>
       </w:r>
     </w:p>
     <w:p>
@@ -973,7 +998,7 @@
         <w:spacing w:before="120" w:after="120"/>
       </w:pPr>
       <w:r>
-        <w:t xml:space="preserve">For the next week, before you set any task, write one sentence for yourself. Not for the students, just for you. The sentence says what thinking this task is supposed to produce.</w:t>
+        <w:t xml:space="preserve">For the next week, before you set any task, write one sentence for yourself. The students never see it. The sentence says what thinking this task is supposed to produce.</w:t>
       </w:r>
     </w:p>
     <w:p>
@@ -1012,7 +1037,7 @@
         <w:spacing w:before="120" w:after="120"/>
       </w:pPr>
       <w:r>
-        <w:t xml:space="preserve">That's all it is. You don't need a better tool, or a way of keeping the tool out. You need one sentence, written before the worksheet goes to the photocopier.</w:t>
+        <w:t xml:space="preserve">The photocopier can wait ten seconds. Write the sentence first, and what goes out to the class will be a task that still needs a child to finish it.</w:t>
       </w:r>
     </w:p>
     <w:p>
@@ -1059,7 +1084,7 @@
         <w:spacing w:before="120" w:after="120"/>
       </w:pPr>
       <w:r>
-        <w:t xml:space="preserve">Thirty essays came back. They were competent. Each had an introduction that restated the question, three points in the same order, a quotation for each, and a conclusion that said the ending was ambiguous. She had marked eleven before she noticed she could predict the next paragraph unread.</w:t>
+        <w:t xml:space="preserve">Thirty essays came back. They were competent. Each had an introduction that restated the question, three points in the same order, a quotation for each, and a conclusion that said the ending was ambiguous. She had marked eleven before she noticed she could predict the next paragraph unread. On the twelfth she tested it, her hand flat over the lower half of the page, and she was right.</w:t>
       </w:r>
     </w:p>
     <w:p>
@@ -1083,23 +1108,23 @@
         <w:spacing w:before="120" w:after="120"/>
       </w:pPr>
       <w:r>
-        <w:t xml:space="preserve">She sat with that for a while. The tool hadn't needed a student. It hadn't needed the set text open, or the class, or anyone who had read the book. The task could be finished by something that had never been in her room, which meant it had never really required her students to be in the room either.</w:t>
-      </w:r>
-    </w:p>
-    <w:p>
-      <w:pPr>
-        <w:spacing w:before="120" w:after="120"/>
-      </w:pPr>
-      <w:r>
-        <w:t xml:space="preserve">The second attempt took her most of an hour. She rewrote the task so that it needed three things the window didn't have. It needed the student's own annotated pages, with two annotations quoted and explained. It needed Tuesday's argument, when half the class had insisted the ending was a betrayal and the other half had called it the only honest choice, and it asked each student which side they had been on and whether they had moved. And it needed a position the student would defend aloud, for two minutes, to a partner, before writing a word.</w:t>
-      </w:r>
-    </w:p>
-    <w:p>
-      <w:pPr>
-        <w:spacing w:before="120" w:after="120"/>
-      </w:pPr>
-      <w:r>
-        <w:t xml:space="preserve">The essays that came back were shorter. Some were uneven. One student changed her mind halfway through and said so. Another built his whole essay on a pencil note in his own margin that read </w:t>
+        <w:t xml:space="preserve">She sat with that for a while. The tool hadn't needed a student. It hadn't needed the set text open, or the class, or anyone who had read the book. The task could be finished by something that had never been in her room, so it had never needed her students to be in the room either.</w:t>
+      </w:r>
+    </w:p>
+    <w:p>
+      <w:pPr>
+        <w:spacing w:before="120" w:after="120"/>
+      </w:pPr>
+      <w:r>
+        <w:t xml:space="preserve">The second attempt took her most of an hour. She rewrote the task so that it needed three things the window didn't have. It needed the student's own annotated pages, with two annotations quoted and explained. It needed Tuesday's argument, when half the class had insisted the ending was a betrayal and the other half had called it the only honest choice, and it asked each student which side they had been on and whether they had moved. It needed a position the student would defend aloud, for two minutes, to a partner, before writing a word.</w:t>
+      </w:r>
+    </w:p>
+    <w:p>
+      <w:pPr>
+        <w:spacing w:before="120" w:after="120"/>
+      </w:pPr>
+      <w:r>
+        <w:t xml:space="preserve">The essays that came back were shorter. Some were uneven. One student changed her mind halfway through and said so. They were clearly written by thirty different people, and she marked all thirty without once knowing what the next paragraph would say. The last one she read was built entirely on a pencil note in the boy's own margin, four words, underlined twice: </w:t>
       </w:r>
       <w:r>
         <w:rPr>
@@ -1108,7 +1133,7 @@
         <w:t xml:space="preserve">this is not fair</w:t>
       </w:r>
       <w:r>
-        <w:t xml:space="preserve">. They were clearly written by thirty different people, and she marked all thirty without once knowing what the next paragraph would say.</w:t>
+        <w:t xml:space="preserve">.</w:t>
       </w:r>
     </w:p>
     <w:p>
@@ -1140,23 +1165,32 @@
         <w:spacing w:before="120" w:after="120"/>
       </w:pPr>
       <w:r>
-        <w:t xml:space="preserve">You're not checking whether students will cheat. You're checking what the task actually asks for. If the window can produce the thing you were hoping to receive, the task was measuring access. Access to the text, to the standard three points, to the shape of a competent essay. All of that is now free. What the tool doesn't have is the student.</w:t>
-      </w:r>
-    </w:p>
-    <w:p>
-      <w:pPr>
-        <w:spacing w:before="120" w:after="120"/>
-      </w:pPr>
-      <w:r>
-        <w:t xml:space="preserve">The second book took a prompt apart into four questions: what am I actually trying to do, what does it need to know that I take for granted, what would make the answer unusable, and what shape should the answer take. That anatomy was written for the person typing. Turn it round and it works just as well on the task itself. An assignment is a prompt you hand to thirty people, and it fills every gap you leave with the most average reading of your words, exactly as the window does. The window shows you the average in nine seconds. A class shows it to you on Monday, after the marking.</w:t>
-      </w:r>
-    </w:p>
-    <w:p>
-      <w:pPr>
-        <w:spacing w:before="120" w:after="120"/>
-      </w:pPr>
-      <w:r>
-        <w:t xml:space="preserve">The nine seconds are a gift. I've been slower to accept that than I'd like to admit. It stings to watch a machine finish in one breath what you've spent six years setting. But the sting tells you where the thinking wasn't.</w:t>
+        <w:t xml:space="preserve">The point is to find out what the task asks for. Cheating has little to do with it. If the window can produce the thing you were hoping to receive, the task was measuring access. Access to the text, to the standard three points, to the shape of a competent essay. All of that is now free, and reproducing it proves very little. Alfred North Whitehead wrote in </w:t>
+      </w:r>
+      <w:r>
+        <w:rPr>
+          <w:i/>
+        </w:rPr>
+        <w:t xml:space="preserve">The Aims of Education</w:t>
+      </w:r>
+      <w:r>
+        <w:t xml:space="preserve"> that "Education is the acquisition of the art of the utilisation of knowledge." The window has the knowledge. The art of using it, on this book, in this room, with Tuesday's argument still in your ears, belongs to a student, and a task earns its place by asking for it. What the tool doesn't have is the student.</w:t>
+      </w:r>
+    </w:p>
+    <w:p>
+      <w:pPr>
+        <w:spacing w:before="120" w:after="120"/>
+      </w:pPr>
+      <w:r>
+        <w:t xml:space="preserve">The second book took a prompt apart into four questions: what am I actually trying to do, what does it need to know that I take for granted, what would make the answer unusable, and what shape should the answer take. That anatomy was written for the person typing. Turn it round and it works just as well on the task itself. An assignment is a prompt you hand to thirty people, and it fills every gap you leave with the most average reading of your words, as the window does. The window shows you the average in nine seconds. A class shows it to you on Monday, after the marking.</w:t>
+      </w:r>
+    </w:p>
+    <w:p>
+      <w:pPr>
+        <w:spacing w:before="120" w:after="120"/>
+      </w:pPr>
+      <w:r>
+        <w:t xml:space="preserve">The nine seconds are a gift. I've been slower to accept that than I'd like to admit. The second book's lesson plan took eleven seconds and was written for a class that didn't exist. This essay took nine and was written by a student who didn't exist. It stings to watch a machine finish in one breath what you've spent six years setting. The sting shows you where the thinking wasn't.</w:t>
       </w:r>
     </w:p>
     <w:p>
@@ -1189,7 +1223,7 @@
         <w:t xml:space="preserve">What am I actually trying to get them to do?</w:t>
       </w:r>
       <w:r>
-        <w:t xml:space="preserve"> Not what the task says. What it's for. The English teacher's task said </w:t>
+        <w:t xml:space="preserve"> The task says one thing and is for another. The English teacher's task said </w:t>
       </w:r>
       <w:r>
         <w:rPr>
@@ -1198,7 +1232,16 @@
         <w:t xml:space="preserve">discuss</w:t>
       </w:r>
       <w:r>
-        <w:t xml:space="preserve">. What she wanted was for thirty people to hold an opinion about an ending and to notice why they held it. Said in plain words, the old task looked like what it was: proof that the student had read something, when she wanted evidence that the student had been changed by it.</w:t>
+        <w:t xml:space="preserve">. What she wanted was for thirty people to hold an opinion about an ending and to notice why they held it. Said in plain words, the old task looked like what it was: proof that the student had read something, when she wanted evidence that the student had been changed by it. John Dewey wrote in </w:t>
+      </w:r>
+      <w:r>
+        <w:rPr>
+          <w:i/>
+        </w:rPr>
+        <w:t xml:space="preserve">My Pedagogic Creed</w:t>
+      </w:r>
+      <w:r>
+        <w:t xml:space="preserve"> that "education, therefore, is a process of living and not a preparation for future living." Her first task was a rehearsal for an exam in another room. Her second asked what had happened to thirty people while they read.</w:t>
       </w:r>
     </w:p>
     <w:p>
@@ -1215,7 +1258,7 @@
         <w:t xml:space="preserve">What do they need that the tool doesn't have?</w:t>
       </w:r>
       <w:r>
-        <w:t xml:space="preserve"> This question does most of the work. Their notes. Their class. The reading they did on a particular Tuesday, next to a friend who disagreed. Their own reasons. A window can write about a novel. It cannot write about what happened in your room at ten past eleven, or what this student thought before the lesson and after.</w:t>
+        <w:t xml:space="preserve"> This question does most of the work. They have their notes and their class. They have the reading they did on a particular Tuesday, next to a friend who disagreed, and their own reasons for what they made of it. A window can write about a novel. It cannot write about what happened in your room at ten past eleven, or what this student thought before the lesson and after.</w:t>
       </w:r>
     </w:p>
     <w:p>
@@ -1272,7 +1315,16 @@
         <w:t xml:space="preserve">Find the line in this passage you least agree with, copy it out, and tell me why.</w:t>
       </w:r>
       <w:r>
-        <w:t xml:space="preserve"> The tool can find a line. It cannot know which line this child least agrees with.</w:t>
+        <w:t xml:space="preserve"> One boy's hand went up before she had finished reading it aloud. </w:t>
+      </w:r>
+      <w:r>
+        <w:rPr>
+          <w:i/>
+        </w:rPr>
+        <w:t xml:space="preserve">Can I pick two? I don't agree with lots of it.</w:t>
+      </w:r>
+      <w:r>
+        <w:t xml:space="preserve"> She let him. The tool can find a line. It cannot know which line this child least agrees with, or that he wanted two.</w:t>
       </w:r>
     </w:p>
     <w:p>
@@ -1314,7 +1366,7 @@
         <w:t xml:space="preserve">What does this task make easiest?</w:t>
       </w:r>
       <w:r>
-        <w:t xml:space="preserve"> If the easiest thing is to paste and copy, many students will, and not because they're dishonest. Because the tray was laid out that way.</w:t>
+        <w:t xml:space="preserve"> If the easiest thing is to paste and copy, many students will, and dishonesty has little to do with it. The tray was laid out that way.</w:t>
       </w:r>
     </w:p>
     <w:p>
@@ -1360,7 +1412,7 @@
         <w:t xml:space="preserve">A Primary 4 teacher and the wrong answers.</w:t>
       </w:r>
       <w:r>
-        <w:t xml:space="preserve"> She'd set a page of subtraction with regrouping and found that the tool answered it perfectly, which of course it did. So she asked for something else. </w:t>
+        <w:t xml:space="preserve"> She'd set a page of subtraction with regrouping and found that the tool answered it perfectly, which it did. So she asked for something else. </w:t>
       </w:r>
       <w:r>
         <w:rPr>
@@ -1369,7 +1421,7 @@
         <w:t xml:space="preserve">Give me the three wrong answers a classmate might get for this sum, and say why each one is tempting.</w:t>
       </w:r>
       <w:r>
-        <w:t xml:space="preserve"> Nine-year-olds turned out to be very good at this, because they'd made those mistakes last week. One girl wrote that a classmate might forget to regroup </w:t>
+        <w:t xml:space="preserve"> Nine-year-olds turned out to be very good at this, because they'd made those mistakes last week. One girl said a classmate might forget to regroup </w:t>
       </w:r>
       <w:r>
         <w:rPr>
@@ -1436,7 +1488,7 @@
         <w:t xml:space="preserve">What is one small way to test this?</w:t>
       </w:r>
       <w:r>
-        <w:t xml:space="preserve"> It fits here neatly, because a task is already a small, contained thing. One class. One week. One changed task. Leave everything else as it was.</w:t>
+        <w:t xml:space="preserve"> It fits here, because a task is already a small, contained thing. One class. One week. One changed task. Leave everything else as it was.</w:t>
       </w:r>
     </w:p>
     <w:p>
@@ -1452,15 +1504,21 @@
         <w:spacing w:before="120" w:after="120"/>
       </w:pPr>
       <w:r>
-        <w:t xml:space="preserve">Watch for length first. Rewritten tasks usually come back shorter, and this is not a failure. A short piece of thinking is worth more than a long piece of retrieval. Watch for variety. If thirty pieces of work look like thirty people, something has changed. Watch for the students who did worse, and be honest about why. Some can no longer lean on the tool, which tells you what they had been doing before. Some found the new task unclear, which tells you about your rewrite. And watch for the student who surprises you. There is always one, and it is rarely the one you'd have guessed.</w:t>
-      </w:r>
-    </w:p>
-    <w:p>
-      <w:pPr>
-        <w:spacing w:before="120" w:after="120"/>
-      </w:pPr>
-      <w:r>
-        <w:t xml:space="preserve">Keep the marking light that week. You're not grading the experiment. You're reading it.</w:t>
+        <w:t xml:space="preserve">Watch for length first. Rewritten tasks usually come back shorter, and this is not a failure. A short piece of thinking is worth more than a long piece of retrieval. Watch for variety. If thirty pieces of work look like thirty people, something has changed. Watch for the students who did worse, and be honest about why. Some can no longer lean on the tool, which tells you what they had been doing before. Some found the new task unclear, which tells you about your rewrite. Watch, last, for the student who surprises you. There is always one, and it is rarely the one you'd have guessed.</w:t>
+      </w:r>
+    </w:p>
+    <w:p>
+      <w:pPr>
+        <w:spacing w:before="120" w:after="120"/>
+      </w:pPr>
+      <w:r>
+        <w:t xml:space="preserve">Keep the marking light that week. Put the red pen down, as the teacher in the first book did, and ask the work what she asked her student: </w:t>
+      </w:r>
+      <w:r>
+        <w:rPr>
+          <w:i/>
+        </w:rPr>
+        <w:t xml:space="preserve">Say more. What made you think that?</w:t>
       </w:r>
     </w:p>
     <w:p>
@@ -1493,7 +1551,7 @@
         <w:spacing w:before="120" w:after="120"/>
       </w:pPr>
       <w:r>
-        <w:t xml:space="preserve">Put the English teacher, the science teacher and the two primary teachers in a row and the pattern is the one you'd expect by now. Each set a task that reached for a finished product, and each received exactly that, from thirty people or from one machine. It made no difference which. Then each asked what the thinking had been for, and rewrote the task so that only thinking could finish it. The essays got shorter, the write-ups stopped agreeing with themselves. The window was no more capable in the second week than in the first. The task had simply stopped being one it could do alone.</w:t>
+        <w:t xml:space="preserve">Put the four teachers in a row and the pattern is the one you'd expect by now. Each set a task that reached for a finished product, and each received one, from thirty people or from one machine. It made no difference which. Then each asked what the thinking had been for, and rewrote the task so that only thinking could finish it. The essays got shorter, the write-ups stopped agreeing with themselves. Nothing about the window changed between the two weeks. The task stopped leaving room for it.</w:t>
       </w:r>
     </w:p>
     <w:p>
@@ -1517,7 +1575,7 @@
         <w:spacing w:before="120" w:after="120"/>
       </w:pPr>
       <w:r>
-        <w:t xml:space="preserve">Think of the last task you set that came back competent and flat. Not the one where students struggled. The one where they all succeeded the same way.</w:t>
+        <w:t xml:space="preserve">Think of the last task you set that came back competent and flat, the one where every student succeeded in the same way.</w:t>
       </w:r>
     </w:p>
     <w:p>
@@ -1541,7 +1599,7 @@
         <w:spacing w:before="120" w:after="120"/>
       </w:pPr>
       <w:r>
-        <w:t xml:space="preserve">Ask yourself: what had I hoped a student would bring to this that a window couldn't? Their reading, their reasons, their mistake? Where in the task did I actually ask for it?</w:t>
+        <w:t xml:space="preserve">Ask yourself: what had I hoped a student would bring to this that a window couldn't? Was it their reading, or a reason of their own, or a mistake only they could have made? Where in the task did I ask for it?</w:t>
       </w:r>
     </w:p>
     <w:p>
@@ -1565,7 +1623,7 @@
         <w:spacing w:before="120" w:after="120"/>
       </w:pPr>
       <w:r>
-        <w:t xml:space="preserve">For the next week, before you set any task, paste it into a tool and read what comes back. The whole task, exactly as you'd give it to the class.</w:t>
+        <w:t xml:space="preserve">For the next week, before you set any task, paste it into a tool and read what comes back. The whole task, as you'd give it to the class.</w:t>
       </w:r>
     </w:p>
     <w:p>
@@ -1589,15 +1647,15 @@
         <w:spacing w:before="120" w:after="120"/>
       </w:pPr>
       <w:r>
-        <w:t xml:space="preserve">If it isn't, set it as it stands, and notice what the window couldn't reach. That's where the thinking lives.</w:t>
-      </w:r>
-    </w:p>
-    <w:p>
-      <w:pPr>
-        <w:spacing w:before="120" w:after="120"/>
-      </w:pPr>
-      <w:r>
-        <w:t xml:space="preserve">You don't need a better tool for this, or a stricter rule. You need one small habit, done before the task leaves your hands, that shows you what only your students can do.</w:t>
+        <w:t xml:space="preserve">If it isn't, set it as it stands, and notice what the window couldn't reach. That is the part the room is for.</w:t>
+      </w:r>
+    </w:p>
+    <w:p>
+      <w:pPr>
+        <w:spacing w:before="120" w:after="120"/>
+      </w:pPr>
+      <w:r>
+        <w:t xml:space="preserve">Nine seconds at the kitchen table will tell you on Sunday night what thirty essays would have told you on Monday, and you will still have time to move the fruit.</w:t>
       </w:r>
     </w:p>
     <w:p>
@@ -1636,15 +1694,15 @@
         <w:spacing w:before="120" w:after="120"/>
       </w:pPr>
       <w:r>
-        <w:t xml:space="preserve">A Primary 5 teacher I know asked a colleague to sit at the back of her English lesson one Tuesday morning and do nothing but count. Not hands up, not children on task. Just the questions, and who asked them.</w:t>
-      </w:r>
-    </w:p>
-    <w:p>
-      <w:pPr>
-        <w:spacing w:before="120" w:after="120"/>
-      </w:pPr>
-      <w:r>
-        <w:t xml:space="preserve">The tally came back at recess. Forty-one questions from her. Two from the children. Both of the children's questions were about going to the toilet.</w:t>
+        <w:t xml:space="preserve">A Primary 5 teacher I know asked a colleague to sit at the back of her English lesson one Tuesday morning and do nothing but count. She wanted the questions only, and who asked them. The colleague kept the tally in pencil on the back of a spelling worksheet, five-bar gates, one column for the teacher and one for the class.</w:t>
+      </w:r>
+    </w:p>
+    <w:p>
+      <w:pPr>
+        <w:spacing w:before="120" w:after="120"/>
+      </w:pPr>
+      <w:r>
+        <w:t xml:space="preserve">The worksheet came back at recess. Forty-one strokes in her column. Two in the children's. Both of the children's questions were about going to the toilet.</w:t>
       </w:r>
     </w:p>
     <w:p>
@@ -1669,7 +1727,7 @@
         <w:t xml:space="preserve">How do I get Primary 5 students to ask more questions?</w:t>
       </w:r>
       <w:r>
-        <w:t xml:space="preserve"> The answer was instant and sensible. Create a safe environment. Praise curiosity. Model questioning. True of every classroom and useful in none of them. She closed it.</w:t>
+        <w:t xml:space="preserve"> The answer was instant and sensible. Create a safe environment. Praise curiosity. Model questioning. It was the eleven-second lesson plan from the second book all over again, correct, complete, and written for a class that did not exist. She closed it.</w:t>
       </w:r>
     </w:p>
     <w:p>
@@ -1711,15 +1769,15 @@
         <w:spacing w:before="120" w:after="120"/>
       </w:pPr>
       <w:r>
-        <w:t xml:space="preserve">The lesson followed those four. Nobody asked to go to the toilet.</w:t>
-      </w:r>
-    </w:p>
-    <w:p>
-      <w:pPr>
-        <w:spacing w:before="120" w:after="120"/>
-      </w:pPr>
-      <w:r>
-        <w:t xml:space="preserve">🔍 Takeaway: Children ask questions when there is room for one. The room is something a teacher makes, not something a child brings.</w:t>
+        <w:t xml:space="preserve">The lesson followed those four. The chicken alone took twenty minutes. Nobody asked to go to the toilet.</w:t>
+      </w:r>
+    </w:p>
+    <w:p>
+      <w:pPr>
+        <w:spacing w:before="120" w:after="120"/>
+      </w:pPr>
+      <w:r>
+        <w:t xml:space="preserve">🔍 Takeaway: Children ask questions when there is room for one, and the room is something a teacher makes.</w:t>
       </w:r>
     </w:p>
     <w:p>
@@ -1743,7 +1801,7 @@
         <w:spacing w:before="120" w:after="120"/>
       </w:pPr>
       <w:r>
-        <w:t xml:space="preserve">Nobody, in most schools, is taught to ask. It is assumed to arrive on its own. And in a room where every child carries a window that will answer anything, the skill nobody taught has become the one that matters.</w:t>
+        <w:t xml:space="preserve">Nobody, in most schools, is taught to ask. It is assumed to arrive on its own. There is a line usually attributed to Neil Postman, the educator and media critic, that I have never managed to shake off: "Children enter school as question marks and leave as periods." In a room where every child carries a window that will answer anything, the skill nobody taught has become the one that matters.</w:t>
       </w:r>
     </w:p>
     <w:p>
@@ -1760,15 +1818,15 @@
         <w:t xml:space="preserve">Say more. What made you think that?</w:t>
       </w:r>
       <w:r>
-        <w:t xml:space="preserve"> And then she waited. The waiting was the point of the story. The question was ordinary. The silence afterwards was not.</w:t>
-      </w:r>
-    </w:p>
-    <w:p>
-      <w:pPr>
-        <w:spacing w:before="120" w:after="120"/>
-      </w:pPr>
-      <w:r>
-        <w:t xml:space="preserve">Wait time has been measured, and the numbers are unkind. Three seconds of silence after a question feels like an age from the front of the room. Most of us manage less than one. I have timed myself and would rather not tell you the figure. Children learn very quickly that if they hold out, the teacher will answer her own question. They are not lazy. They have learnt the pattern.</w:t>
+        <w:t xml:space="preserve"> Then she waited. The question was ordinary. The waiting was the story.</w:t>
+      </w:r>
+    </w:p>
+    <w:p>
+      <w:pPr>
+        <w:spacing w:before="120" w:after="120"/>
+      </w:pPr>
+      <w:r>
+        <w:t xml:space="preserve">Wait time has been measured, and the numbers are unkind. Mary Budd Rowe's studies of classroom talk found that when teachers waited three seconds or more after a question, more students answered and their answers were longer. Three seconds of silence feels like an age from the front of the room. Most of us manage less than one. I have timed myself and would rather not tell you the figure. Children learn very quickly that if they hold out, the teacher will answer her own question. Every question a teacher answers for herself is one more a child has learnt not to ask.</w:t>
       </w:r>
     </w:p>
     <w:p>
@@ -1902,7 +1960,25 @@
         <w:t xml:space="preserve">What would happen if a plant lived in a room with no windows but the light was always on?</w:t>
       </w:r>
       <w:r>
-        <w:t xml:space="preserve"> She did not know. She said so. A spider plant went into the resource cupboard with a desk lamp for a fortnight. The small experiment from the first book, in a child's handwriting. The plant, for the record, did fine.</w:t>
+        <w:t xml:space="preserve"> She did not know. She said so, and he said </w:t>
+      </w:r>
+      <w:r>
+        <w:rPr>
+          <w:i/>
+        </w:rPr>
+        <w:t xml:space="preserve">Can we find out?</w:t>
+      </w:r>
+      <w:r>
+        <w:t xml:space="preserve"> Eleanor Duckworth named her 1972 essay </w:t>
+      </w:r>
+      <w:r>
+        <w:rPr>
+          <w:i/>
+        </w:rPr>
+        <w:t xml:space="preserve">The Having of Wonderful Ideas</w:t>
+      </w:r>
+      <w:r>
+        <w:t xml:space="preserve"> and made its case in a sentence: "The having of wonderful ideas is what I consider the essence of intellectual development." The boy had just had one. A spider plant went into the resource cupboard with a desk lamp for a fortnight, the small experiment from the first book in a child's handwriting. The plant, for the record, did fine.</w:t>
       </w:r>
     </w:p>
     <w:p>
@@ -1933,7 +2009,7 @@
         <w:spacing w:before="120" w:after="120"/>
       </w:pPr>
       <w:r>
-        <w:t xml:space="preserve">Here is the prompt that class learnt to type for itself, once the wall had done its work.</w:t>
+        <w:t xml:space="preserve">Once the wall had done its work, that class learnt to type a prompt of its own.</w:t>
       </w:r>
     </w:p>
     <w:p>
@@ -1950,7 +2026,7 @@
         <w:spacing w:before="120" w:after="120"/>
       </w:pPr>
       <w:r>
-        <w:t xml:space="preserve">🔍 Takeaway: Children do not need to be taught curiosity. They need to be shown the shape of a question that keeps going, and given a wall to put it on.</w:t>
+        <w:t xml:space="preserve">🔍 Takeaway: Curiosity arrives on its own. What children need showing is the shape of a question that keeps going, and a wall to put it on.</w:t>
       </w:r>
     </w:p>
     <w:p>
@@ -2013,15 +2089,33 @@
         <w:spacing w:before="120" w:after="120"/>
       </w:pPr>
       <w:r>
-        <w:t xml:space="preserve">What she modelled was not the prompt. It was being interviewed and getting something wrong without flinching. Fifteen-year-olds notice that.</w:t>
-      </w:r>
-    </w:p>
-    <w:p>
-      <w:pPr>
-        <w:spacing w:before="120" w:after="120"/>
-      </w:pPr>
-      <w:r>
-        <w:t xml:space="preserve">Over the following month the class changed. The first week, most of them gave up after two questions, because being asked things is tiring. By the third week, a group of girls were comparing where the tool said their reasoning was weakest and arguing about whether it was right. By the fourth, a boy who had never spoken in a discussion put his hand up to say the tool had asked him a question he thought was stupid, and he wanted to know if it was. It was not. The essays got shorter and more defensible, which I would take over longer any day.</w:t>
+        <w:t xml:space="preserve">The prompt was the least of what she modelled. She was interviewed in front of thirty-one people, got something wrong, and never produced the small flinch the second book described. Fifteen-year-olds notice that.</w:t>
+      </w:r>
+    </w:p>
+    <w:p>
+      <w:pPr>
+        <w:spacing w:before="120" w:after="120"/>
+      </w:pPr>
+      <w:r>
+        <w:t xml:space="preserve">Over the following month the class changed. The first week, most of them gave up after two questions, because being asked things is tiring. By the third week, a group of girls were comparing where the tool said their reasoning was weakest and arguing about whether it was right. By the fourth, a boy who had never spoken in a discussion put his hand up. </w:t>
+      </w:r>
+      <w:r>
+        <w:rPr>
+          <w:i/>
+        </w:rPr>
+        <w:t xml:space="preserve">It asked me why I thought that,</w:t>
+      </w:r>
+      <w:r>
+        <w:t xml:space="preserve"> he said, </w:t>
+      </w:r>
+      <w:r>
+        <w:rPr>
+          <w:i/>
+        </w:rPr>
+        <w:t xml:space="preserve">and I don't know why I thought that. Is that a stupid question?</w:t>
+      </w:r>
+      <w:r>
+        <w:t xml:space="preserve"> It was not. The essays got shorter and more defensible, which I would take over longer any day.</w:t>
       </w:r>
     </w:p>
     <w:p>
@@ -2071,23 +2165,23 @@
         <w:spacing w:before="120" w:after="120"/>
       </w:pPr>
       <w:r>
-        <w:t xml:space="preserve">I want to be honest here. The tool asks patiently. It asks one question at a time, which almost none of us manage under pressure. It never runs out of time before the bell. It has no other twenty-nine children, no parent-teacher meeting at four. A child asked six questions in a row by a window is getting a conversation that follows only them, and I would be lying if I said I always ask better.</w:t>
-      </w:r>
-    </w:p>
-    <w:p>
-      <w:pPr>
-        <w:spacing w:before="120" w:after="120"/>
-      </w:pPr>
-      <w:r>
-        <w:t xml:space="preserve">But look at what it cannot do, and notice that none of it is about cleverness.</w:t>
-      </w:r>
-    </w:p>
-    <w:p>
-      <w:pPr>
-        <w:spacing w:before="120" w:after="120"/>
-      </w:pPr>
-      <w:r>
-        <w:t xml:space="preserve">It cannot notice the child who has gone quiet. Not quiet in the window, where silence is just a pause, but quiet in the room, at the second desk from the door, in the way that means something is wrong at home.</w:t>
+        <w:t xml:space="preserve">The tool asks patiently. It asks one question at a time, which almost none of us manage under pressure. It never runs out of time before the bell. It has no other twenty-nine children, no parent-teacher meeting at four. A child asked six questions in a row by a window is getting a conversation that follows only them, and I would be lying if I said I always ask better.</w:t>
+      </w:r>
+    </w:p>
+    <w:p>
+      <w:pPr>
+        <w:spacing w:before="120" w:after="120"/>
+      </w:pPr>
+      <w:r>
+        <w:t xml:space="preserve">Look at what it cannot do, though, and notice that none of it is about cleverness.</w:t>
+      </w:r>
+    </w:p>
+    <w:p>
+      <w:pPr>
+        <w:spacing w:before="120" w:after="120"/>
+      </w:pPr>
+      <w:r>
+        <w:t xml:space="preserve">It cannot notice the child who has gone quiet at the second desk from the door, in the way that means something is wrong at home. In the window, silence is only a pause.</w:t>
       </w:r>
     </w:p>
     <w:p>
@@ -2111,7 +2205,7 @@
         <w:spacing w:before="120" w:after="120"/>
       </w:pPr>
       <w:r>
-        <w:t xml:space="preserve">The tool waits because it cannot do anything else. A teacher waits because she has decided, knowing the room, that this silence is worth holding. Those look the same from the outside. They are not. Waiting is a choice a person makes, each time, for a particular child.</w:t>
+        <w:t xml:space="preserve">The tool waits because it cannot do anything else. A teacher waits because she has decided, knowing the room, that this silence is worth holding. From the outside the two silences look the same. Waiting is a choice a person makes, each time, for a particular child.</w:t>
       </w:r>
     </w:p>
     <w:p>
@@ -2135,7 +2229,7 @@
         <w:spacing w:before="120" w:after="120"/>
       </w:pPr>
       <w:r>
-        <w:t xml:space="preserve">The Primary 5 teacher counting her forty-one questions, the science teacher throwing out four of twenty-eight, the form teacher saying </w:t>
+        <w:t xml:space="preserve">Put the Primary 5 teacher with her tally sheet beside the science teacher throwing out four of twenty-eight and the form teacher saying </w:t>
       </w:r>
       <w:r>
         <w:rPr>
@@ -2144,15 +2238,15 @@
         <w:t xml:space="preserve">I don't know</w:t>
       </w:r>
       <w:r>
-        <w:t xml:space="preserve"> on the projector. In each case the first attempt reached for the thing that felt like teaching, which was asking, explaining, filling the room. In each case the second attempt did something that felt much less like teaching. It put a picture up and said nothing. It handed the questions to the children. It let a machine ask the teacher instead.</w:t>
-      </w:r>
-    </w:p>
-    <w:p>
-      <w:pPr>
-        <w:spacing w:before="120" w:after="120"/>
-      </w:pPr>
-      <w:r>
-        <w:t xml:space="preserve">The window did not learn anything between the first attempt and the second. What changed was who was holding the question, and how long the adult in the room was willing to leave it there.</w:t>
+        <w:t xml:space="preserve"> on the projector, and the same shape appears. In each case the first attempt reached for the thing that felt like teaching, which was to fill the room with the adult's voice. In each case the second attempt felt much less like teaching. It put a picture up and said nothing. It handed the questions to the children. It let a machine ask the teacher instead.</w:t>
+      </w:r>
+    </w:p>
+    <w:p>
+      <w:pPr>
+        <w:spacing w:before="120" w:after="120"/>
+      </w:pPr>
+      <w:r>
+        <w:t xml:space="preserve">Nothing in the window improved between the two attempts. The question changed hands, and the adult in the room learnt to leave it there for longer.</w:t>
       </w:r>
     </w:p>
     <w:p>
@@ -2176,7 +2270,7 @@
         <w:spacing w:before="120" w:after="120"/>
       </w:pPr>
       <w:r>
-        <w:t xml:space="preserve">Not about the toilet, or the test. A real one, that arrived sideways and made you stop.</w:t>
+        <w:t xml:space="preserve">Leave aside the toilet and the test. I mean a real one, that arrived sideways and made you stop.</w:t>
       </w:r>
     </w:p>
     <w:p>
@@ -2240,7 +2334,7 @@
         <w:spacing w:before="120" w:after="120"/>
       </w:pPr>
       <w:r>
-        <w:t xml:space="preserve">You don't need a better tool for this, or a quieter class. You need a smaller habit, a slip of paper, and the nerve to leave a question unanswered overnight.</w:t>
+        <w:t xml:space="preserve">The slip of paper is the habit, and it costs nothing. The nerve is in leaving one question on your desk overnight, where it will still be waiting in the morning, and so will the child who wants to know.</w:t>
       </w:r>
     </w:p>
     <w:p>
@@ -2279,7 +2373,7 @@
         <w:spacing w:before="120" w:after="120"/>
       </w:pPr>
       <w:r>
-        <w:t xml:space="preserve">A Secondary 2 science teacher I know asked his class, one Tuesday after recess, why ice floats. A girl in the second row had her phone under the desk before he'd finished the question. She read aloud from it, fluently, the way you read something you trust.</w:t>
+        <w:t xml:space="preserve">A Secondary 2 science teacher I know asked his class, one Tuesday after recess, why ice floats. A girl in the second row had her phone under the desk before he'd finished the question. She read aloud from it without looking up, her thumb resting on the screen to keep it from going dark, the way you read something you trust.</w:t>
       </w:r>
     </w:p>
     <w:p>
@@ -2295,7 +2389,7 @@
         <w:spacing w:before="120" w:after="120"/>
       </w:pPr>
       <w:r>
-        <w:t xml:space="preserve">The fourth was the one about the bonds. Hydrogen bonds don't break when water freezes. They lock into place, holding the molecules apart in an open lattice, and it's that spacing, not any breaking, that makes ice less dense than water. The explanation had the right shape and the wrong mechanism, and it was delivered with complete confidence by someone who had never heard of a lattice.</w:t>
+        <w:t xml:space="preserve">The fourth was the one about the bonds. Hydrogen bonds don't break when water freezes. They lock into place, holding the molecules apart in an open lattice, and the spacing is what makes ice less dense than water. The explanation had the right shape and the wrong mechanism, and it was delivered with complete confidence by someone who had never heard of a lattice.</w:t>
       </w:r>
     </w:p>
     <w:p>
@@ -2342,7 +2436,25 @@
         <w:spacing w:before="120" w:after="120"/>
       </w:pPr>
       <w:r>
-        <w:t xml:space="preserve">The room went quiet in the useful way. Two children found the density sentence in the textbook almost at once. A boy at the back said the bit about hydrogen bonds wasn't on the page at all, and someone else said it was, in the diagram, and that the diagram showed the bonds holding, not breaking. It took eleven minutes. Nobody had told anyone the paragraph was wrong. They'd found out.</w:t>
+        <w:t xml:space="preserve">The room went quiet in the useful way. Two children found the density sentence in the textbook almost at once. A boy at the back said the bit about hydrogen bonds wasn't on the page at all, and then, a moment later, </w:t>
+      </w:r>
+      <w:r>
+        <w:rPr>
+          <w:i/>
+        </w:rPr>
+        <w:t xml:space="preserve">Wait, it's in the picture. The lines are still there. They're holding on.</w:t>
+      </w:r>
+      <w:r>
+        <w:t xml:space="preserve"> It took eleven minutes. The girl in the second row turned her phone face down, found the diagram in her own textbook, and wrote </w:t>
+      </w:r>
+      <w:r>
+        <w:rPr>
+          <w:i/>
+        </w:rPr>
+        <w:t xml:space="preserve">lattice</w:t>
+      </w:r>
+      <w:r>
+        <w:t xml:space="preserve"> in the margin beside it.</w:t>
       </w:r>
     </w:p>
     <w:p>
@@ -2366,31 +2478,40 @@
         <w:spacing w:before="120" w:after="120"/>
       </w:pPr>
       <w:r>
-        <w:t xml:space="preserve">The second book called certainty arrived at too soon the most dangerous moment there is, and found it in a hundred chat windows. Here it is again, twelve years old and holding a phone.</w:t>
-      </w:r>
-    </w:p>
-    <w:p>
-      <w:pPr>
-        <w:spacing w:before="120" w:after="120"/>
-      </w:pPr>
-      <w:r>
-        <w:t xml:space="preserve">What has changed is where the certainty comes from. A child used to arrive at a wrong answer slowly, through her own reasoning, and there were gaps along the way where doubt could get in. Now the answer arrives finished. It's in good sentences. It's in better sentences than she could write herself, and it's there before the question has fully formed in her head, so there's never a moment when she doesn't know. Doubt needs a gap to grow in, and the tool leaves no gap.</w:t>
-      </w:r>
-    </w:p>
-    <w:p>
-      <w:pPr>
-        <w:spacing w:before="120" w:after="120"/>
-      </w:pPr>
-      <w:r>
-        <w:t xml:space="preserve">I want to be careful here, because the easy lesson is the wrong one. The lesson isn't that the phone lies. Three of those four sentences were sound, and most of what the tool says on most days is sound too. The habit we want isn't distrust. A child taught to distrust everything on a screen will simply stop reading, or, more likely, will keep reading and stop admitting it.</w:t>
-      </w:r>
-    </w:p>
-    <w:p>
-      <w:pPr>
-        <w:spacing w:before="120" w:after="120"/>
-      </w:pPr>
-      <w:r>
-        <w:t xml:space="preserve">The habit is a question. </w:t>
+        <w:t xml:space="preserve">The first book called certainty arrived at too soon the most dangerous moment there is, and the second book found it waiting in a hundred chat windows. Here it is again, twelve years old and holding a phone.</w:t>
+      </w:r>
+    </w:p>
+    <w:p>
+      <w:pPr>
+        <w:spacing w:before="120" w:after="120"/>
+      </w:pPr>
+      <w:r>
+        <w:t xml:space="preserve">What has changed is where the certainty comes from. A child used to arrive at a wrong answer slowly, through her own reasoning, and there were gaps along the way where doubt could get in. Now the answer arrives finished, in about the eleven seconds the second book's lesson plan took, and it arrives in good sentences. They are better sentences than she could write herself, and they sound like every explanation she has ever read, which is most of the trouble. Daniel Kahneman wrote in </w:t>
+      </w:r>
+      <w:r>
+        <w:rPr>
+          <w:i/>
+        </w:rPr>
+        <w:t xml:space="preserve">Thinking, Fast and Slow</w:t>
+      </w:r>
+      <w:r>
+        <w:t xml:space="preserve"> that "A reliable way to make people believe in falsehoods is frequent repetition, because familiarity is not easily distinguished from truth." A paragraph assembled from the most familiar sentences on the internet arrives already believed. Doubt needs a gap to grow in, and the tool leaves no gap.</w:t>
+      </w:r>
+    </w:p>
+    <w:p>
+      <w:pPr>
+        <w:spacing w:before="120" w:after="120"/>
+      </w:pPr>
+      <w:r>
+        <w:t xml:space="preserve">The easy lesson is that the phone lies. Three of those four sentences were sound, though, and most of what the tool says on most days is sound too. Teach a child to distrust everything on a screen and she will stop reading, or, more likely, keep reading and stop admitting it.</w:t>
+      </w:r>
+    </w:p>
+    <w:p>
+      <w:pPr>
+        <w:spacing w:before="120" w:after="120"/>
+      </w:pPr>
+      <w:r>
+        <w:t xml:space="preserve">What we want to teach is a question. </w:t>
       </w:r>
       <w:r>
         <w:rPr>
@@ -2399,7 +2520,7 @@
         <w:t xml:space="preserve">How do you know?</w:t>
       </w:r>
       <w:r>
-        <w:t xml:space="preserve"> is the same quiet question the first book gave us, the one the teacher asked with the red pen put down, and it works exactly as well on a paragraph as it does on a person. It doesn't accuse. It doesn't declare the answer wrong. It only asks what the answer is resting on, and the honest reply, </w:t>
+        <w:t xml:space="preserve"> is the one the first book gave us, asked by a teacher who had put the red pen down on the desk and waited, and it works as well on a paragraph as it does on a person. It asks, without accusing, what the answer is resting on, and the honest reply, </w:t>
       </w:r>
       <w:r>
         <w:rPr>
@@ -2408,15 +2529,33 @@
         <w:t xml:space="preserve">It said so</w:t>
       </w:r>
       <w:r>
-        <w:t xml:space="preserve">, is where the teaching starts.</w:t>
-      </w:r>
-    </w:p>
-    <w:p>
-      <w:pPr>
-        <w:spacing w:before="120" w:after="120"/>
-      </w:pPr>
-      <w:r>
-        <w:t xml:space="preserve">Fluency is not truth. That's the whole of it, and it's a sentence I've had to say to myself more often than I've had to say it to a student.</w:t>
+        <w:t xml:space="preserve">, is where the teaching starts. Epictetus gives the reason in a line from the </w:t>
+      </w:r>
+      <w:r>
+        <w:rPr>
+          <w:i/>
+        </w:rPr>
+        <w:t xml:space="preserve">Discourses</w:t>
+      </w:r>
+      <w:r>
+        <w:t xml:space="preserve">: "It is impossible for a man to learn what he thinks he already knows." Until she has said </w:t>
+      </w:r>
+      <w:r>
+        <w:rPr>
+          <w:i/>
+        </w:rPr>
+        <w:t xml:space="preserve">It said so</w:t>
+      </w:r>
+      <w:r>
+        <w:t xml:space="preserve"> out loud, she thinks she knows.</w:t>
+      </w:r>
+    </w:p>
+    <w:p>
+      <w:pPr>
+        <w:spacing w:before="120" w:after="120"/>
+      </w:pPr>
+      <w:r>
+        <w:t xml:space="preserve">Fluency is not truth. I've had to say that sentence to myself more often than I've had to say it to a student.</w:t>
       </w:r>
     </w:p>
     <w:p>
@@ -2469,7 +2608,7 @@
         <w:t xml:space="preserve">What would prove this wrong?</w:t>
       </w:r>
       <w:r>
-        <w:t xml:space="preserve"> The scientist's check. If hydrogen bonds really broke when water froze, what would we expect to see? Would ice be fragile and loose? It isn't. A twelve-year-old can do this. It only needs the question turned around: not </w:t>
+        <w:t xml:space="preserve"> The scientist's check. If hydrogen bonds broke when water froze, what would we expect to see? Would ice be fragile and loose? It isn't. A twelve-year-old can do this. It only needs the question turned round, from </w:t>
       </w:r>
       <w:r>
         <w:rPr>
@@ -2478,7 +2617,7 @@
         <w:t xml:space="preserve">is this true</w:t>
       </w:r>
       <w:r>
-        <w:t xml:space="preserve"> but </w:t>
+        <w:t xml:space="preserve"> to </w:t>
       </w:r>
       <w:r>
         <w:rPr>
@@ -2501,7 +2640,7 @@
         <w:t xml:space="preserve">Who is saying this, and how would they know?</w:t>
       </w:r>
       <w:r>
-        <w:t xml:space="preserve"> The journalist's check. The tool isn't a who. It has no laboratory and no memory of having measured anything. When a child asks where a sentence came from, the honest answer is usually </w:t>
+        <w:t xml:space="preserve"> The journalist's check, and the awkward one here, because the tool has no laboratory and no memory of having measured anything. When a child asks where a sentence came from, the honest answer is usually </w:t>
       </w:r>
       <w:r>
         <w:rPr>
@@ -2564,15 +2703,15 @@
         <w:spacing w:before="120" w:after="120"/>
       </w:pPr>
       <w:r>
-        <w:t xml:space="preserve">Five questions, none of them longer than a line. I've seen them stuck inside a science file, which is where they belong.</w:t>
-      </w:r>
-    </w:p>
-    <w:p>
-      <w:pPr>
-        <w:spacing w:before="120" w:after="120"/>
-      </w:pPr>
-      <w:r>
-        <w:t xml:space="preserve">🔍 Takeaway: Checking isn't one skill. It's five small questions, and any one of them, asked out loud, changes what a paragraph is allowed to get away with.</w:t>
+        <w:t xml:space="preserve">Five questions, none of them longer than a line. I've seen them written inside the front cover of a Secondary 2 science file, and they fitted with room to spare.</w:t>
+      </w:r>
+    </w:p>
+    <w:p>
+      <w:pPr>
+        <w:spacing w:before="120" w:after="120"/>
+      </w:pPr>
+      <w:r>
+        <w:t xml:space="preserve">🔍 Takeaway: Checking is five small questions, and any one of them, asked out loud, changes what a paragraph is allowed to get away with.</w:t>
       </w:r>
     </w:p>
     <w:p>
@@ -2628,7 +2767,7 @@
         <w:t xml:space="preserve">Checked the units. Checked against worked example 2. Asked the tool for the case against and it couldn't give one, so I looked it up.</w:t>
       </w:r>
       <w:r>
-        <w:t xml:space="preserve"> The checking had become a thing she could see on a page, and once she could see it, she could teach it.</w:t>
+        <w:t xml:space="preserve"> The checking had become a thing she could see on a page, and once she could see it, she could teach it. A student who can say how she knows is harder to fool than one who knows more.</w:t>
       </w:r>
     </w:p>
     <w:p>
@@ -2741,14 +2880,6 @@
     </w:p>
     <w:p>
       <w:pPr>
-        <w:spacing w:before="120" w:after="120"/>
-      </w:pPr>
-      <w:r>
-        <w:t xml:space="preserve">That's what marking the checking does. It doesn't police anything. It gives the habit a place to live.</w:t>
-      </w:r>
-    </w:p>
-    <w:p>
-      <w:pPr>
         <w:pStyle w:val="Heading3"/>
       </w:pPr>
       <w:r>
@@ -2760,7 +2891,7 @@
         <w:spacing w:before="120" w:after="120"/>
       </w:pPr>
       <w:r>
-        <w:t xml:space="preserve">The tool will hand over a finished paragraph by default, and it will hand over its working just as readily if you ask. Students can ask. These are three lines I've seen typed at the end of a fluent answer, and each one changes what comes back.</w:t>
+        <w:t xml:space="preserve">The tool will hand over a finished paragraph by default, and it will hand over its working just as readily if you ask. Students can ask. These are three lines I've seen typed at the end of a finished answer, and each one changes what comes back.</w:t>
       </w:r>
     </w:p>
     <w:p>
@@ -2795,7 +2926,7 @@
         <w:spacing w:before="120" w:after="120"/>
       </w:pPr>
       <w:r>
-        <w:t xml:space="preserve">What the tool will do with these is genuinely useful. It will often admit it cannot quote a source. It will pick out the sentence it's least confident in, and it's frequently the right sentence. It will build an argument against itself, and that argument is sometimes better than the original. The girl with the ice paragraph typed the third prompt the next day, and the tool told her, without prompting, that hydrogen bonds form a lattice rather than breaking. It had known all along, in the way it knows things. It simply hadn't been asked.</w:t>
+        <w:t xml:space="preserve">What the tool will do with these is useful. It will often admit it cannot quote a source. It will pick out the sentence it's least confident in, and it's frequently the right sentence. It will build an argument against itself, and that argument is sometimes better than the original. The girl with the ice paragraph typed the third prompt the next day, and the tool told her, in its second sentence, that hydrogen bonds form a lattice rather than breaking. It had known all along, in the way it knows things. Nobody had asked.</w:t>
       </w:r>
     </w:p>
     <w:p>
@@ -2833,10 +2964,10 @@
         <w:rPr>
           <w:i/>
         </w:rPr>
-        <w:t xml:space="preserve">Which sentence can you check? How did you know? What are you least sure of?</w:t>
-      </w:r>
-      <w:r>
-        <w:t xml:space="preserve"> Nothing on the screen improved between the two moments. The checking did, because someone had made room for it on the page.</w:t>
+        <w:t xml:space="preserve">Which sentence can you check? What are you least sure of?</w:t>
+      </w:r>
+      <w:r>
+        <w:t xml:space="preserve"> The screen showed the same paragraph in both moments. What changed was that someone had made room on the page for a question about it.</w:t>
       </w:r>
     </w:p>
     <w:p>
@@ -2860,7 +2991,7 @@
         <w:spacing w:before="120" w:after="120"/>
       </w:pPr>
       <w:r>
-        <w:t xml:space="preserve">Not the last thing you were fooled by. The last thing that was probably true, and that you never checked, because the sentences were good and there was no gap in them where a doubt could have got in. An article. A summary the tool gave you. A paragraph in a report you signed off.</w:t>
+        <w:t xml:space="preserve">I don't mean the last thing you were fooled by. I mean the last thing that was probably true, and that you never checked, because the sentences were good and there was no gap in them where a doubt could have got in. An article. A summary the tool gave you. A paragraph in a report you signed off.</w:t>
       </w:r>
     </w:p>
     <w:p>
@@ -2892,7 +3023,7 @@
         <w:spacing w:before="120" w:after="120"/>
       </w:pPr>
       <w:r>
-        <w:t xml:space="preserve">For the next week, add one line at the bottom of every piece of work that passes through your hands. Every worksheet, every marked script, every draft you send, yours included. </w:t>
+        <w:t xml:space="preserve">For the next week, add one line at the bottom of every piece of work that passes through your hands. Every worksheet you set and every draft you send, yours included. </w:t>
       </w:r>
       <w:r>
         <w:rPr>
@@ -2906,7 +3037,7 @@
         <w:spacing w:before="120" w:after="120"/>
       </w:pPr>
       <w:r>
-        <w:t xml:space="preserve">Leave the space after it blank and let it be filled in. Some of what gets written will be honest and some will be funny, and both are fine. The line isn't a test. It's a place for a habit to appear.</w:t>
+        <w:t xml:space="preserve">Leave the space after it blank and let it be filled in. Some of what gets written will be honest and some will be funny, and both are fine. Nobody is marking the line. It is a place for a habit to appear.</w:t>
       </w:r>
     </w:p>
     <w:p>
@@ -2923,7 +3054,7 @@
         <w:t xml:space="preserve">I didn't</w:t>
       </w:r>
       <w:r>
-        <w:t xml:space="preserve">. That's worth knowing. You don't need a better tool to catch a wrong sentence. You need a smaller habit, one line long, that asks the question before anyone else has to.</w:t>
+        <w:t xml:space="preserve">. The children write that in their first week too. Keep the line there, and by the third week neither of you will be writing it.</w:t>
       </w:r>
     </w:p>
     <w:p>
@@ -2962,7 +3093,7 @@
         <w:spacing w:before="120" w:after="120"/>
       </w:pPr>
       <w:r>
-        <w:t xml:space="preserve">A Secondary 2 English teacher I know had a hundred and twenty compositions to mark by Monday. Three classes, one weekend, and a mid-year exam coming. On Sunday afternoon, with the pile on the dining table and the first thirty done properly, she did the arithmetic and opened a chat window.</w:t>
+        <w:t xml:space="preserve">A Secondary 2 English teacher I know had a hundred and twenty compositions to mark by Monday. Three classes, one weekend, and a mid-year exam coming. On Sunday afternoon, with the pile on the dining table and a glass of water standing on the top script to stop the ceiling fan lifting it, she did the arithmetic. Thirty done properly, four hours gone. She opened a chat window.</w:t>
       </w:r>
     </w:p>
     <w:p>
@@ -2987,7 +3118,7 @@
         <w:spacing w:before="120" w:after="120"/>
       </w:pPr>
       <w:r>
-        <w:t xml:space="preserve">On Tuesday she handed the scripts back. Most of the class read the mark and turned the page over. One boy, a quiet one who sits near the window and rarely says anything before recess, waited until the others had gone to the canteen. He was holding his script. He wasn't angry. He asked, </w:t>
+        <w:t xml:space="preserve">On Tuesday she handed the scripts back. Most of the class read the mark and turned the page over. One boy, a quiet one who sits near the window and rarely says anything before recess, waited until the others had gone to the canteen. He was holding his script, folded once down the middle so that the comment was on the outside. He wasn't angry. He asked, </w:t>
       </w:r>
       <w:r>
         <w:rPr>
@@ -3009,7 +3140,7 @@
         <w:spacing w:before="120" w:after="120"/>
       </w:pPr>
       <w:r>
-        <w:t xml:space="preserve">That evening she went back to the window, but not to ask for more comments. She pasted each comment back in, one at a time, with two lines above it about the child. </w:t>
+        <w:t xml:space="preserve">That evening she went back to the window with a different job for it. She pasted each comment back in, one at a time, with two lines above it about the child. </w:t>
       </w:r>
       <w:r>
         <w:rPr>
@@ -3035,7 +3166,7 @@
         <w:t xml:space="preserve">this time</w:t>
       </w:r>
       <w:r>
-        <w:t xml:space="preserve"> in the middle. It took longer than she wanted and less than she feared. She was done by ten.</w:t>
+        <w:t xml:space="preserve"> in the middle. It took longer than she wanted and less than she feared. At ten she set the glass back on the pile. His script was on top, and the first word in the margin was his name.</w:t>
       </w:r>
     </w:p>
     <w:p>
@@ -3059,7 +3190,7 @@
         <w:spacing w:before="120" w:after="120"/>
       </w:pPr>
       <w:r>
-        <w:t xml:space="preserve">I want to be fair to the tool here, because the first attempt wasn't lazy and the comments weren't bad. Look at what a tool-drafted comment gets right. It reads the whole piece, which a tired teacher at composition ninety-one does not. It quotes the child's actual words. It doesn't get shorter or sharper as the evening goes on. It never writes </w:t>
+        <w:t xml:space="preserve">The first attempt wasn't lazy. Look at what a tool-drafted comment gets right. It reads the whole piece, which a tired teacher at composition ninety-one does not. It quotes the child's actual words. It doesn't get shorter or sharper as the evening goes on. It never writes </w:t>
       </w:r>
       <w:r>
         <w:rPr>
@@ -3093,7 +3224,15 @@
         <w:spacing w:before="120" w:after="120"/>
       </w:pPr>
       <w:r>
-        <w:t xml:space="preserve">That is why a hundred and twenty comments came out sounding like one voice. Nothing was wrong with the voice. It just belonged to nobody in the room.</w:t>
+        <w:t xml:space="preserve">Ralph Waldo Emerson wrote, in his essay "Education", that "The secret of education lies in respecting the pupil." It reads like a line about kindness. I think it is a line about attention. You cannot respect a pupil you haven't yet told apart from the one in front of him.</w:t>
+      </w:r>
+    </w:p>
+    <w:p>
+      <w:pPr>
+        <w:spacing w:before="120" w:after="120"/>
+      </w:pPr>
+      <w:r>
+        <w:t xml:space="preserve">That is why a hundred and twenty comments came out sounding like one voice. Nothing was wrong with the voice. It belonged to nobody in the room. Feedback is the one part of marking that has to come from someone.</w:t>
       </w:r>
     </w:p>
     <w:p>
@@ -3134,25 +3273,7 @@
         <w:spacing w:before="120" w:after="120"/>
       </w:pPr>
       <w:r>
-        <w:t xml:space="preserve">I've used that prompt myself, and it earns its place. But I've come to think it stops one question short. Knowing where a child stops reading tells you what to cut. It doesn't tell you what to leave. So the version I've settled on asks something more practical. Not </w:t>
-      </w:r>
-      <w:r>
-        <w:rPr>
-          <w:i/>
-        </w:rPr>
-        <w:t xml:space="preserve">how does this feel</w:t>
-      </w:r>
-      <w:r>
-        <w:t xml:space="preserve"> but </w:t>
-      </w:r>
-      <w:r>
-        <w:rPr>
-          <w:i/>
-        </w:rPr>
-        <w:t xml:space="preserve">what should this student do next Tuesday?</w:t>
-      </w:r>
-      <w:r>
-        <w:t xml:space="preserve"> If the honest answer is </w:t>
+        <w:t xml:space="preserve">I've used that prompt myself, and it earns its place. I've also come to think it stops one question short. Knowing where a child stops reading tells you what to cut. It doesn't tell you what to leave. So the version I've settled on asks something more practical than how the comment feels. It asks what this student should do next Tuesday. If the honest answer is </w:t>
       </w:r>
       <w:r>
         <w:rPr>
@@ -3184,7 +3305,7 @@
         <w:t xml:space="preserve">A maths teacher marking a proof.</w:t>
       </w:r>
       <w:r>
-        <w:t xml:space="preserve"> A Secondary 3 student had submitted a geometry proof that reached the right conclusion by a route that didn't quite hold. The tool's draft comment was correct. </w:t>
+        <w:t xml:space="preserve"> A Secondary 3 student had submitted a geometry proof that reached the right conclusion by a route that didn't hold. The tool's draft comment was correct. </w:t>
       </w:r>
       <w:r>
         <w:rPr>
@@ -3193,7 +3314,7 @@
         <w:t xml:space="preserve">Your argument assumes the triangles are congruent before you have shown it. Establish congruence first.</w:t>
       </w:r>
       <w:r>
-        <w:t xml:space="preserve"> The teacher, who knew this particular boy, pasted the comment back with a line about him. </w:t>
+        <w:t xml:space="preserve"> The teacher, who knew the boy, pasted the comment back with a line about him. </w:t>
       </w:r>
       <w:r>
         <w:rPr>
@@ -3220,7 +3341,13 @@
         <w:t xml:space="preserve">Which line proves the triangles are congruent?</w:t>
       </w:r>
       <w:r>
-        <w:t xml:space="preserve"> He came to find her at recess, script in hand, because he couldn't find one. That was the point.</w:t>
+        <w:t xml:space="preserve"> He came to find her at recess, script in hand, because he couldn't find one. </w:t>
+      </w:r>
+      <w:r>
+        <w:rPr>
+          <w:i/>
+        </w:rPr>
+        <w:t xml:space="preserve">Miss, there isn't one, is there?</w:t>
       </w:r>
     </w:p>
     <w:p>
@@ -3244,7 +3371,7 @@
         <w:spacing w:before="120" w:after="120"/>
       </w:pPr>
       <w:r>
-        <w:t xml:space="preserve">In the first book, a teacher put down the red pen and said </w:t>
+        <w:t xml:space="preserve">You'll remember the teacher in the first book who put the red pen down on the desk, said </w:t>
       </w:r>
       <w:r>
         <w:rPr>
@@ -3253,7 +3380,7 @@
         <w:t xml:space="preserve">Say more. What made you think that?</w:t>
       </w:r>
       <w:r>
-        <w:t xml:space="preserve"> and then waited. The waiting was the hard part, and the tool is no help with waiting. But the first half of that move, the question instead of the verdict, transfers straight onto paper.</w:t>
+        <w:t xml:space="preserve"> and then waited. The waiting was the hard part, and the tool is no help with waiting. The first half of that move, though, the question in place of the verdict, transfers straight onto paper.</w:t>
       </w:r>
     </w:p>
     <w:p>
@@ -3270,7 +3397,7 @@
         <w:t xml:space="preserve">I read this, and I want to know what you were doing here.</w:t>
       </w:r>
       <w:r>
-        <w:t xml:space="preserve"> Even when the child never answers it in writing, they have to answer it in their head, and that is where the work happens.</w:t>
+        <w:t xml:space="preserve"> Even a child who never answers it in writing has to answer it in their head, and that is where the work happens.</w:t>
       </w:r>
     </w:p>
     <w:p>
@@ -3320,7 +3447,16 @@
         <w:t xml:space="preserve">eau</w:t>
       </w:r>
       <w:r>
-        <w:t xml:space="preserve">. He hasn't got it wrong since. She'd been correcting the output for three weeks when the useful thing was to ask about the process.</w:t>
+        <w:t xml:space="preserve"> and wrote beside it, in pencil, </w:t>
+      </w:r>
+      <w:r>
+        <w:rPr>
+          <w:i/>
+        </w:rPr>
+        <w:t xml:space="preserve">this bit is just there</w:t>
+      </w:r>
+      <w:r>
+        <w:t xml:space="preserve">. He hasn't got it wrong since.</w:t>
       </w:r>
     </w:p>
     <w:p>
@@ -3410,7 +3546,7 @@
         <w:spacing w:before="120" w:after="120"/>
       </w:pPr>
       <w:r>
-        <w:t xml:space="preserve">The choosing stayed with them. A composition has forty things wrong with it and the tool will happily list all forty. Deciding which one matters this week, for this child, is not something the tool can see. The weighing stayed with them. What this child can hear, in this order, after this week, is knowledge that lives in the teacher and nowhere else. And the owning stayed with them. The comment carries your name, and when a child asks </w:t>
+        <w:t xml:space="preserve">The choosing stayed with them. A composition has forty things wrong with it and the tool will happily list all forty. Deciding which one matters this week, for this child, is not something the tool can see. The weighing stayed with them. What this child can hear, in this order, after this week, is knowledge that lives in the teacher and nowhere else. The owning stayed with them too. The comment carries your name, and when a child asks </w:t>
       </w:r>
       <w:r>
         <w:rPr>
@@ -3427,7 +3563,16 @@
         <w:spacing w:before="120" w:after="120"/>
       </w:pPr>
       <w:r>
-        <w:t xml:space="preserve">The second book put it in a line I keep coming back to. The tool can take on more of the work than ever. It cannot take on any of the responsibility.</w:t>
+        <w:t xml:space="preserve">Haim Ginott, the child psychologist, wrote in </w:t>
+      </w:r>
+      <w:r>
+        <w:rPr>
+          <w:i/>
+        </w:rPr>
+        <w:t xml:space="preserve">Teacher and Child</w:t>
+      </w:r>
+      <w:r>
+        <w:t xml:space="preserve">: "I've come to the frightening conclusion that I am the decisive element in the classroom." That was half a century before anyone could draft a comment in a chat window, and nothing since has moved the decisive element an inch. The second book put the same thing in a line I keep coming back to. The tool can take on more of the work than ever. It cannot take on any of the responsibility.</w:t>
       </w:r>
     </w:p>
     <w:p>
@@ -3441,7 +3586,16 @@
         <w:t xml:space="preserve">A teacher who told her class.</w:t>
       </w:r>
       <w:r>
-        <w:t xml:space="preserve"> A Secondary 2 form teacher I know decided not to leave that question hanging. When she returned the next set of compositions she told the class exactly what she'd done. The tool had drafted a first comment for each script. She'd then read each one as them, changed what sounded like nobody, and every sentence in the margin was one she'd chosen to leave there. What she got was a girl at the front asking whether she could do the same with her own draft before handing it in, and a boy at the back asking, quite seriously, whether the tool had liked his. She said she didn't know, and it didn't matter, because she had. The second book noticed the small flinch that comes with </w:t>
+        <w:t xml:space="preserve"> A Secondary 2 form teacher I know decided not to leave that question hanging. When she returned the next set of compositions she told the class what she'd done. The tool had drafted a first comment for each script. She'd then read each one as them, changed what sounded like nobody, and every sentence in the margin was one she'd chosen to leave there. What she got was a girl at the front asking whether she could do the same with her own draft before handing it in, and a boy at the back asking, in all seriousness, </w:t>
+      </w:r>
+      <w:r>
+        <w:rPr>
+          <w:i/>
+        </w:rPr>
+        <w:t xml:space="preserve">Did the tool like mine?</w:t>
+      </w:r>
+      <w:r>
+        <w:t xml:space="preserve"> She said she didn't know, and it didn't matter, because she had. The second book noticed the small flinch that comes with </w:t>
       </w:r>
       <w:r>
         <w:rPr>
@@ -3491,7 +3645,7 @@
         <w:spacing w:before="120" w:after="120"/>
       </w:pPr>
       <w:r>
-        <w:t xml:space="preserve">The comments got shorter each time, and less complete, and more likely to be read. Nothing about the tool had improved between the two attempts. What had changed was who the teacher was writing to.</w:t>
+        <w:t xml:space="preserve">The comments got shorter each time, and less complete, and more likely to be read. The window was the same window on both evenings. The difference was that the second time, somebody was on the other side of the page.</w:t>
       </w:r>
     </w:p>
     <w:p>
@@ -3507,15 +3661,15 @@
         <w:spacing w:before="120" w:after="120"/>
       </w:pPr>
       <w:r>
-        <w:t xml:space="preserve">Think of the last comment you wrote that the student clearly never read. Not the most important one, just the most recent. You'll know it by the way the script came back, the next piece making exactly the same error, the margin untouched.</w:t>
-      </w:r>
-    </w:p>
-    <w:p>
-      <w:pPr>
-        <w:spacing w:before="120" w:after="120"/>
-      </w:pPr>
-      <w:r>
-        <w:t xml:space="preserve">Ask yourself: Was it true? Almost certainly. Could it have been written on anyone's script? Possibly. And if that child had read it to the end, what would they have done on Tuesday that they didn't do?</w:t>
+        <w:t xml:space="preserve">Think of the last comment you wrote that the student clearly never read. The most recent one will do. You'll know it by the way the script came back, the next piece making the same error, the margin untouched.</w:t>
+      </w:r>
+    </w:p>
+    <w:p>
+      <w:pPr>
+        <w:spacing w:before="120" w:after="120"/>
+      </w:pPr>
+      <w:r>
+        <w:t xml:space="preserve">Ask yourself: Was it true? Almost certainly. Could it have been written on anyone's script? Possibly. If that child had read it to the end, what would they have done on Tuesday that they didn't do?</w:t>
       </w:r>
     </w:p>
     <w:p>
@@ -3547,7 +3701,7 @@
         <w:spacing w:before="120" w:after="120"/>
       </w:pPr>
       <w:r>
-        <w:t xml:space="preserve">For the next week, before returning any comment a tool helped with, read it once as that student. Not as a teacher checking for accuracy. As the child, on Tuesday, with the script in their hand and their friends already leaving for the canteen.</w:t>
+        <w:t xml:space="preserve">For the next week, before returning any comment a tool helped with, read it once as that student. Read it the way the child will, on Tuesday, with the script in their hand and their friends already leaving for the canteen, rather than the way a teacher checks it for accuracy.</w:t>
       </w:r>
     </w:p>
     <w:p>
@@ -3581,15 +3735,24 @@
         <w:t xml:space="preserve">however</w:t>
       </w:r>
       <w:r>
-        <w:t xml:space="preserve"> that should be their name. You're not rewriting the comment, and you're not marking twice. One read, one word. That's the habit.</w:t>
-      </w:r>
-    </w:p>
-    <w:p>
-      <w:pPr>
-        <w:spacing w:before="120" w:after="120"/>
-      </w:pPr>
-      <w:r>
-        <w:t xml:space="preserve">You don't need a better tool for this. You need a smaller question, and a moment to remember who's reading.</w:t>
+        <w:t xml:space="preserve"> that should be their name. One read, one word, and a name where the </w:t>
+      </w:r>
+      <w:r>
+        <w:rPr>
+          <w:i/>
+        </w:rPr>
+        <w:t xml:space="preserve">however</w:t>
+      </w:r>
+      <w:r>
+        <w:t xml:space="preserve"> was.</w:t>
+      </w:r>
+    </w:p>
+    <w:p>
+      <w:pPr>
+        <w:spacing w:before="120" w:after="120"/>
+      </w:pPr>
+      <w:r>
+        <w:t xml:space="preserve">Somebody is going to read that comment as the quiet boy by the window. Better that it's you, on Sunday night, than him on Tuesday.</w:t>
       </w:r>
     </w:p>
     <w:p>
@@ -3628,15 +3791,15 @@
         <w:spacing w:before="120" w:after="120"/>
       </w:pPr>
       <w:r>
-        <w:t xml:space="preserve">A Primary 5 teacher I know keeps a sticky note inside the front cover of her mark book. Yellow, curling at one corner, five questions in biro. What might I be missing? What am I assuming this problem is about? How might this look from the other side? What conditions might be shaping this behaviour? What is one small way to test this? She copied them out of the first book two years ago and has replaced the note twice since. She sees it every time she opens the book to record a grade, which is most evenings. She doesn't always read it. But it's there, the way a mirror by the front door is there.</w:t>
-      </w:r>
-    </w:p>
-    <w:p>
-      <w:pPr>
-        <w:spacing w:before="120" w:after="120"/>
-      </w:pPr>
-      <w:r>
-        <w:t xml:space="preserve">One Tuesday near the end of term she was writing report comments. Thirty-one children, nearly ten o'clock. She reached a boy who had handed in four pieces of work late, spent most of maths looking out of the window, and shrugged when asked about it. Her pen was already moving. </w:t>
+        <w:t xml:space="preserve">A Primary 5 teacher I know keeps a sticky note inside the front cover of her mark book. It is yellow, curling at one corner, with five questions on it in biro. What might I be missing? What am I assuming this problem is about? How might this look from the other side? What conditions might be shaping this behaviour? What is one small way to test this? She copied them out of the first book two years ago and has replaced the note twice since. On this one she has gone over the second question a second time in ink, so it sits darker than the other four. She sees the note every time she opens the book to record a grade, which is most evenings. She doesn't always read it. But it's there, the way a mirror by the front door is there.</w:t>
+      </w:r>
+    </w:p>
+    <w:p>
+      <w:pPr>
+        <w:spacing w:before="120" w:after="120"/>
+      </w:pPr>
+      <w:r>
+        <w:t xml:space="preserve">One Tuesday near the end of term she was writing report comments. Thirty-one children, and the clock on the cooker said ten to ten. She reached a boy who had handed in four pieces of work late, spent most of maths looking out of the window, and shrugged when asked about it. "Dunno, miss. It's just long," he'd said. Her pen was already moving. </w:t>
       </w:r>
       <w:r>
         <w:rPr>
@@ -3650,15 +3813,15 @@
         <w:spacing w:before="120" w:after="120"/>
       </w:pPr>
       <w:r>
-        <w:t xml:space="preserve">She stopped, because the note was in her eyeline and the second question was looking back at her. She had assumed attitude. She had a word for him already, and the word had arrived before she had.</w:t>
-      </w:r>
-    </w:p>
-    <w:p>
-      <w:pPr>
-        <w:spacing w:before="120" w:after="120"/>
-      </w:pPr>
-      <w:r>
-        <w:t xml:space="preserve">So she opened a chat window, typed a short description of the boy and the four late pieces, and then the fourth question exactly as it stood on the note: </w:t>
+        <w:t xml:space="preserve">She stopped, because the note was in her eyeline and the dark question was looking back at her. She had assumed attitude. She had a word for him already, and the word had arrived before he had.</w:t>
+      </w:r>
+    </w:p>
+    <w:p>
+      <w:pPr>
+        <w:spacing w:before="120" w:after="120"/>
+      </w:pPr>
+      <w:r>
+        <w:t xml:space="preserve">So she opened a chat window, typed a short description of the boy and the four late pieces, and then the fourth question as it stood on the note: </w:t>
       </w:r>
       <w:r>
         <w:rPr>
@@ -3680,7 +3843,7 @@
         <w:spacing w:before="120" w:after="120"/>
       </w:pPr>
       <w:r>
-        <w:t xml:space="preserve">She wrote a different comment, about extended writing, and a reminder to move his seat on Monday. The tool had done nothing clever. It had been asked the question on the note, and the note had been asked first.</w:t>
+        <w:t xml:space="preserve">She wrote a different comment, about extended writing, and a reminder to move his seat on Monday. Then she pressed the curling corner of the note flat with her thumb. It had lifted again before she reached the next name.</w:t>
       </w:r>
     </w:p>
     <w:p>
@@ -3704,15 +3867,15 @@
         <w:spacing w:before="120" w:after="120"/>
       </w:pPr>
       <w:r>
-        <w:t xml:space="preserve">The first book put five tools in your hands and told you to leave four of them in the drawer. Use one when the moment calls for it. That advice hasn't changed. What has changed is that a teacher can now put the question to a tool at nine at night as well as to herself.</w:t>
-      </w:r>
-    </w:p>
-    <w:p>
-      <w:pPr>
-        <w:spacing w:before="120" w:after="120"/>
-      </w:pPr>
-      <w:r>
-        <w:t xml:space="preserve">That matters because a classroom gives you no time to pause. Thirty children, forty minutes, a bell. The first book called certainty arrived at too soon the most dangerous moment, and teaching is made of such moments. What follows is the same five questions, turned toward the classroom and, where it helps, toward the window.</w:t>
+        <w:t xml:space="preserve">The first book put five tools in your hands and told you to leave four of them in the drawer. Use one when the moment calls for it. That advice hasn't changed. What has changed is that a teacher can now put the question to a tool at ten at night as well as to herself.</w:t>
+      </w:r>
+    </w:p>
+    <w:p>
+      <w:pPr>
+        <w:spacing w:before="120" w:after="120"/>
+      </w:pPr>
+      <w:r>
+        <w:t xml:space="preserve">That matters because a classroom gives you almost no room to pause. Thirty children have forty minutes before a bell. The first book called certainty arrived at too soon the most dangerous moment, and teaching is made of such moments. What follows is the same five questions, turned toward the classroom and, where it helps, toward the window.</w:t>
       </w:r>
     </w:p>
     <w:p>
@@ -3762,7 +3925,7 @@
         <w:t xml:space="preserve">How do I tell a parent her son is being disrespectful?</w:t>
       </w:r>
       <w:r>
-        <w:t xml:space="preserve"> The reply is a script. Start positive, state the facts, agree next steps. It's a script for a meeting in which the teacher does all the talking.</w:t>
+        <w:t xml:space="preserve"> The reply is a script. Start positive, state the facts, agree next steps. It is a script for a meeting in which the teacher does all the talking.</w:t>
       </w:r>
     </w:p>
     <w:p>
@@ -3787,7 +3950,7 @@
         <w:spacing w:before="120" w:after="120"/>
       </w:pPr>
       <w:r>
-        <w:t xml:space="preserve">The reply asks whether both incidents were in the same subject. They were. It asks whether anything at home has changed this month, and suggests opening with that question rather than a summary.</w:t>
+        <w:t xml:space="preserve">The reply asks whether both incidents were in the same subject. They were. It asks whether anything at home has changed this month, and suggests opening with that question rather than with a summary.</w:t>
       </w:r>
     </w:p>
     <w:p>
@@ -3803,7 +3966,16 @@
         <w:spacing w:before="120" w:after="120"/>
       </w:pPr>
       <w:r>
-        <w:t xml:space="preserve">What stays with the teacher isn't the script. It's the habit of asking one thing before saying anything, in a meeting, above a comment box, before answering a raised hand.</w:t>
+        <w:t xml:space="preserve">The script went in the bin. What the teacher kept was the habit of asking one thing before saying anything, in a meeting, above a comment box, before answering a raised hand. It is the first book's teacher putting down the red pen and saying </w:t>
+      </w:r>
+      <w:r>
+        <w:rPr>
+          <w:i/>
+        </w:rPr>
+        <w:t xml:space="preserve">Say more</w:t>
+      </w:r>
+      <w:r>
+        <w:t xml:space="preserve">, carried into a room with a parent in it.</w:t>
       </w:r>
     </w:p>
     <w:p>
@@ -3830,7 +4002,7 @@
         <w:spacing w:before="120" w:after="120"/>
       </w:pPr>
       <w:r>
-        <w:t xml:space="preserve">Every comment carries a name for the problem. Careless. Lazy. Bright but. Once the name has arrived, the tool will work inside it without complaint.</w:t>
+        <w:t xml:space="preserve">Every comment carries a name for the problem. Careless. Lazy. Bright but. Once the name has arrived, the tool will work inside it without complaint. Every word we settle on for a child is a decision about what to stop noticing.</w:t>
       </w:r>
     </w:p>
     <w:p>
@@ -3878,15 +4050,15 @@
         <w:spacing w:before="120" w:after="120"/>
       </w:pPr>
       <w:r>
-        <w:t xml:space="preserve">Perhaps it's a speed problem, because she is racing the boy beside her. Perhaps it's a reading problem, because the errors cluster on word problems. The teacher pulls out the last three pieces. Every error is in a word problem.</w:t>
-      </w:r>
-    </w:p>
-    <w:p>
-      <w:pPr>
-        <w:spacing w:before="120" w:after="120"/>
-      </w:pPr>
-      <w:r>
-        <w:t xml:space="preserve">The problem hasn't gone anywhere. Its name has, and a new name suggests a different Monday. The renaming is what the teacher keeps. She does it on the stairs now, without a window.</w:t>
+        <w:t xml:space="preserve">Perhaps it is a speed problem, because she is racing the boy beside her. Perhaps it is a reading problem, because the errors cluster on word problems. The teacher pulls out the last three pieces. Every error is in a word problem.</w:t>
+      </w:r>
+    </w:p>
+    <w:p>
+      <w:pPr>
+        <w:spacing w:before="120" w:after="120"/>
+      </w:pPr>
+      <w:r>
+        <w:t xml:space="preserve">The problem hasn't gone anywhere, but its name has, and a new name suggests a different Monday. The teacher does the renaming on the stairs now, without a window.</w:t>
       </w:r>
     </w:p>
     <w:p>
@@ -3927,7 +4099,7 @@
         <w:t xml:space="preserve">A science teacher whose lesson keeps going flat.</w:t>
       </w:r>
       <w:r>
-        <w:t xml:space="preserve"> Secondary 3, second period, and the middle twenty minutes always die. She has asked the tool for engagement ideas twice and received starters, quizzes and coloured cards. The loud question was about the lesson. The quiet one is about the room.</w:t>
+        <w:t xml:space="preserve"> Secondary 3, second period, and the middle twenty minutes always die. She has asked the tool for engagement ideas twice and received starters, quizzes and coloured cards. Both times she asked about the lesson. This time she asks about the room.</w:t>
       </w:r>
     </w:p>
     <w:p>
@@ -3944,7 +4116,7 @@
         <w:spacing w:before="120" w:after="120"/>
       </w:pPr>
       <w:r>
-        <w:t xml:space="preserve">The reply isn't hostile. It's fair, which is harder. </w:t>
+        <w:t xml:space="preserve">The reply is fair, which is harder to take than hostile. </w:t>
       </w:r>
       <w:r>
         <w:rPr>
@@ -3958,15 +4130,15 @@
         <w:spacing w:before="120" w:after="120"/>
       </w:pPr>
       <w:r>
-        <w:t xml:space="preserve">She moves. She stops repeating. She asks the back row first for a week. The reply hadn't taken the student's part against her. It had only shown her where she'd been standing.</w:t>
-      </w:r>
-    </w:p>
-    <w:p>
-      <w:pPr>
-        <w:spacing w:before="120" w:after="120"/>
-      </w:pPr>
-      <w:r>
-        <w:t xml:space="preserve">What stays is a reflex, thirty seconds in the back seat before a lesson she has taught before.</w:t>
+        <w:t xml:space="preserve">There is a line usually attributed to Plutarch, from his essay on listening to lectures, that I think of whenever I catch myself explaining something a third time: "The mind is not a vessel to be filled but a fire to be kindled." From the front, a third explanation looks like care. From the back row it looks like filling.</w:t>
+      </w:r>
+    </w:p>
+    <w:p>
+      <w:pPr>
+        <w:spacing w:before="120" w:after="120"/>
+      </w:pPr>
+      <w:r>
+        <w:t xml:space="preserve">She moves. She stops repeating. For a week she asks the back row first. What stays is a reflex, thirty seconds in the back seat before a lesson she has taught before.</w:t>
       </w:r>
     </w:p>
     <w:p>
@@ -3993,7 +4165,7 @@
         <w:spacing w:before="120" w:after="120"/>
       </w:pPr>
       <w:r>
-        <w:t xml:space="preserve">You saw this at work at the start of the chapter. It sits behind more classroom stories than any other, because a classroom is nothing but conditions. The timetable, the seat, the worksheet, the group. The lunch tray from the first book belongs here. The fruit went untouched until somebody moved the fruit.</w:t>
+        <w:t xml:space="preserve">You saw this at work at the start of the chapter. It sits behind more classroom stories than any other, because a classroom is nothing but conditions. The timetable shapes the seat, the seat shapes the group, the worksheet shapes the argument. You'll remember the lunch tray from the first book, and the fruit nobody touched until somebody moved the fruit to the front of the tray.</w:t>
       </w:r>
     </w:p>
     <w:p>
@@ -4007,7 +4179,7 @@
         <w:t xml:space="preserve">A Primary 4 teacher with a group that will not work together.</w:t>
       </w:r>
       <w:r>
-        <w:t xml:space="preserve"> Four children, one table, every task ending in a complaint. The loud question is </w:t>
+        <w:t xml:space="preserve"> Four children at one table, and every task ends the same way, with a hand up and "Teacher, she won't let go of it." The loud question is </w:t>
       </w:r>
       <w:r>
         <w:rPr>
@@ -4016,7 +4188,7 @@
         <w:t xml:space="preserve">How do I manage a group that can't cooperate?</w:t>
       </w:r>
       <w:r>
-        <w:t xml:space="preserve"> Roles, rules, a talking token. All tried.</w:t>
+        <w:t xml:space="preserve"> Roles, rules and a talking token have all been tried.</w:t>
       </w:r>
     </w:p>
     <w:p>
@@ -4041,7 +4213,7 @@
         <w:spacing w:before="120" w:after="120"/>
       </w:pPr>
       <w:r>
-        <w:t xml:space="preserve">None of that is certain. All of it can be changed by Thursday, and that is the whole point. A child's character moves slowly if it moves at all. The conditions are where a teacher actually has her hands, and that is what she carries out of the window and back into the room.</w:t>
+        <w:t xml:space="preserve">None of that is certain. All of it can be changed by Thursday. A child's character moves slowly if it moves at all. The conditions are where a teacher has her hands.</w:t>
       </w:r>
     </w:p>
     <w:p>
@@ -4107,7 +4279,7 @@
         <w:spacing w:before="120" w:after="120"/>
       </w:pPr>
       <w:r>
-        <w:t xml:space="preserve">One moved. It wasn't the one he'd have chosen.</w:t>
+        <w:t xml:space="preserve">On Wednesday one of them was gone from the table. "Whose is this?" his daughter called from the stairs, holding it. It wasn't the one he'd have chosen for her.</w:t>
       </w:r>
     </w:p>
     <w:p>
@@ -4139,7 +4311,7 @@
         <w:spacing w:before="120" w:after="120"/>
       </w:pPr>
       <w:r>
-        <w:t xml:space="preserve">Don't memorise this. The first book asked you not to and I'd ask the same. A good conversation in the staff room already passes through most of them without anybody naming one.</w:t>
+        <w:t xml:space="preserve">Don't memorise this. The first book asked you not to and I'd ask the same. A good conversation in the staff room already passes through most of them without anybody naming one. Confucius has a line in the Analects, in James Legge's translation, that I would copy onto the sticky note if there were room: "Learning without thought is labour lost; thought without learning is perilous." The replies are the learning. The five questions are the thought, and the thought has to be yours.</w:t>
       </w:r>
     </w:p>
     <w:p>
@@ -4172,7 +4344,7 @@
         <w:spacing w:before="120" w:after="120"/>
       </w:pPr>
       <w:r>
-        <w:t xml:space="preserve">The tool will do the same thing, more smoothly. Describe a child as lazy and ask for conditions, and laziness will be the first condition it finds. The tool will agree with you about a child if you let it, and it will do so warmly, in good prose, at nine at night when you are tired and would quite like to be agreed with.</w:t>
+        <w:t xml:space="preserve">The tool will do the same thing, more smoothly. Describe a child as lazy and ask for conditions, and laziness will be the first condition it finds. The tool will agree with you about a child if you let it, and it will do so warmly, in good prose, at ten at night when you are tired and would like to be agreed with.</w:t>
       </w:r>
     </w:p>
     <w:p>
@@ -4197,15 +4369,21 @@
         <w:spacing w:before="120" w:after="120"/>
       </w:pPr>
       <w:r>
-        <w:t xml:space="preserve">It's not a pleasant thing to type about a child you've made your mind up about. The discomfort is the signal.</w:t>
-      </w:r>
-    </w:p>
-    <w:p>
-      <w:pPr>
-        <w:spacing w:before="120" w:after="120"/>
-      </w:pPr>
-      <w:r>
-        <w:t xml:space="preserve">What stays on the human side hasn't changed since the second book. The tool can list conditions and hold a chair. It cannot choose which question to put to which child, weigh the reply against thirty faces it has never seen, or decide what goes on the report. That part is yours, and so is the responsibility.</w:t>
+        <w:t xml:space="preserve">It is an uncomfortable thing to type about a child you've made your mind up about. The discomfort is the signal, the same small flinch the second book noticed at </w:t>
+      </w:r>
+      <w:r>
+        <w:rPr>
+          <w:i/>
+        </w:rPr>
+        <w:t xml:space="preserve">Did you write this?</w:t>
+      </w:r>
+    </w:p>
+    <w:p>
+      <w:pPr>
+        <w:spacing w:before="120" w:after="120"/>
+      </w:pPr>
+      <w:r>
+        <w:t xml:space="preserve">What stays on the human side hasn't changed since the second book. The tool can list conditions and hold a chair. It cannot choose which question to put to which child, weigh the reply against thirty faces it has never seen, or decide what goes on the report. The choosing, the weighing and the deciding are yours, and so is the responsibility.</w:t>
       </w:r>
     </w:p>
     <w:p>
@@ -4221,7 +4399,7 @@
         <w:spacing w:before="120" w:after="120"/>
       </w:pPr>
       <w:r>
-        <w:t xml:space="preserve">Look at the teacher with the mark book, the form teacher, the maths teacher, the science teacher, the Primary 4 teacher and the father, and the shape is the one you've been seeing since the first book. The loud question asked for a fix, a script, a plan. It got one, at once, and the fix wasn't the trouble. The quiet question asked for what had to come before a fix: what's missing, what's assumed, what the back row sees, what the room is doing, what could be tried by Friday. What came back was smaller, and it was about the actual child. The window was the same at nine at night as it was at lunch. The question put to it was not.</w:t>
+        <w:t xml:space="preserve">Look at the teacher with the mark book, the form teacher, the maths teacher, the science teacher, the Primary 4 teacher and the father, and the shape is the one you've been seeing since the first book. The loud question asked for a fix, a script, a plan. It got one, at once, and the fix wasn't the trouble. The quiet question asked for what had to come before a fix: what's missing, what's assumed, what the back row sees, what the room is doing, what could be tried by Friday. What came back was smaller, and it was about the particular child. The window gave each of them what it was asked for. The second time, they asked for less and were given more.</w:t>
       </w:r>
     </w:p>
     <w:p>
@@ -4237,7 +4415,7 @@
         <w:spacing w:before="120" w:after="120"/>
       </w:pPr>
       <w:r>
-        <w:t xml:space="preserve">Think of the last comment you wrote about a student's attitude or effort. Not the one that was unfair. The one that was probably true, and still gave nobody anything to do.</w:t>
+        <w:t xml:space="preserve">Think of the last comment you wrote about a student's attitude or effort. I don't mean the unfair one. I mean the one that was probably true, and still gave nobody anything to do.</w:t>
       </w:r>
     </w:p>
     <w:p>
@@ -4277,23 +4455,23 @@
         <w:spacing w:before="120" w:after="120"/>
       </w:pPr>
       <w:r>
-        <w:t xml:space="preserve">Choose the one you reach for least. For me it's usually the Perspective. It's easier to ask what a child is missing than what I look like from the back row.</w:t>
-      </w:r>
-    </w:p>
-    <w:p>
-      <w:pPr>
-        <w:spacing w:before="120" w:after="120"/>
-      </w:pPr>
-      <w:r>
-        <w:t xml:space="preserve">The next time a comment is half-written and a word for the child has already arrived, stop and read the note. Once. Then decide whether the word still fits.</w:t>
-      </w:r>
-    </w:p>
-    <w:p>
-      <w:pPr>
-        <w:spacing w:before="120" w:after="120"/>
-      </w:pPr>
-      <w:r>
-        <w:t xml:space="preserve">That's the whole habit. You don't need a better tool. You need a smaller note, in a place you can't avoid.</w:t>
+        <w:t xml:space="preserve">Choose the one you reach for least. For me it's usually the Perspective. It is easier to ask what a child is missing than what I look like from the back row.</w:t>
+      </w:r>
+    </w:p>
+    <w:p>
+      <w:pPr>
+        <w:spacing w:before="120" w:after="120"/>
+      </w:pPr>
+      <w:r>
+        <w:t xml:space="preserve">The next time a comment is half-written and a word for the child has already arrived, stop and read the note once, then decide whether the word still fits.</w:t>
+      </w:r>
+    </w:p>
+    <w:p>
+      <w:pPr>
+        <w:spacing w:before="120" w:after="120"/>
+      </w:pPr>
+      <w:r>
+        <w:t xml:space="preserve">Write it small, and put it where you can't step round it.</w:t>
       </w:r>
     </w:p>
     <w:p>
@@ -4332,7 +4510,7 @@
         <w:spacing w:before="120" w:after="120"/>
       </w:pPr>
       <w:r>
-        <w:t xml:space="preserve">A father I know was at the dining table at twenty to nine on a Tuesday night, with a Primary 4 daughter, a worksheet, and a problem sum about two tanks of water. Tank A held three times as much as Tank B. Twelve litres were poured from Tank A into Tank B, and after that they held the same. How much was in Tank A at the start?</w:t>
+        <w:t xml:space="preserve">A father I know was at the dining table at twenty to nine on a Tuesday night, with a Primary 4 daughter, a worksheet, and a problem sum about two tanks of water. Tank A held three times as much as Tank B. Twelve litres were poured from Tank A into Tank B, and after that they held the same. How much was in Tank A at the start? The worksheet had a soft grey patch where the first bar had been drawn, rubbed out and drawn again, and the eraser on her pencil was worn down to the metal.</w:t>
       </w:r>
     </w:p>
     <w:p>
@@ -4370,15 +4548,15 @@
         <w:spacing w:before="120" w:after="120"/>
       </w:pPr>
       <w:r>
-        <w:t xml:space="preserve">Not because the maths was wrong. It wasn't. She cried because her teacher had drawn boxes on the board that afternoon, long bars with a shorter one underneath, and that method had been about half clear to her when she left school. Now there was a second method on the table with a letter in it, and the two methods weren't talking to each other. She'd walked in with one thing she half understood and was sitting there with two things she didn't understand at all. It was ten past nine. He sent her to bed.</w:t>
-      </w:r>
-    </w:p>
-    <w:p>
-      <w:pPr>
-        <w:spacing w:before="120" w:after="120"/>
-      </w:pPr>
-      <w:r>
-        <w:t xml:space="preserve">He sat with the phone for a while after that. The next evening, before she brought the worksheet out, he opened the window again and typed something quite different: </w:t>
+        <w:t xml:space="preserve">The maths was right. She cried because her teacher had drawn boxes on the board that afternoon, long bars with a shorter one underneath, and that method had been about half clear to her when she left school. Now there was a second method on the table with a letter in it, and the two methods weren't talking to each other. She'd walked in with one thing she half understood and was sitting there with two things she didn't understand at all. It was ten past nine. He sent her to bed.</w:t>
+      </w:r>
+    </w:p>
+    <w:p>
+      <w:pPr>
+        <w:spacing w:before="120" w:after="120"/>
+      </w:pPr>
+      <w:r>
+        <w:t xml:space="preserve">He sat with the phone for a while after that. The next evening, before she brought the worksheet out, he opened the window again and typed something different: </w:t>
       </w:r>
       <w:r>
         <w:rPr>
@@ -4401,15 +4579,33 @@
         <w:t xml:space="preserve">Where did it start to feel confusing?</w:t>
       </w:r>
       <w:r>
-        <w:t xml:space="preserve"> It turned out that she could draw the three bars for Tank A and the one for Tank B, but she didn't know what to do about the water that moved. She thought it disappeared.</w:t>
-      </w:r>
-    </w:p>
-    <w:p>
-      <w:pPr>
-        <w:spacing w:before="120" w:after="120"/>
-      </w:pPr>
-      <w:r>
-        <w:t xml:space="preserve">They worked out together that it went from one bar to the other. That was the whole of the difficulty. It took forty minutes rather than a few seconds, it ended without tears, and the method on the page was the one her teacher would recognise on Thursday. The window was the same one he'd used the night before. What he'd asked of it had changed, and so had where he was sitting.</w:t>
+        <w:t xml:space="preserve"> She put her finger on the grey patch. </w:t>
+      </w:r>
+      <w:r>
+        <w:rPr>
+          <w:i/>
+        </w:rPr>
+        <w:t xml:space="preserve">I can draw the tanks. The twelve litres, where does it go? It just goes.</w:t>
+      </w:r>
+      <w:r>
+        <w:t xml:space="preserve"> She could draw the three bars for Tank A and the one for Tank B. She thought the water that moved had disappeared.</w:t>
+      </w:r>
+    </w:p>
+    <w:p>
+      <w:pPr>
+        <w:spacing w:before="120" w:after="120"/>
+      </w:pPr>
+      <w:r>
+        <w:t xml:space="preserve">They worked out together that it went from one bar to the other, and that was the whole of the difficulty. It took forty minutes rather than a few seconds, it ended without tears, and the method on the page was the one her teacher would recognise on Thursday. At the end she drew an arrow from the tall bar to the short one, pressing hard enough to mark the table underneath, and wrote </w:t>
+      </w:r>
+      <w:r>
+        <w:rPr>
+          <w:i/>
+        </w:rPr>
+        <w:t xml:space="preserve">12</w:t>
+      </w:r>
+      <w:r>
+        <w:t xml:space="preserve"> above it. The phone stayed face down until she'd gone up.</w:t>
       </w:r>
     </w:p>
     <w:p>
@@ -4442,7 +4638,7 @@
         <w:t xml:space="preserve">Why won't you just do it?</w:t>
       </w:r>
       <w:r>
-        <w:t xml:space="preserve">, produced exactly the evenings you'd expect. It turned out he was stuck at the first step and afraid to say so. The useful question, when it finally came, was </w:t>
+        <w:t xml:space="preserve">, produced the evenings you'd expect. It turned out he was stuck at the first step and afraid to say so. The useful question, when it finally came, was </w:t>
       </w:r>
       <w:r>
         <w:rPr>
@@ -4456,7 +4652,16 @@
         <w:spacing w:before="120" w:after="120"/>
       </w:pPr>
       <w:r>
-        <w:t xml:space="preserve">The second book picked the same child up again, this time with a parent at a chat window. That parent's first prompt asked how to make the boy do his homework without a fight, and received reward charts. The second prompt said what was true, that he might be stuck at the first step, and asked for one sentence that would make it safer to admit confusion.</w:t>
+        <w:t xml:space="preserve">The second book picked the same child up again, this time with a parent at a chat window. That parent's first prompt asked how to make the boy do his homework without a fight, and received reward charts. The second prompt said what was true, that he might be stuck at the first step, and asked for one sentence that would make it safer to admit confusion. Fred Rogers, who spent a working life making hard things safe for children to say, wrote in </w:t>
+      </w:r>
+      <w:r>
+        <w:rPr>
+          <w:i/>
+        </w:rPr>
+        <w:t xml:space="preserve">The World According to Mister Rogers</w:t>
+      </w:r>
+      <w:r>
+        <w:t xml:space="preserve">: "Anything that's human is mentionable, and anything that is mentionable can be more manageable." Being stuck at the first step is about as human as it gets. The whole job, for that parent and for the father with the tanks, was to make it mentionable.</w:t>
       </w:r>
     </w:p>
     <w:p>
@@ -4472,7 +4677,7 @@
         <w:spacing w:before="120" w:after="120"/>
       </w:pPr>
       <w:r>
-        <w:t xml:space="preserve">The speed is new. The question underneath it is not. It's still </w:t>
+        <w:t xml:space="preserve">The speed is new. The question underneath it is the one it has always been, </w:t>
       </w:r>
       <w:r>
         <w:rPr>
@@ -4505,15 +4710,15 @@
         <w:spacing w:before="120" w:after="120"/>
       </w:pPr>
       <w:r>
-        <w:t xml:space="preserve">First, it asked the tool to hold back. It didn't ask for a method. It asked the tool to ask him something. That's the Reverse Prompt from the second book turned round to face the parent, and it works for the same reason. The tool fills every gap you leave with an average, and the average method for two tanks of water is algebra. The bar model was a gap he hadn't filled. Once he did, the tool could work inside it.</w:t>
-      </w:r>
-    </w:p>
-    <w:p>
-      <w:pPr>
-        <w:spacing w:before="120" w:after="120"/>
-      </w:pPr>
-      <w:r>
-        <w:t xml:space="preserve">Second, it asked for the school's method rather than his own. Most parents, faced with a worksheet, reach for the way they were taught, because it's the way that's in their hands. The tool will cheerfully give you that. It will also, if you ask, give you the other one.</w:t>
+        <w:t xml:space="preserve">First, it asked the tool to hold back and to ask him something before it offered anything. That's the Reverse Prompt from the second book turned round to face the parent, and it works for the same reason. The tool fills every gap you leave with an average, and the average method for two tanks of water is algebra. The bar model was a gap he hadn't filled. Once he did, the tool could work inside it.</w:t>
+      </w:r>
+    </w:p>
+    <w:p>
+      <w:pPr>
+        <w:spacing w:before="120" w:after="120"/>
+      </w:pPr>
+      <w:r>
+        <w:t xml:space="preserve">Second, it asked for the school's method rather than his own. Most parents, faced with a worksheet, reach for the way they were taught, because it's the way that's in their hands. The tool will cheerfully give you that. It will also, if you ask, give you the other one. The method in your hands is rarely the one in hers.</w:t>
       </w:r>
     </w:p>
     <w:p>
@@ -4530,7 +4735,7 @@
         <w:spacing w:before="120" w:after="120"/>
       </w:pPr>
       <w:r>
-        <w:t xml:space="preserve">And then a second prompt, which is the one I'd keep if I could only keep one.</w:t>
+        <w:t xml:space="preserve">Then a second prompt, which is the one I'd keep if I could only keep one.</w:t>
       </w:r>
     </w:p>
     <w:p>
@@ -4568,7 +4773,7 @@
         <w:rPr>
           <w:i/>
         </w:rPr>
-        <w:t xml:space="preserve">He is revising conduction, convection and radiation. I don't remember any of it. Tell me what a Secondary 2 student should be able to explain, and give me three questions a listener could ask that would show whether he actually understands.</w:t>
+        <w:t xml:space="preserve">He is revising conduction, convection and radiation. I don't remember any of it. Tell me what a Secondary 2 student should be able to explain, and give me three questions a listener could ask that would show whether he understands it.</w:t>
       </w:r>
     </w:p>
     <w:p>
@@ -4585,7 +4790,25 @@
         <w:t xml:space="preserve">So why does the handle of a metal spoon in the soup get hot, but the handle of a wooden one doesn't?</w:t>
       </w:r>
       <w:r>
-        <w:t xml:space="preserve"> He stops. He starts again. He gets it right the second time, and he's the one who got it right. She still couldn't have explained it herself, and that didn't matter. She wasn't there to be a second teacher. She was there to be a good listener who knew what to listen for.</w:t>
+        <w:t xml:space="preserve"> </w:t>
+      </w:r>
+      <w:r>
+        <w:rPr>
+          <w:i/>
+        </w:rPr>
+        <w:t xml:space="preserve">Because wood's thicker?</w:t>
+      </w:r>
+      <w:r>
+        <w:t xml:space="preserve"> he says, and stops, and hears it. He starts again. He gets it right the second time, and he's the one who got it right. She still couldn't have explained it herself, and that didn't matter. She was doing what the teacher in the first book did when she put down the red pen, said </w:t>
+      </w:r>
+      <w:r>
+        <w:rPr>
+          <w:i/>
+        </w:rPr>
+        <w:t xml:space="preserve">Say more</w:t>
+      </w:r>
+      <w:r>
+        <w:t xml:space="preserve">, and waited. She was a listener who knew what to listen for.</w:t>
       </w:r>
     </w:p>
     <w:p>
@@ -4647,7 +4870,34 @@
         <w:t xml:space="preserve">Did you cheat?</w:t>
       </w:r>
       <w:r>
-        <w:t xml:space="preserve"> It's a loud question. It has already decided what happened and what it means, and it produces what loud questions produce. He says everyone does it. She says that's not the point. He says she doesn't understand the pressure. Ten minutes later they're arguing about screen time, which was never what the afternoon was about.</w:t>
+        <w:t xml:space="preserve"> It's a loud question. It has already decided what happened and what it means, and it produces what loud questions produce. He gives the small flinch the second book noticed in anyone asked </w:t>
+      </w:r>
+      <w:r>
+        <w:rPr>
+          <w:i/>
+        </w:rPr>
+        <w:t xml:space="preserve">Did you write this?</w:t>
+      </w:r>
+      <w:r>
+        <w:t xml:space="preserve">, and then he says everyone does it. She says that's not the point. He says she doesn't understand the pressure. Ten minutes later they're arguing about screen time, which was never what the afternoon was about. The child psychologist Haim Ginott wrote, in </w:t>
+      </w:r>
+      <w:r>
+        <w:rPr>
+          <w:i/>
+        </w:rPr>
+        <w:t xml:space="preserve">Between Parent and Child</w:t>
+      </w:r>
+      <w:r>
+        <w:t xml:space="preserve">: "Children are like wet cement. Whatever falls on them makes an impression." </w:t>
+      </w:r>
+      <w:r>
+        <w:rPr>
+          <w:i/>
+        </w:rPr>
+        <w:t xml:space="preserve">Did you cheat?</w:t>
+      </w:r>
+      <w:r>
+        <w:t xml:space="preserve"> falls with some weight, and it sets in the shape it landed in.</w:t>
       </w:r>
     </w:p>
     <w:p>
@@ -4677,15 +4927,15 @@
         <w:spacing w:before="120" w:after="120"/>
       </w:pPr>
       <w:r>
-        <w:t xml:space="preserve">So they didn't make a rule. What they made was an agreement, and it was built out of questions rather than prohibitions. When you use it, what did you ask it? What did you check? What did you change? Three questions, asked without heat, whenever a piece of work came out of a chat window. If he couldn't answer them, that was the conversation, not the punishment. I've watched a few families try this, and it works best where the parents ask the same three questions of themselves, out loud, when they've used the tool at work.</w:t>
-      </w:r>
-    </w:p>
-    <w:p>
-      <w:pPr>
-        <w:spacing w:before="120" w:after="120"/>
-      </w:pPr>
-      <w:r>
-        <w:t xml:space="preserve">The essay, by the way, got rewritten. Not because she made him, but because when he tried to answer </w:t>
+        <w:t xml:space="preserve">So they made an agreement rather than a rule, and it was built out of questions. When you use it, what did you ask it? What did you check? What did you change? Three questions, asked without heat, whenever a piece of work came out of a chat window. If he couldn't answer them, that was the conversation, not the punishment. I've watched a few families try this, and it works best where the parents ask the same three questions of themselves, out loud, when they've used the tool at work.</w:t>
+      </w:r>
+    </w:p>
+    <w:p>
+      <w:pPr>
+        <w:spacing w:before="120" w:after="120"/>
+      </w:pPr>
+      <w:r>
+        <w:t xml:space="preserve">The essay got rewritten, in the end, because when he tried to answer </w:t>
       </w:r>
       <w:r>
         <w:rPr>
@@ -4718,23 +4968,23 @@
         <w:spacing w:before="120" w:after="120"/>
       </w:pPr>
       <w:r>
-        <w:t xml:space="preserve">It helps to be honest about what the tool brings to the table, because it brings quite a lot.</w:t>
-      </w:r>
-    </w:p>
-    <w:p>
-      <w:pPr>
-        <w:spacing w:before="120" w:after="120"/>
-      </w:pPr>
-      <w:r>
-        <w:t xml:space="preserve">It can hold the method, the school's one, if you tell it which. It can hold the patience, which at twenty to nine on a Tuesday is not a small thing, because it will explain the moving water for the fourth time in exactly the tone it used the first time. It can hold the explanation at whatever level you ask for, and it never sighs.</w:t>
-      </w:r>
-    </w:p>
-    <w:p>
-      <w:pPr>
-        <w:spacing w:before="120" w:after="120"/>
-      </w:pPr>
-      <w:r>
-        <w:t xml:space="preserve">Here is what it cannot do. It cannot notice the tears starting. It cannot see that her pencil has stopped and she's looking at the wall rather than the page. It cannot decide that tonight is not the night, that the worksheet can be wrong tomorrow and the child cannot be, and say </w:t>
+        <w:t xml:space="preserve">The tool brings a good deal to the table, and it's worth saying what.</w:t>
+      </w:r>
+    </w:p>
+    <w:p>
+      <w:pPr>
+        <w:spacing w:before="120" w:after="120"/>
+      </w:pPr>
+      <w:r>
+        <w:t xml:space="preserve">It can hold the method, the school's one, if you tell it which. It can hold the patience, which at twenty to nine on a Tuesday is not a small thing, because it will explain the moving water for the fourth time in the tone it used the first time. It can hold the explanation at whatever level you ask for, and it never sighs.</w:t>
+      </w:r>
+    </w:p>
+    <w:p>
+      <w:pPr>
+        <w:spacing w:before="120" w:after="120"/>
+      </w:pPr>
+      <w:r>
+        <w:t xml:space="preserve">It cannot notice the tears starting. It cannot see that her pencil has stopped and she's looking at the wall rather than the page. It cannot decide that tonight is not the night, that the worksheet can be wrong tomorrow and the child cannot be, and say </w:t>
       </w:r>
       <w:r>
         <w:rPr>
@@ -4751,7 +5001,7 @@
         <w:spacing w:before="120" w:after="120"/>
       </w:pPr>
       <w:r>
-        <w:t xml:space="preserve">Those are the parent's, still. The choosing of when and whether. The weighing of what's actually the matter. The deciding to stop. The second book said the tool can take on more of the work than ever and none of the responsibility, and I don't think there's a room in which that's more visibly true than a kitchen at nine at night.</w:t>
+        <w:t xml:space="preserve">The choosing, the weighing and the deciding stay with the parent, and on a bad night the most important decision is to stop. The second book said the tool can take on more of the work than ever and none of the responsibility, and I don't think there's a room in which that's more visibly true than a kitchen at nine at night.</w:t>
       </w:r>
     </w:p>
     <w:p>
@@ -4776,7 +5026,7 @@
         <w:t xml:space="preserve">Solve this. Did you cheat? Just read the textbook.</w:t>
       </w:r>
       <w:r>
-        <w:t xml:space="preserve"> Each got exactly what it asked for, and what it asked for made the evening worse. The second move slowed down, said what was true about the child and the school and the night, and asked one question before explaining anything. None of these people bought a better tool between the first attempt and the second. They changed where they were sitting, and they changed what they asked first.</w:t>
+        <w:t xml:space="preserve"> Each got what it asked for, and what it asked for made the evening worse. The second move slowed down, said what was true about the child and the school and the night, and asked one question before explaining anything. None of these people bought a better tool between the first attempt and the second. They changed where they were sitting, and they changed what they asked first.</w:t>
       </w:r>
     </w:p>
     <w:p>
@@ -4792,7 +5042,7 @@
         <w:spacing w:before="120" w:after="120"/>
       </w:pPr>
       <w:r>
-        <w:t xml:space="preserve">Think of the last homework evening that ended badly. Not the worst one. Just the most recent.</w:t>
+        <w:t xml:space="preserve">Think of the last homework evening that ended badly. The most recent one, rather than the worst.</w:t>
       </w:r>
     </w:p>
     <w:p>
@@ -4877,7 +5127,7 @@
         <w:spacing w:before="120" w:after="120"/>
       </w:pPr>
       <w:r>
-        <w:t xml:space="preserve">That's the whole habit. It's older than the tool, and the tool hasn't made it any less useful. You don't need a better explanation. You need one question, asked first, and the patience to hear the answer.</w:t>
+        <w:t xml:space="preserve">The habit is older than the tool, and the tool hasn't worn it out. Ask the question first, and let the child's answer decide whether the window opens at all.</w:t>
       </w:r>
     </w:p>
     <w:p>
@@ -4952,7 +5202,7 @@
         <w:spacing w:before="120" w:after="120"/>
       </w:pPr>
       <w:r>
-        <w:t xml:space="preserve">Her teacher read it, then read the results table above it.</w:t>
+        <w:t xml:space="preserve">Her teacher read it, then read the results table above it, and drew a small pencil ring around one number.</w:t>
       </w:r>
     </w:p>
     <w:p>
@@ -4985,7 +5235,7 @@
         <w:spacing w:before="120" w:after="120"/>
       </w:pPr>
       <w:r>
-        <w:t xml:space="preserve">He wrote one question in the margin. </w:t>
+        <w:t xml:space="preserve">He didn't reach for the red pen. Beside the ring he wrote one question in the margin. </w:t>
       </w:r>
       <w:r>
         <w:rPr>
@@ -5013,7 +5263,7 @@
         <w:spacing w:before="120" w:after="120"/>
       </w:pPr>
       <w:r>
-        <w:t xml:space="preserve">Nothing in it sounded like a textbook. All of it was true.</w:t>
+        <w:t xml:space="preserve">The 41 was still in the table. This time the ring around it was hers.</w:t>
       </w:r>
     </w:p>
     <w:p>
@@ -5037,7 +5287,7 @@
         <w:spacing w:before="120" w:after="120"/>
       </w:pPr>
       <w:r>
-        <w:t xml:space="preserve">Science already has the habits this book keeps asking for. Predict before you look. Test rather than assert. Hunt for the case against your own idea before someone else does. Every fair test, every line that begins </w:t>
+        <w:t xml:space="preserve">Science already has the habits this book keeps asking for. Predict before you look, and hunt for the case against your own idea before someone else does. Every fair test, every line that begins </w:t>
       </w:r>
       <w:r>
         <w:rPr>
@@ -5054,15 +5304,24 @@
         <w:spacing w:before="120" w:after="120"/>
       </w:pPr>
       <w:r>
-        <w:t xml:space="preserve">The second book borrowed this for its science check: ask for the case against. What's changed is that the window will now hand a student the textbook answer before she has looked at her own bench, and the textbook answer is nearly always right in general. But the practical was never about the general case. It was about this flask, this water bath, this afternoon.</w:t>
-      </w:r>
-    </w:p>
-    <w:p>
-      <w:pPr>
-        <w:spacing w:before="120" w:after="120"/>
-      </w:pPr>
-      <w:r>
-        <w:t xml:space="preserve">The tool gives what should have happened. The bench gives what did. The gap between them is not a failure of the lesson. It is the lesson. A student who can say </w:t>
+        <w:t xml:space="preserve">The second book borrowed this for its science check: ask for the case against. What's changed is that the window will now hand a student the textbook answer before she has looked at her own bench, and the textbook answer is nearly always right in general. That is the trouble with it. Karl Popper wrote in </w:t>
+      </w:r>
+      <w:r>
+        <w:rPr>
+          <w:i/>
+        </w:rPr>
+        <w:t xml:space="preserve">Conjectures and Refutations</w:t>
+      </w:r>
+      <w:r>
+        <w:t xml:space="preserve"> that "Irrefutability is not a virtue of a theory (as people often think) but a vice." A conclusion that would sit just as comfortably above any results table cannot be caught out by this one, so it says nothing about it. The practical was never about the general case. It was about this flask, this water bath, this afternoon.</w:t>
+      </w:r>
+    </w:p>
+    <w:p>
+      <w:pPr>
+        <w:spacing w:before="120" w:after="120"/>
+      </w:pPr>
+      <w:r>
+        <w:t xml:space="preserve">A student who can say </w:t>
       </w:r>
       <w:r>
         <w:rPr>
@@ -5071,7 +5330,7 @@
         <w:t xml:space="preserve">my result was 41 seconds, the explanation says about 30, and here is why I think they differ</w:t>
       </w:r>
       <w:r>
-        <w:t xml:space="preserve"> has done more science than one whose write-up matches the book.</w:t>
+        <w:t xml:space="preserve"> has done more science than one whose write-up matches the book. The tool can tell you what should have happened. Only the bench knows what did.</w:t>
       </w:r>
     </w:p>
     <w:p>
@@ -5117,15 +5376,15 @@
         <w:spacing w:before="120" w:after="120"/>
       </w:pPr>
       <w:r>
-        <w:t xml:space="preserve">The block floated. The bolt went straight down. There was the noise a class makes when it has been wrong in public and doesn't mind.</w:t>
-      </w:r>
-    </w:p>
-    <w:p>
-      <w:pPr>
-        <w:spacing w:before="120" w:after="120"/>
-      </w:pPr>
-      <w:r>
-        <w:t xml:space="preserve">Only then did she let them ask the window why, and it told them about density and about how much water an object pushes aside. It explained it well, and it landed on children who already had a question, because their own sentence had just been contradicted by a tub. The same paragraph, read first, would have been something to copy. Read second, it was an answer.</w:t>
+        <w:t xml:space="preserve">The block floated. The bolt went straight down. There was the noise a class makes when it has been wrong in public and doesn't mind. A boy at the back said, "Miss, push it under." She did, and it came back up.</w:t>
+      </w:r>
+    </w:p>
+    <w:p>
+      <w:pPr>
+        <w:spacing w:before="120" w:after="120"/>
+      </w:pPr>
+      <w:r>
+        <w:t xml:space="preserve">Only then did she let them ask the window why, and it told them about density and about how much water an object pushes aside. It explained it well, and it landed on children who already had a question, because their own sentence had just been contradicted by a tub.</w:t>
       </w:r>
     </w:p>
     <w:p>
@@ -5206,7 +5465,7 @@
         <w:spacing w:before="120" w:after="120"/>
       </w:pPr>
       <w:r>
-        <w:t xml:space="preserve">The reply pointed out that a lamp brought closer also warms the water, that bubbles are not all the same size, and that a beaker left in the sun before the lesson is already ahead. She added a thermometer and a two-minute rest between readings. The practical didn't change. Her attention to it did.</w:t>
+        <w:t xml:space="preserve">The reply pointed out that a lamp brought closer also warms the water, that bubbles are not all the same size, and that a beaker left in the sun before the lesson is already ahead. She added a thermometer and a two-minute rest between readings, and went in the next morning knowing which of her numbers to distrust.</w:t>
       </w:r>
     </w:p>
     <w:p>
@@ -5246,7 +5505,7 @@
         <w:t xml:space="preserve">If I left both on the bench overnight, which would be colder in the morning?</w:t>
       </w:r>
       <w:r>
-        <w:t xml:space="preserve"> He opened the unit with that question alone. Eleven hands went up for the spoon. He had his lesson.</w:t>
+        <w:t xml:space="preserve"> He opened the unit with that question alone. Eleven hands went up for the spoon, and he let the room argue.</w:t>
       </w:r>
     </w:p>
     <w:p>
@@ -5260,7 +5519,7 @@
         <w:t xml:space="preserve">A Primary 5 pupil and a cold can of drink.</w:t>
       </w:r>
       <w:r>
-        <w:t xml:space="preserve"> She was sure the water on the outside of a can from the fridge had leaked through from inside. Her teacher didn't correct her. Remembering the small experiment from the first book, he asked her to type one question.</w:t>
+        <w:t xml:space="preserve"> She was sure the water on the outside of a can from the fridge had leaked through from inside. "It's leaking," she told her teacher. "The cold pushes it out through the metal." He didn't correct her. Remembering the small experiment from the first book, he asked her to type one question.</w:t>
       </w:r>
     </w:p>
     <w:p>
@@ -5303,7 +5562,7 @@
         <w:spacing w:before="120" w:after="120"/>
       </w:pPr>
       <w:r>
-        <w:t xml:space="preserve">🔍 Takeaway: In each case the prompt asked the tool for the thing that might undo the idea, not the thing that would confirm it.</w:t>
+        <w:t xml:space="preserve">🔍 Takeaway: The useful prompt asks the tool what could undo the idea. Confirmation it will give you unasked.</w:t>
       </w:r>
     </w:p>
     <w:p>
@@ -5319,23 +5578,32 @@
         <w:spacing w:before="120" w:after="120"/>
       </w:pPr>
       <w:r>
-        <w:t xml:space="preserve">The trap here is fluency. A wrong explanation that sounds like the textbook is harder to catch than a wrong number, because the ear accepts it before the eye has checked. It is the first book's certainty arrived at too soon, in good prose.</w:t>
-      </w:r>
-    </w:p>
-    <w:p>
-      <w:pPr>
-        <w:spacing w:before="120" w:after="120"/>
-      </w:pPr>
-      <w:r>
-        <w:t xml:space="preserve">Sometimes the fluent answer is simply wrong. A Secondary 2 student asked the window to explain his practical with magnesium ribbon in dilute acid, and the reply told him, in a confident paragraph, that the fizzing was carbon dioxide. It isn't. The gas is hydrogen, which is why the lit splint gave a squeaky pop rather than going out. He had muddled it with the marble chips practical the week before, the tool had filled the gap with an average, and the paragraph came out smooth and wrong in one detail. He had done the splint test. He simply hadn't read the answer against it.</w:t>
-      </w:r>
-    </w:p>
-    <w:p>
-      <w:pPr>
-        <w:spacing w:before="120" w:after="120"/>
-      </w:pPr>
-      <w:r>
-        <w:t xml:space="preserve">More often, the fluent answer is right in general and wrong for this bench. The window will tell you water boils at 100 degrees. The thermometer from the corner cupboard reads 99 through a rolling boil, and has for years. A student who trusts the window will quietly correct a reading she actually took. A student who trusts the bench will write </w:t>
+        <w:t xml:space="preserve">The trap here is fluency. A wrong explanation that sounds like the textbook is harder to catch than a wrong number, because the ear accepts it before the eye has checked. It is the first book's certainty arrived at too soon, in good prose. Carl Sagan's rule in </w:t>
+      </w:r>
+      <w:r>
+        <w:rPr>
+          <w:i/>
+        </w:rPr>
+        <w:t xml:space="preserve">Cosmos</w:t>
+      </w:r>
+      <w:r>
+        <w:t xml:space="preserve"> was that "Extraordinary claims require extraordinary evidence." The window's claims almost never sound extraordinary. They sound like the revision guide, which is how they get past a student with no evidence at all.</w:t>
+      </w:r>
+    </w:p>
+    <w:p>
+      <w:pPr>
+        <w:spacing w:before="120" w:after="120"/>
+      </w:pPr>
+      <w:r>
+        <w:t xml:space="preserve">Sometimes the fluent answer is wrong. A Secondary 2 student asked the window to explain his practical with magnesium ribbon in dilute acid, and the reply told him, in a confident paragraph, that the fizzing was carbon dioxide. It isn't. The gas is hydrogen, which is why the lit splint gave a squeaky pop rather than going out. He had muddled it with the marble chips practical the week before, the tool had filled the gap with an average, and the paragraph came out smooth and wrong in one detail. He had done the splint test. He hadn't read the answer against it.</w:t>
+      </w:r>
+    </w:p>
+    <w:p>
+      <w:pPr>
+        <w:spacing w:before="120" w:after="120"/>
+      </w:pPr>
+      <w:r>
+        <w:t xml:space="preserve">More often, the fluent answer is right in general and wrong for this bench, the second book's eleven-second lesson plan again, complete and correct and written for a class that didn't exist. The window will tell you water boils at 100 degrees. The thermometer from the corner cupboard reads 99 through a rolling boil, and has for years. A student who trusts the window will correct a reading she took with her own eyes. A student who trusts the bench will write </w:t>
       </w:r>
       <w:r>
         <w:rPr>
@@ -5352,7 +5620,7 @@
         <w:spacing w:before="120" w:after="120"/>
       </w:pPr>
       <w:r>
-        <w:t xml:space="preserve">The remedy is not a cleverer prompt. It is a reading you can check against. Every explanation the window offers should be laid beside something from the bench: a number, a colour, a pop, a can that stayed dry. If nothing can be laid beside it, the explanation isn't finished.</w:t>
+        <w:t xml:space="preserve">The remedy is a reading you can check against, and no prompt is clever enough to stand in for one. Every explanation the window offers should be laid beside something from the bench: a number, a colour, a pop, a can that stayed dry. If nothing can be laid beside it, the explanation isn't finished.</w:t>
       </w:r>
     </w:p>
     <w:p>
@@ -5408,7 +5676,7 @@
         <w:spacing w:before="120" w:after="120"/>
       </w:pPr>
       <w:r>
-        <w:t xml:space="preserve">Now think about where that sentence came from. Not to catch anyone out. Only to notice whether it was written by someone looking at a table or at a screen.</w:t>
+        <w:t xml:space="preserve">Now think about where that sentence came from, with no wish to catch anyone out. Was it written by someone looking at a table, or at a screen?</w:t>
       </w:r>
     </w:p>
     <w:p>
@@ -5459,7 +5727,7 @@
         <w:spacing w:before="120" w:after="120"/>
       </w:pPr>
       <w:r>
-        <w:t xml:space="preserve">The window will always have the textbook answer ready. You don't need a better tool to check it, only one sentence that says what you would have to see to change your mind.</w:t>
+        <w:t xml:space="preserve">The window will always have the textbook answer ready. Write the one sentence it cannot write for you, the one that says what would change your mind, and then go and look.</w:t>
       </w:r>
     </w:p>
     <w:p>
@@ -5515,7 +5783,7 @@
         <w:spacing w:before="120" w:after="120"/>
       </w:pPr>
       <w:r>
-        <w:t xml:space="preserve">The solution arrived in under ten seconds and it was tidy. Let the first child have 5x stickers and the second 3x. Then 5x + 3x = 72, so 8x = 72 and x = 9. The difference is 2x, which is 18. He copied every line into his exercise book in his best handwriting and drew a box around the 18.</w:t>
+        <w:t xml:space="preserve">The solution arrived in under ten seconds and it was tidy. Let the first child have 5x stickers and the second 3x. Then 5x + 3x = 72, so 8x = 72 and x = 9. The difference is 2x, which is 18. He copied every line into his exercise book in his best handwriting and drew a box around the 18, ruling each side with the edge of his eraser, the way answers were boxed on the board.</w:t>
       </w:r>
     </w:p>
     <w:p>
@@ -5545,15 +5813,30 @@
         <w:spacing w:before="120" w:after="120"/>
       </w:pPr>
       <w:r>
-        <w:t xml:space="preserve">He put his finger on the second line. 5x + 3x = 72. He could say the words. He couldn't say why they were true.</w:t>
-      </w:r>
-    </w:p>
-    <w:p>
-      <w:pPr>
-        <w:spacing w:before="120" w:after="120"/>
-      </w:pPr>
-      <w:r>
-        <w:t xml:space="preserve">That was where the lesson started. Not at the answer, and not at the first line, which he could parrot, but at the exact place where understanding stopped and copying began. She drew five boxes in a row and three underneath, and asked how many boxes there were altogether. Eight. And if eight boxes held 72 stickers, what did one box hold? He had it before she'd finished the sentence. The 96 took him forty seconds.</w:t>
+        <w:t xml:space="preserve">He put his finger on the second line. 5x + 3x = 72. </w:t>
+      </w:r>
+      <w:r>
+        <w:rPr>
+          <w:i/>
+        </w:rPr>
+        <w:t xml:space="preserve">I know it's right,</w:t>
+      </w:r>
+      <w:r>
+        <w:t xml:space="preserve"> he said. </w:t>
+      </w:r>
+      <w:r>
+        <w:rPr>
+          <w:i/>
+        </w:rPr>
+        <w:t xml:space="preserve">I just can't say why.</w:t>
+      </w:r>
+    </w:p>
+    <w:p>
+      <w:pPr>
+        <w:spacing w:before="120" w:after="120"/>
+      </w:pPr>
+      <w:r>
+        <w:t xml:space="preserve">The lesson started there, on the line where understanding stopped and copying began. She drew five boxes in a row and three underneath, in the margin beside his boxed 18, and asked how many boxes there were altogether. Eight. And if eight boxes held 72 stickers, what did one box hold? He had it before she'd finished the sentence. The 96 took him forty seconds, and he didn't bother with the box.</w:t>
       </w:r>
     </w:p>
     <w:p>
@@ -5577,15 +5860,24 @@
         <w:spacing w:before="120" w:after="120"/>
       </w:pPr>
       <w:r>
-        <w:t xml:space="preserve">In maths the method is the content. The way is the thing. An answer is only evidence that a method happened somewhere, and it doesn't say whose.</w:t>
-      </w:r>
-    </w:p>
-    <w:p>
-      <w:pPr>
-        <w:spacing w:before="120" w:after="120"/>
-      </w:pPr>
-      <w:r>
-        <w:t xml:space="preserve">That is why a copied answer is so hard to spot and so costly. It looks exactly like understanding. It is marked exactly like understanding. And it leaves the child precisely where he was.</w:t>
+        <w:t xml:space="preserve">In maths the method is the content. Paul Lockhart, in </w:t>
+      </w:r>
+      <w:r>
+        <w:rPr>
+          <w:i/>
+        </w:rPr>
+        <w:t xml:space="preserve">A Mathematician's Lament</w:t>
+      </w:r>
+      <w:r>
+        <w:t xml:space="preserve">, says it more plainly than I can: "Mathematics is the art of explanation." An answer is only evidence that a method happened somewhere, and it doesn't say whose.</w:t>
+      </w:r>
+    </w:p>
+    <w:p>
+      <w:pPr>
+        <w:spacing w:before="120" w:after="120"/>
+      </w:pPr>
+      <w:r>
+        <w:t xml:space="preserve">That is why a copied answer is so hard to spot and so costly. It looks like understanding and is marked like understanding, and it leaves the child where he was.</w:t>
       </w:r>
     </w:p>
     <w:p>
@@ -5610,6 +5902,23 @@
         <w:spacing w:before="120" w:after="120"/>
       </w:pPr>
       <w:r>
+        <w:t xml:space="preserve">George Pólya, in </w:t>
+      </w:r>
+      <w:r>
+        <w:rPr>
+          <w:i/>
+        </w:rPr>
+        <w:t xml:space="preserve">How to Solve It</w:t>
+      </w:r>
+      <w:r>
+        <w:t xml:space="preserve">, wrote the teacher's move down eighty years ago: "If you can't solve a problem, then there is an easier problem you can solve: find it." Eight boxes holding 72 stickers was the easier problem. The teaching was in finding it.</w:t>
+      </w:r>
+    </w:p>
+    <w:p>
+      <w:pPr>
+        <w:spacing w:before="120" w:after="120"/>
+      </w:pPr>
+      <w:r>
         <w:t xml:space="preserve">The second book offered the reverse prompt: don't write this for me, ask me one question at a time until I can explain it myself. In maths it takes a slightly different shape, because the argument is a sequence of steps. The maths version sounds like this: </w:t>
       </w:r>
       <w:r>
@@ -5635,31 +5944,31 @@
         <w:spacing w:before="120" w:after="120"/>
       </w:pPr>
       <w:r>
-        <w:t xml:space="preserve">Ask any chat window to solve a primary school problem sum and it will, fluently, in algebra. It has read a great deal of algebra. It introduces a letter, builds an equation and solves it. Every line will be right.</w:t>
-      </w:r>
-    </w:p>
-    <w:p>
-      <w:pPr>
-        <w:spacing w:before="120" w:after="120"/>
-      </w:pPr>
-      <w:r>
-        <w:t xml:space="preserve">Most primary schools don't teach it that way. They teach the model method, where quantities are drawn as bars and relationships as lengths. A child who has spent three years drawing a longer bar for the child with more stickers is handed a page where the bars have become x. The solution isn't wrong. It's in a language he doesn't yet speak.</w:t>
-      </w:r>
-    </w:p>
-    <w:p>
-      <w:pPr>
-        <w:spacing w:before="120" w:after="120"/>
-      </w:pPr>
-      <w:r>
-        <w:t xml:space="preserve">Here is the part that took me a long while to see. A solution the child cannot own is worse than no solution at all, because it looks like progress. A blank page tells the truth, and a parent walking past can see it. A page of copied algebra says everything is fine. The problem is now hidden, and it stays hidden until the mid-year exam, when the numbers change and the letters don't help.</w:t>
-      </w:r>
-    </w:p>
-    <w:p>
-      <w:pPr>
-        <w:spacing w:before="120" w:after="120"/>
-      </w:pPr>
-      <w:r>
-        <w:t xml:space="preserve">The fix is not to ban the tool. It is to tell it what the school does, and when to stop.</w:t>
+        <w:t xml:space="preserve">Ask any chat window to solve a primary school problem sum and it will, fluently, in algebra. It has read a great deal of algebra. It introduces a letter, builds an equation and solves it, and every line will be right.</w:t>
+      </w:r>
+    </w:p>
+    <w:p>
+      <w:pPr>
+        <w:spacing w:before="120" w:after="120"/>
+      </w:pPr>
+      <w:r>
+        <w:t xml:space="preserve">Most primary schools don't teach it that way. They teach the model method, where quantities are drawn as bars and relationships as lengths. A child who has spent three years drawing a longer bar for the child with more stickers is handed a page where the bars have become x. It is the eleven-second lesson plan from the second book all over again, correct and complete and written for a child who doesn't exist.</w:t>
+      </w:r>
+    </w:p>
+    <w:p>
+      <w:pPr>
+        <w:spacing w:before="120" w:after="120"/>
+      </w:pPr>
+      <w:r>
+        <w:t xml:space="preserve">It took me a long while to see that a solution the child cannot own is worse than no solution at all, because it looks like progress. A page of copied algebra says everything is fine, and the problem stays hidden until the mid-year exam, when the numbers change and the letters don't help. A blank page at least tells the truth.</w:t>
+      </w:r>
+    </w:p>
+    <w:p>
+      <w:pPr>
+        <w:spacing w:before="120" w:after="120"/>
+      </w:pPr>
+      <w:r>
+        <w:t xml:space="preserve">The fix is to tell the tool what the school does, and when to stop.</w:t>
       </w:r>
     </w:p>
     <w:p>
@@ -5676,15 +5985,15 @@
         <w:spacing w:before="120" w:after="120"/>
       </w:pPr>
       <w:r>
-        <w:t xml:space="preserve">The second half of that prompt matters as much as the first. The child draws the bars, the tool waits, and the next step is asked for only when the previous one has been done by a person. It's slower. Slower is the point.</w:t>
-      </w:r>
-    </w:p>
-    <w:p>
-      <w:pPr>
-        <w:spacing w:before="120" w:after="120"/>
-      </w:pPr>
-      <w:r>
-        <w:t xml:space="preserve">🔍 Takeaway: A worked solution in the wrong method isn't help. It's a fluent answer to a question the child wasn't asking.</w:t>
+        <w:t xml:space="preserve">The second half of that prompt matters as much as the first. The child draws the bars, the tool waits, and the next step is asked for only when the previous one has been done by a person. It's slower, and slower is the point.</w:t>
+      </w:r>
+    </w:p>
+    <w:p>
+      <w:pPr>
+        <w:spacing w:before="120" w:after="120"/>
+      </w:pPr>
+      <w:r>
+        <w:t xml:space="preserve">🔍 Takeaway: A worked solution in a method the child hasn't learnt is a confident answer to a question nobody at the table was asking.</w:t>
       </w:r>
     </w:p>
     <w:p>
@@ -5754,7 +6063,16 @@
         <w:spacing w:before="120" w:after="120"/>
       </w:pPr>
       <w:r>
-        <w:t xml:space="preserve">The tool described the bar in words. The daughter drew it in pencil. Only then, the next step. The evening ran twenty minutes longer than usual and ended without anyone crying.</w:t>
+        <w:t xml:space="preserve">The tool described the bar in words. The daughter drew it in pencil, and when her mother reached for the screen she put a hand over it. </w:t>
+      </w:r>
+      <w:r>
+        <w:rPr>
+          <w:i/>
+        </w:rPr>
+        <w:t xml:space="preserve">Don't press yet. I want to see if mine is right.</w:t>
+      </w:r>
+      <w:r>
+        <w:t xml:space="preserve"> Only then, the next step. The evening ran twenty minutes longer than usual and ended without anyone crying.</w:t>
       </w:r>
     </w:p>
     <w:p>
@@ -5802,7 +6120,7 @@
         <w:spacing w:before="120" w:after="120"/>
       </w:pPr>
       <w:r>
-        <w:t xml:space="preserve">🔍 Takeaway: None of these prompts asks for an answer. Each of them asks for the place where an answer would go wrong.</w:t>
+        <w:t xml:space="preserve">🔍 Takeaway: Every one of these prompts asks for the place where an answer would go wrong, and none of them asks for the answer.</w:t>
       </w:r>
     </w:p>
     <w:p>
@@ -5875,7 +6193,7 @@
         <w:spacing w:before="120" w:after="120"/>
       </w:pPr>
       <w:r>
-        <w:t xml:space="preserve">The boy with the stickers, the student with the brackets, the mother with the fractions, the teacher with her five wrong answers, and the shopkeeper's apples. In each case the first attempt asked for an answer, got one, and the answer was the least useful thing on the screen. The second attempt asked for a step, a reason, an estimate, or a mistake. It asked the tool to stop. What came back was smaller and slower, and it was the only part a person could actually use. The tool was the same tool at half past eight as at nine. What changed was what it was asked to leave undone.</w:t>
+        <w:t xml:space="preserve">The boy with the stickers, the student with the brackets, the mother with the fractions, the teacher with her five wrong answers, and the shopkeeper's apples. In each case the first attempt asked for an answer, got one, and the answer was the least useful thing on the screen. The second attempt asked for a step, a reason, an estimate, or a mistake. It asked the tool to stop. What came back was smaller and slower, and it was the only part a person could use. The tool was the same tool at half past eight as at nine. What changed was what it was asked to leave undone.</w:t>
       </w:r>
     </w:p>
     <w:p>
@@ -5899,7 +6217,7 @@
         <w:spacing w:before="120" w:after="120"/>
       </w:pPr>
       <w:r>
-        <w:t xml:space="preserve">Not a time it was wrong. A time it was right, and neat, and you moved on.</w:t>
+        <w:t xml:space="preserve">I mean a time it was right, and neat, and you moved on.</w:t>
       </w:r>
     </w:p>
     <w:p>
@@ -5931,15 +6249,15 @@
         <w:spacing w:before="120" w:after="120"/>
       </w:pPr>
       <w:r>
-        <w:t xml:space="preserve">For the next week, before looking at any worked solution, write the first step yourself. Even if it's wrong.</w:t>
-      </w:r>
-    </w:p>
-    <w:p>
-      <w:pPr>
-        <w:spacing w:before="120" w:after="120"/>
-      </w:pPr>
-      <w:r>
-        <w:t xml:space="preserve">One line in the margin, in pencil, before the tool is asked anything. A bar drawn, a unit named, a rough guess at the size of the answer. It takes fifteen seconds, and it turns the worked solution from something to copy into something to compare against.</w:t>
+        <w:t xml:space="preserve">For the next week, before looking at any worked solution, write the first step yourself, even if it's wrong.</w:t>
+      </w:r>
+    </w:p>
+    <w:p>
+      <w:pPr>
+        <w:spacing w:before="120" w:after="120"/>
+      </w:pPr>
+      <w:r>
+        <w:t xml:space="preserve">One line in the margin, in pencil, before the tool is asked anything. It might be a bar drawn, a unit named, or a rough guess at the size of the answer. It takes fifteen seconds, and it turns the worked solution from something to copy into something to compare against.</w:t>
       </w:r>
     </w:p>
     <w:p>
@@ -5955,7 +6273,7 @@
         <w:spacing w:before="120" w:after="120"/>
       </w:pPr>
       <w:r>
-        <w:t xml:space="preserve">You don't need a better tool for that. You need a smaller habit, one line long, written before the screen lights up.</w:t>
+        <w:t xml:space="preserve">Write the first step before the screen lights up, and whatever comes back will have to answer to it.</w:t>
       </w:r>
     </w:p>
     <w:p>
@@ -6002,7 +6320,7 @@
         <w:spacing w:before="120" w:after="120"/>
       </w:pPr>
       <w:r>
-        <w:t xml:space="preserve">She didn't write anything on it. She didn't ask whether he had written it himself, because she remembered the small flinch the second book described, the one that follows </w:t>
+        <w:t xml:space="preserve">She didn't write anything on it. She didn't ask whether he had written it himself, because she remembered the small flinch from the second book, the one that follows </w:t>
       </w:r>
       <w:r>
         <w:rPr>
@@ -6011,31 +6329,31 @@
         <w:t xml:space="preserve">Did you write this?</w:t>
       </w:r>
       <w:r>
-        <w:t xml:space="preserve"> Instead she called him to her desk and asked him to read it aloud to her, quietly, and to stop at any word he wouldn't say.</w:t>
-      </w:r>
-    </w:p>
-    <w:p>
-      <w:pPr>
-        <w:spacing w:before="120" w:after="120"/>
-      </w:pPr>
-      <w:r>
-        <w:t xml:space="preserve">He stopped nine times.</w:t>
-      </w:r>
-    </w:p>
-    <w:p>
-      <w:pPr>
-        <w:spacing w:before="120" w:after="120"/>
-      </w:pPr>
-      <w:r>
-        <w:t xml:space="preserve">Some were single words. Some were whole sentences he couldn't get through without slowing, the way you slow on a stair that isn't the height you expected. By the sixth stop he was almost laughing.</w:t>
-      </w:r>
-    </w:p>
-    <w:p>
-      <w:pPr>
-        <w:spacing w:before="120" w:after="120"/>
-      </w:pPr>
-      <w:r>
-        <w:t xml:space="preserve">Then she asked him what the composition was actually about, and he told her. The kitchen was small and the fan didn't work and his grandmother sang while she cut vegetables, badly, on purpose, to make him groan. That was good. That was his.</w:t>
+        <w:t xml:space="preserve">, and she had seen it on enough faces. Instead she called him to her desk and asked him to read it aloud to her, low enough that the class wouldn't hear, and to stop at any word he wouldn't say.</w:t>
+      </w:r>
+    </w:p>
+    <w:p>
+      <w:pPr>
+        <w:spacing w:before="120" w:after="120"/>
+      </w:pPr>
+      <w:r>
+        <w:t xml:space="preserve">She kept count on her fingers under the desk. He stopped nine times.</w:t>
+      </w:r>
+    </w:p>
+    <w:p>
+      <w:pPr>
+        <w:spacing w:before="120" w:after="120"/>
+      </w:pPr>
+      <w:r>
+        <w:t xml:space="preserve">Some were single words. Some were whole sentences he couldn't get through without slowing, the way you slow on a stair that isn't the height you expected. By the sixth stop he was almost laughing. "Miss, I don't even know how to say that one."</w:t>
+      </w:r>
+    </w:p>
+    <w:p>
+      <w:pPr>
+        <w:spacing w:before="120" w:after="120"/>
+      </w:pPr>
+      <w:r>
+        <w:t xml:space="preserve">Then she asked him what the composition was about, and he told her. The kitchen was small and the fan didn't work and his grandmother sang while she cut vegetables, badly, on purpose, to make him groan. That was good. That was his.</w:t>
       </w:r>
     </w:p>
     <w:p>
@@ -6051,7 +6369,7 @@
         <w:spacing w:before="120" w:after="120"/>
       </w:pPr>
       <w:r>
-        <w:t xml:space="preserve">She never did find out how much the tool had written, and she told me she didn't need to. The essay was never the point. The voice was, and by the end she could hear it.</w:t>
+        <w:t xml:space="preserve">She never did find out how much the tool had written, and she told me she didn't need to. He took the page back to his seat and read the first line over again, and she could see his lips moving.</w:t>
       </w:r>
     </w:p>
     <w:p>
@@ -6083,7 +6401,16 @@
         <w:spacing w:before="120" w:after="120"/>
       </w:pPr>
       <w:r>
-        <w:t xml:space="preserve">Three things this subject quietly asks for, whatever the paper says. Reading, which is noticing what a writer is doing. Argument, which is holding a position and knowing why. And voice, the sound of one particular person thinking on paper.</w:t>
+        <w:t xml:space="preserve">Whatever the exam paper says, this subject asks for three things. Reading, which is noticing what a writer is doing. Argument, which is holding a position and knowing why. And voice, the sound of one particular person on the page. William Zinsser put the whole subject in four words in </w:t>
+      </w:r>
+      <w:r>
+        <w:rPr>
+          <w:i/>
+        </w:rPr>
+        <w:t xml:space="preserve">Writing to Learn</w:t>
+      </w:r>
+      <w:r>
+        <w:t xml:space="preserve">: "Writing is thinking on paper." I have never found a shorter way to say what we are there to teach.</w:t>
       </w:r>
     </w:p>
     <w:p>
@@ -6126,7 +6453,7 @@
         <w:t xml:space="preserve">What does a good essay look like?</w:t>
       </w:r>
       <w:r>
-        <w:t xml:space="preserve"> And the tool has a very confident answer. It has read more essays than any of us and has a clear picture of the average good one: a hook, three points, a signposted conclusion, some adjectives along the way. Ask a class of thirty for that and you'll receive thirty of them, and not one of them will have been thinking.</w:t>
+        <w:t xml:space="preserve"> And the tool has a very confident answer. It has read more essays than any of us and has a clear picture of the average good one: a hook, three points, a signposted conclusion, some adjectives along the way. It is the essay cousin of the second book's eleven-second lesson plan, correct, complete and written for nobody. Ask a class of thirty for that and you'll receive thirty of them, and not one of them will have been thinking.</w:t>
       </w:r>
     </w:p>
     <w:p>
@@ -6174,7 +6501,7 @@
         <w:t xml:space="preserve">Don't tell me what this is about. Ask me questions about it, one at a time, and don't move on until I've answered properly.</w:t>
       </w:r>
       <w:r>
-        <w:t xml:space="preserve"> The first question was what the keeper did in the third paragraph. She had to go back and look. The fourth asked why the writer had put the storm before the letter rather than after it, and she sat with that one for a while. Fourteen questions, and by the end she could explain the passage without the screen. The tool hadn't told her anything. It had made her look.</w:t>
+        <w:t xml:space="preserve"> The first question was what the keeper did in the third paragraph. She had to go back and look. "It's making me do all the work," she said, and her father agreed that it was. The fourth question asked why the writer had put the storm before the letter rather than after it, and she sat with that one for a while. Fourteen questions, and by the end she could explain the passage without the screen. The tool had made her look.</w:t>
       </w:r>
     </w:p>
     <w:p>
@@ -6227,7 +6554,7 @@
         <w:t xml:space="preserve">A student who can name the technique but not the point.</w:t>
       </w:r>
       <w:r>
-        <w:t xml:space="preserve"> He knows the words. Simile, alliteration, juxtaposition. What he can't do is say why the writer chose them, which is the only thing the examiner is asking. </w:t>
+        <w:t xml:space="preserve"> He knows the words, simile and alliteration and juxtaposition. What he can't do is say why the writer chose them, which is the only thing the examiner is asking. </w:t>
       </w:r>
       <w:r>
         <w:rPr>
@@ -6398,15 +6725,23 @@
         <w:spacing w:before="120" w:after="120"/>
       </w:pPr>
       <w:r>
-        <w:t xml:space="preserve">The second sentence is better English by most of the measures a marker would use. It is also worse writing, and much worse for the child right now. She didn't know what to do. That is the whole feeling, and the plain sentence carries it. The polished one swaps her not knowing for solidarity, a word she would never use for a feeling she didn't have. The tool improved the sentence by removing the child from it.</w:t>
-      </w:r>
-    </w:p>
-    <w:p>
-      <w:pPr>
-        <w:spacing w:before="120" w:after="120"/>
-      </w:pPr>
-      <w:r>
-        <w:t xml:space="preserve">Polish erases voice. That isn't a side effect. It's what polish is. And this tool polishes everything towards the same place, until every child in the class sounds like the same competent adult, well read and feeling nothing in particular.</w:t>
+        <w:t xml:space="preserve">Orwell's rule from "Politics and the English Language" is the first one the tool breaks: "Never use a long word where a short one will do." Cried became inconsolable. Died became passed away, two words doing the work of one.</w:t>
+      </w:r>
+    </w:p>
+    <w:p>
+      <w:pPr>
+        <w:spacing w:before="120" w:after="120"/>
+      </w:pPr>
+      <w:r>
+        <w:t xml:space="preserve">The second sentence is better English by most of the measures a marker would use. It is also worse writing, and much worse for the child right now. She didn't know what to do, and the plain sentence carries that not knowing. The polished one swaps it for solidarity, a word she would never use for a feeling she didn't have. The tool improved the sentence by removing the child from it.</w:t>
+      </w:r>
+    </w:p>
+    <w:p>
+      <w:pPr>
+        <w:spacing w:before="120" w:after="120"/>
+      </w:pPr>
+      <w:r>
+        <w:t xml:space="preserve">Polish erases voice. That is the job polish was given. This tool polishes everything towards the same place, until every child in the class sounds like the same competent adult, well read and feeling nothing in particular.</w:t>
       </w:r>
     </w:p>
     <w:p>
@@ -6438,7 +6773,7 @@
         <w:spacing w:before="120" w:after="120"/>
       </w:pPr>
       <w:r>
-        <w:t xml:space="preserve">The boy with the tapestry, the girl with the lighthouse, the class with the bicycle poem and the child with the cat all met the same tool, and in every first attempt it was asked to supply something: words, a summary, an analysis, a better sentence. What came back was fluent and belonged to nobody. The second attempt, each time, asked for something smaller. Questions. A skeleton with the ideas missing. A finger pointing at a seam. The tool did less, and so the child had to do the part that was the point. Nobody was handed a better tool. They were handed a question that left room for a voice.</w:t>
+        <w:t xml:space="preserve">The boy with the tapestry, the girl with the lighthouse, the class with the bicycle poem and the child with the cat all met the same tool, and in every first attempt it was asked to supply something: words, a summary, an analysis, a better sentence. What came back was fluent and belonged to nobody. The second attempt, each time, asked for something smaller: questions, a skeleton with the ideas missing, a finger pointing at a seam. The tool did less, and so the child had to do the part that was the point. What changed between the two attempts was the size of the ask, and the room it left for a voice.</w:t>
       </w:r>
     </w:p>
     <w:p>
@@ -6454,7 +6789,7 @@
         <w:spacing w:before="120" w:after="120"/>
       </w:pPr>
       <w:r>
-        <w:t xml:space="preserve">Think of the last piece of student writing that was too good. Not too good to be true, necessarily. Just too smooth, every word chosen by someone with nothing in particular to say.</w:t>
+        <w:t xml:space="preserve">Think of the last piece of student writing that was too good. Too smooth, I mean, every word chosen by someone with nothing in particular to say.</w:t>
       </w:r>
     </w:p>
     <w:p>
@@ -6494,15 +6829,15 @@
         <w:spacing w:before="120" w:after="120"/>
       </w:pPr>
       <w:r>
-        <w:t xml:space="preserve">For the next week, ask every student, before handing in any piece of writing, to read the draft aloud once, quietly, and to mark every word they wouldn't say.</w:t>
-      </w:r>
-    </w:p>
-    <w:p>
-      <w:pPr>
-        <w:spacing w:before="120" w:after="120"/>
-      </w:pPr>
-      <w:r>
-        <w:t xml:space="preserve">That's the whole instruction. Not remove. Mark.</w:t>
+        <w:t xml:space="preserve">For the next week, ask every student, before handing in any piece of writing, to read the draft aloud once, under their breath, and to mark every word they wouldn't say.</w:t>
+      </w:r>
+    </w:p>
+    <w:p>
+      <w:pPr>
+        <w:spacing w:before="120" w:after="120"/>
+      </w:pPr>
+      <w:r>
+        <w:t xml:space="preserve">The instruction stops at marking. Nothing gets crossed out yet.</w:t>
       </w:r>
     </w:p>
     <w:p>
@@ -6518,7 +6853,7 @@
         <w:spacing w:before="120" w:after="120"/>
       </w:pPr>
       <w:r>
-        <w:t xml:space="preserve">You don't need a better tool to protect a voice. You need a child reading aloud, a pencil, and one small question. Whose word is this?</w:t>
+        <w:t xml:space="preserve">It takes a pencil, a low voice and one question asked of every word on the page. Whatever survives that reading is theirs, and they will know it by the sound.</w:t>
       </w:r>
     </w:p>
     <w:p>
@@ -6566,47 +6901,47 @@
         <w:t xml:space="preserve">Make me a quiz app for my class</w:t>
       </w:r>
       <w:r>
-        <w:t xml:space="preserve"> into a chat window one Sunday afternoon, mostly to see what would happen. Three minutes later she had one. Ten general knowledge questions, a countdown clock in the corner, a leaderboard with gold, silver and bronze, and a cheerful chime when you got something right.</w:t>
-      </w:r>
-    </w:p>
-    <w:p>
-      <w:pPr>
-        <w:spacing w:before="120" w:after="120"/>
-      </w:pPr>
-      <w:r>
-        <w:t xml:space="preserve">She played it through twice. It worked. Then she went looking for what she actually wanted, which was a way to see which question each child had got wrong. There wasn't one. The quiz knew who had come first. It had no idea who was confused, or about what.</w:t>
-      </w:r>
-    </w:p>
-    <w:p>
-      <w:pPr>
-        <w:spacing w:before="120" w:after="120"/>
-      </w:pPr>
-      <w:r>
-        <w:t xml:space="preserve">It was a quiz for a class that doesn't exist. The second book described a lesson plan like that, and here was the same thing with buttons.</w:t>
-      </w:r>
-    </w:p>
-    <w:p>
-      <w:pPr>
-        <w:spacing w:before="120" w:after="120"/>
-      </w:pPr>
-      <w:r>
-        <w:t xml:space="preserve">So she started again, and this time she wrote what a designer would have asked her before drawing anything. Seven pupils, she wrote, who keep mixing up two spelling patterns, the words where the vowel sound is long and the words where it's short. Five minutes at the start of the day, on the class tablets. No timer, because timers make these seven guess. No leaderboard, because these seven already know where they stand. Ten words a morning, and at the end, a plain list for her of which word each child had missed.</w:t>
-      </w:r>
-    </w:p>
-    <w:p>
-      <w:pPr>
-        <w:spacing w:before="120" w:after="120"/>
-      </w:pPr>
-      <w:r>
-        <w:t xml:space="preserve">The page that came back was plainer. No chime, no medals, a word on the screen and two choices under it. It was also hers. She used it for three weeks.</w:t>
-      </w:r>
-    </w:p>
-    <w:p>
-      <w:pPr>
-        <w:spacing w:before="120" w:after="120"/>
-      </w:pPr>
-      <w:r>
-        <w:t xml:space="preserve">🔍 Takeaway: A tool built from a vague brief is finished in three minutes and useful to nobody. The describing was the work, not the building.</w:t>
+        <w:t xml:space="preserve"> into a chat window one Sunday afternoon, with the week's spelling tests in a pile beside the laptop, mostly to see what would happen. Three minutes later she had one. Ten general knowledge questions, a countdown clock in the corner, a leaderboard with gold, silver and bronze, and a cheerful chime when you got something right.</w:t>
+      </w:r>
+    </w:p>
+    <w:p>
+      <w:pPr>
+        <w:spacing w:before="120" w:after="120"/>
+      </w:pPr>
+      <w:r>
+        <w:t xml:space="preserve">She played it through twice. It worked. Then she went looking for the thing she'd wanted, which was a way to see which question each child had got wrong. There wasn't one. The quiz knew who had come first. It had no idea who was confused, or about what.</w:t>
+      </w:r>
+    </w:p>
+    <w:p>
+      <w:pPr>
+        <w:spacing w:before="120" w:after="120"/>
+      </w:pPr>
+      <w:r>
+        <w:t xml:space="preserve">The second book told the story of a lesson plan that arrived in eleven seconds, correct, complete and written for a class that didn't exist. Here was the same thing with buttons.</w:t>
+      </w:r>
+    </w:p>
+    <w:p>
+      <w:pPr>
+        <w:spacing w:before="120" w:after="120"/>
+      </w:pPr>
+      <w:r>
+        <w:t xml:space="preserve">So she went back to the pile. Seven of the tests had the same mistake in them, the words where the vowel sound is long muddled with the words where it's short. She started again, and this time she wrote what a designer would have asked her before drawing anything. Seven pupils, she wrote, who keep mixing up two spelling patterns. Five minutes at the start of the day, on the class tablets. No timer, because timers make these seven guess. No leaderboard, because these seven already know where they stand. Ten words a morning, and at the end, a plain list for her of which word each child had missed.</w:t>
+      </w:r>
+    </w:p>
+    <w:p>
+      <w:pPr>
+        <w:spacing w:before="120" w:after="120"/>
+      </w:pPr>
+      <w:r>
+        <w:t xml:space="preserve">The page that came back was plainer. No chime, no medals, a word on the screen and two choices under it. On Monday morning she put three tablets on the back table, stood behind the chairs and watched.</w:t>
+      </w:r>
+    </w:p>
+    <w:p>
+      <w:pPr>
+        <w:spacing w:before="120" w:after="120"/>
+      </w:pPr>
+      <w:r>
+        <w:t xml:space="preserve">🔍 Takeaway: A tool built from a vague brief is finished in three minutes and useful to nobody. The work was all in the describing.</w:t>
       </w:r>
     </w:p>
     <w:p>
@@ -6622,23 +6957,23 @@
         <w:spacing w:before="120" w:after="120"/>
       </w:pPr>
       <w:r>
-        <w:t xml:space="preserve">The technology matters less than you'd think. Tools such as Claude, ChatGPT and Gemini will now build a working web page from a plain description. You type what you want, in sentences, and a page appears that can be opened on the class's devices. No code, nothing to install. The mechanism isn't where the difficulty is.</w:t>
-      </w:r>
-    </w:p>
-    <w:p>
-      <w:pPr>
-        <w:spacing w:before="120" w:after="120"/>
-      </w:pPr>
-      <w:r>
-        <w:t xml:space="preserve">The difficulty is the one the second book described for a set of slides. Before asking for slides, it said, decide who they're for, what they're for, the one message they carry, and what to leave out. A classroom tool wants the same four questions, turned slightly.</w:t>
-      </w:r>
-    </w:p>
-    <w:p>
-      <w:pPr>
-        <w:spacing w:before="120" w:after="120"/>
-      </w:pPr>
-      <w:r>
-        <w:t xml:space="preserve">Who is it for? Not "my class". Seven children, or three, or the one who finishes early. What thinking should it produce? Not what it displays, but what happens in a child's head between the screen and the tap. What must it not do? This is the question teachers skip and designers never do. And what will you look at afterwards? If the honest answer is nothing, you've asked for a toy.</w:t>
+        <w:t xml:space="preserve">The technology matters less than you'd think. Tools such as Claude, ChatGPT and Gemini will now build a working web page from a plain description. You type what you want, in sentences, and a page appears that can be opened on the class's devices. Nothing to install. The difficulty lies somewhere else.</w:t>
+      </w:r>
+    </w:p>
+    <w:p>
+      <w:pPr>
+        <w:spacing w:before="120" w:after="120"/>
+      </w:pPr>
+      <w:r>
+        <w:t xml:space="preserve">It lies where the second book found it for a set of slides. Before asking for slides, it said, decide who they're for, what they're for, the one message they carry, and what to leave out. A classroom tool wants the same four questions, turned slightly.</w:t>
+      </w:r>
+    </w:p>
+    <w:p>
+      <w:pPr>
+        <w:spacing w:before="120" w:after="120"/>
+      </w:pPr>
+      <w:r>
+        <w:t xml:space="preserve">Who is it for? Seven children, or three, or the one who finishes early, and never "my class". What thinking should it produce? Name what happens in a child's head between the screen and the tap. What must it not do? This is the question teachers skip and designers never do. What will you look at afterwards? If the honest answer is nothing, you've asked for a toy.</w:t>
       </w:r>
     </w:p>
     <w:p>
@@ -6704,7 +7039,7 @@
         <w:spacing w:before="120" w:after="120"/>
       </w:pPr>
       <w:r>
-        <w:t xml:space="preserve">One feature means one. A word, two choices, a list at the end. If you can't say what the page does in a single sentence, it does too much.</w:t>
+        <w:t xml:space="preserve">One feature means one. A word, two choices, a list at the end. Dieter Rams made it the last of his ten principles of good design: "Good design is as little design as possible." If you can't say what the page does in a single sentence, it does too much.</w:t>
       </w:r>
     </w:p>
     <w:p>
@@ -6720,15 +7055,15 @@
         <w:spacing w:before="120" w:after="120"/>
       </w:pPr>
       <w:r>
-        <w:t xml:space="preserve">One week means you've decided in advance when to stop and look. The spelling teacher kept her page for three weeks, but the first week was the test, and she was ready to throw it away at the end.</w:t>
-      </w:r>
-    </w:p>
-    <w:p>
-      <w:pPr>
-        <w:spacing w:before="120" w:after="120"/>
-      </w:pPr>
-      <w:r>
-        <w:t xml:space="preserve">And she watched rather than asked. Children asked </w:t>
+        <w:t xml:space="preserve">One week means you've decided in advance when to stop and look. The spelling teacher kept her page for three weeks, but the first week was the test, and she was ready to throw the page away at the end of it.</w:t>
+      </w:r>
+    </w:p>
+    <w:p>
+      <w:pPr>
+        <w:spacing w:before="120" w:after="120"/>
+      </w:pPr>
+      <w:r>
+        <w:t xml:space="preserve">She watched rather than asked. Children asked </w:t>
       </w:r>
       <w:r>
         <w:rPr>
@@ -6825,7 +7160,7 @@
         <w:spacing w:before="120" w:after="120"/>
       </w:pPr>
       <w:r>
-        <w:t xml:space="preserve">Predicting before seeing is where the science happens. The tool added nothing clever. It simply refused to show the answer until the thinking had been typed. He read thirty-one predictions that evening and found two misconceptions he hadn't known were in the room.</w:t>
+        <w:t xml:space="preserve">Predicting before seeing is where the science happens. The tool added nothing clever. It refused to show the answer until the thinking had been typed, and that was all. He read thirty-one predictions that evening and found two misconceptions he hadn't known were in the room.</w:t>
       </w:r>
     </w:p>
     <w:p>
@@ -6865,7 +7200,25 @@
         <w:spacing w:before="120" w:after="120"/>
       </w:pPr>
       <w:r>
-        <w:t xml:space="preserve">No score. No correction. The page lets a child hear her own writing and tap the parts that aren't hers. Deciding what to change stays with the child, and the marking stays with the teacher, which is where both belonged.</w:t>
+        <w:t xml:space="preserve">The page gives no score and makes no corrections. It lets a child hear her own writing and tap the parts that aren't hers. One girl, the first afternoon, tapped </w:t>
+      </w:r>
+      <w:r>
+        <w:rPr>
+          <w:i/>
+        </w:rPr>
+        <w:t xml:space="preserve">furthermore</w:t>
+      </w:r>
+      <w:r>
+        <w:t xml:space="preserve"> and said, </w:t>
+      </w:r>
+      <w:r>
+        <w:rPr>
+          <w:i/>
+        </w:rPr>
+        <w:t xml:space="preserve">I don't even know what that means, I just put it.</w:t>
+      </w:r>
+      <w:r>
+        <w:t xml:space="preserve"> Deciding what to change stays with the child, and the marking stays with the teacher.</w:t>
       </w:r>
     </w:p>
     <w:p>
@@ -6889,15 +7242,15 @@
         <w:spacing w:before="120" w:after="120"/>
       </w:pPr>
       <w:r>
-        <w:t xml:space="preserve">Watch, don't ask. The tool built exactly what was described and nothing that wasn't, so the test isn't of the tool. It's of the description.</w:t>
-      </w:r>
-    </w:p>
-    <w:p>
-      <w:pPr>
-        <w:spacing w:before="120" w:after="120"/>
-      </w:pPr>
-      <w:r>
-        <w:t xml:space="preserve">Day one, the spelling page did what it said. Day two, she noticed two things. One boy was tapping through in under a minute, choosing before the word had finished appearing, and scoring six out of ten, which is roughly what guessing gets you. And the page's voice, which read each word aloud, said one of the long-vowel words in a way none of the children had ever heard. Two of them copied it.</w:t>
+        <w:t xml:space="preserve">Watch, don't ask. The tool built what was described and nothing that wasn't, so the week tests the description rather than the page.</w:t>
+      </w:r>
+    </w:p>
+    <w:p>
+      <w:pPr>
+        <w:spacing w:before="120" w:after="120"/>
+      </w:pPr>
+      <w:r>
+        <w:t xml:space="preserve">Day one, the spelling page did what it said. Day two, she noticed two things. One boy was tapping through in under a minute, choosing before the word had finished appearing, and scoring six out of ten, which is roughly what guessing gets you. The page's voice, which read each word aloud, said one of the long-vowel words in a way none of the children had ever heard. Two of them copied it.</w:t>
       </w:r>
     </w:p>
     <w:p>
@@ -6914,7 +7267,16 @@
         <w:t xml:space="preserve">Why isn't he reading properly?</w:t>
       </w:r>
       <w:r>
-        <w:t xml:space="preserve"> The lunch tray from the first book is the reminder here. Nobody lectured the child about fruit. They moved the fruit. So she changed the condition, not the child, and asked the tool to hold back the two choices until the word had been on screen for three seconds. The boy's score went to nine, then ten, and by the fourth day he was bored, which told her something too. The oddly spoken word she removed from the list and made a note to say it herself.</w:t>
+        <w:t xml:space="preserve"> The lunch tray from the first book is the reminder here. Nobody lectured the child about fruit. They moved the fruit. So she changed the page instead of the boy, and asked the tool to hold back the two choices until the word had been on screen for three seconds. His score went to nine, then ten. By the fourth day he had his chin on his hand. </w:t>
+      </w:r>
+      <w:r>
+        <w:rPr>
+          <w:i/>
+        </w:rPr>
+        <w:t xml:space="preserve">Miss, can it give me the hard ones?</w:t>
+      </w:r>
+      <w:r>
+        <w:t xml:space="preserve"> That told her something too. The oddly spoken word she removed from the list and made a note to say it herself.</w:t>
       </w:r>
     </w:p>
     <w:p>
@@ -6938,7 +7300,24 @@
         <w:spacing w:before="120" w:after="120"/>
       </w:pPr>
       <w:r>
-        <w:t xml:space="preserve">The trap is the app that works and teaches nothing. It loads, it runs, the children like it, and at the end of the week nobody thinks any better than they did at the start. A tool-built tool inherits every gap in the brief, and a brief that never mentioned thinking produces a page that never asks for any.</w:t>
+        <w:t xml:space="preserve">The trap is the app that works and teaches nothing. It loads, it runs, the children like it, and at the end of the week nobody thinks any better than they did at the start. A page inherits every gap in its brief, and a brief that never mentioned thinking produces a page that never asks for any. A tool that works is not the same as a tool that teaches, and the children will not tell you the difference.</w:t>
+      </w:r>
+    </w:p>
+    <w:p>
+      <w:pPr>
+        <w:spacing w:before="120" w:after="120"/>
+      </w:pPr>
+      <w:r>
+        <w:t xml:space="preserve">Seymour Papert saw this coming in </w:t>
+      </w:r>
+      <w:r>
+        <w:rPr>
+          <w:i/>
+        </w:rPr>
+        <w:t xml:space="preserve">Mindstorms</w:t>
+      </w:r>
+      <w:r>
+        <w:t xml:space="preserve">, in 1980, before most schools had a computer to argue about. He wanted classrooms where "the child programs the computer", and he warned against the ones where "the computer is being used to program the child". A quiz that hands out green ticks is the second kind, however friendly the chime. A page that waits for a prediction is a small step towards the first.</w:t>
       </w:r>
     </w:p>
     <w:p>
@@ -6970,7 +7349,7 @@
         <w:spacing w:before="120" w:after="120"/>
       </w:pPr>
       <w:r>
-        <w:t xml:space="preserve">The spelling teacher, the maths teacher, the science teacher and the English teacher all made the same first move. They asked for a thing and got a thing, polished and general and built for nobody. Then each of them stopped describing the thing and started describing the thinking: the step before the next bar, the prediction before the reveal, the word a child would never say out loud. The pages that came back were plainer, slower and usable. Nothing about the tool had changed between the two attempts. The brief had.</w:t>
+        <w:t xml:space="preserve">The spelling teacher, the maths teacher, the science teacher and the English teacher all made the same first move. They asked for a thing and got a thing, polished and built for nobody. Then each of them stopped describing the thing and started describing the thinking: the step before the next bar, the prediction before the reveal, the word a child would never say out loud. The pages that came back were plainer and slower, and they got used. Between the first attempt and the second, the only thing anyone rewrote was the brief.</w:t>
       </w:r>
     </w:p>
     <w:p>
@@ -7034,22 +7413,22 @@
         <w:spacing w:before="120" w:after="120"/>
       </w:pPr>
       <w:r>
-        <w:t xml:space="preserve">Not </w:t>
-      </w:r>
-      <w:r>
-        <w:rPr>
-          <w:i/>
-        </w:rPr>
-        <w:t xml:space="preserve">It was fun.</w:t>
-      </w:r>
-      <w:r>
-        <w:t xml:space="preserve"> Something like </w:t>
-      </w:r>
-      <w:r>
-        <w:rPr>
-          <w:i/>
-        </w:rPr>
-        <w:t xml:space="preserve">I had to say what I thought before it told me.</w:t>
+        <w:rPr>
+          <w:i/>
+        </w:rPr>
+        <w:t xml:space="preserve">It was fun</w:t>
+      </w:r>
+      <w:r>
+        <w:t xml:space="preserve"> doesn't count. Something like </w:t>
+      </w:r>
+      <w:r>
+        <w:rPr>
+          <w:i/>
+        </w:rPr>
+        <w:t xml:space="preserve">I had to say what I thought before it told me</w:t>
+      </w:r>
+      <w:r>
+        <w:t xml:space="preserve"> does.</w:t>
       </w:r>
     </w:p>
     <w:p>
@@ -7073,7 +7452,7 @@
         <w:spacing w:before="120" w:after="120"/>
       </w:pPr>
       <w:r>
-        <w:t xml:space="preserve">A better tool won't help with this. One sentence, from a child, before the window opens, will.</w:t>
+        <w:t xml:space="preserve">Get the child's sentence first. Everything the window builds after that is carpentry.</w:t>
       </w:r>
     </w:p>
     <w:p>
@@ -7121,7 +7500,7 @@
         <w:t xml:space="preserve">AI Policy</w:t>
       </w:r>
       <w:r>
-        <w:t xml:space="preserve">. Underneath, in smaller letters, was the question everyone had actually come to answer: </w:t>
+        <w:t xml:space="preserve">. Underneath, in smaller letters, was the question everyone had come to answer: </w:t>
       </w:r>
       <w:r>
         <w:rPr>
@@ -7135,23 +7514,23 @@
         <w:spacing w:before="120" w:after="120"/>
       </w:pPr>
       <w:r>
-        <w:t xml:space="preserve">It was a loud question, and it had already decided what mattered. Somebody mentioned a detection tool. You paste the essay in and it gives you a percentage. There was a feeling of relief, the kind you get when a hard problem turns out to have a product attached.</w:t>
-      </w:r>
-    </w:p>
-    <w:p>
-      <w:pPr>
-        <w:spacing w:before="120" w:after="120"/>
-      </w:pPr>
-      <w:r>
-        <w:t xml:space="preserve">A week later the tool flagged an essay by a girl in Secondary 3, the most diligent student in the year by the agreement of everyone who taught her. She had written it by hand first, in a lined exercise book, and typed it up afterwards. The percentage on the screen said eighty-one.</w:t>
-      </w:r>
-    </w:p>
-    <w:p>
-      <w:pPr>
-        <w:spacing w:before="120" w:after="120"/>
-      </w:pPr>
-      <w:r>
-        <w:t xml:space="preserve">The conversation that followed was short, and it was the wrong conversation. She cried. Her form teacher heard herself say </w:t>
+        <w:t xml:space="preserve">It was a loud question, and it had already decided what mattered. Somebody mentioned a detection tool. You paste the essay in and it gives you a percentage. There was a feeling of relief in the room, the kind you get when a hard problem turns out to have a product attached.</w:t>
+      </w:r>
+    </w:p>
+    <w:p>
+      <w:pPr>
+        <w:spacing w:before="120" w:after="120"/>
+      </w:pPr>
+      <w:r>
+        <w:t xml:space="preserve">A week later the tool flagged an essay by a girl in Secondary 3, the most diligent student in the year by the agreement of everyone who taught her. She had written it by hand first, in a lined exercise book, each paragraph dated in the top corner the way she had been taught in Primary 4, and typed it up afterwards. The percentage on the screen said eighty-one.</w:t>
+      </w:r>
+    </w:p>
+    <w:p>
+      <w:pPr>
+        <w:spacing w:before="120" w:after="120"/>
+      </w:pPr>
+      <w:r>
+        <w:t xml:space="preserve">The conversation that followed was short, and it was the wrong conversation. Her form teacher heard herself say </w:t>
       </w:r>
       <w:r>
         <w:rPr>
@@ -7160,7 +7539,16 @@
         <w:t xml:space="preserve">I have to ask</w:t>
       </w:r>
       <w:r>
-        <w:t xml:space="preserve"> and heard how thin it sounded. The exercise book was produced. The accusation was withdrawn. Nothing was restored. A student who had trusted the school now checked her sentences for sounding too good. A teacher had spent her credibility on a guess. And the actual copying, wherever it was happening, had not been touched.</w:t>
+        <w:t xml:space="preserve"> and heard how thin it sounded. The girl cried. </w:t>
+      </w:r>
+      <w:r>
+        <w:rPr>
+          <w:i/>
+        </w:rPr>
+        <w:t xml:space="preserve">But I wrote it first. It's in my book.</w:t>
+      </w:r>
+      <w:r>
+        <w:t xml:space="preserve"> The exercise book was produced, dates and all. The accusation was withdrawn. Nothing was restored. A student who had trusted the school now checked her sentences for sounding too good. A teacher had spent her credibility on a guess. The copying, wherever it was happening, had not been touched.</w:t>
       </w:r>
     </w:p>
     <w:p>
@@ -7182,7 +7570,7 @@
         <w:spacing w:before="120" w:after="120"/>
       </w:pPr>
       <w:r>
-        <w:t xml:space="preserve">The meeting changed shape. People stopped talking about catching and started talking about what an understood essay looks like from the outside. Nobody had a product for that, and it turned out they didn't need one.</w:t>
+        <w:t xml:space="preserve">The meeting changed shape. People stopped talking about catching and started talking about what an understood essay looks like from the outside. The form teacher, who had not spoken either, took a lined exercise book out of her bag and set it in the middle of the table, open at a page with a date in the corner.</w:t>
       </w:r>
     </w:p>
     <w:p>
@@ -7224,7 +7612,16 @@
         <w:spacing w:before="120" w:after="120"/>
       </w:pPr>
       <w:r>
-        <w:t xml:space="preserve">A detection tool is a guess dressed as a verdict. It estimates how much a piece of text resembles what a fluent tool tends to produce, and diligent, plainly written prose resembles that quite a lot. The second book warned about certainty arrived at too soon, and it was talking to people typing into a window. The warning applies just as sharply to a teacher reading a percentage. The number is confident. Confidence is not evidence.</w:t>
+        <w:t xml:space="preserve">A detection tool is a guess dressed as a verdict. It estimates how much a piece of text resembles what a fluent tool tends to produce, and diligent, plainly written prose resembles that a great deal. The second book warned about certainty arrived at too soon, and it was talking to people typing into a window. The warning applies just as sharply to a teacher reading a percentage. The number feels certain, and Daniel Kahneman explained in </w:t>
+      </w:r>
+      <w:r>
+        <w:rPr>
+          <w:i/>
+        </w:rPr>
+        <w:t xml:space="preserve">Thinking, Fast and Slow</w:t>
+      </w:r>
+      <w:r>
+        <w:t xml:space="preserve"> where that feeling comes from: "Confidence is a feeling, which reflects the coherence of the information and the cognitive ease of processing it." Nothing is easier to process than a single number on a screen. Confidence is not evidence.</w:t>
       </w:r>
     </w:p>
     <w:p>
@@ -7241,7 +7638,7 @@
         <w:t xml:space="preserve">What conditions might be shaping this behaviour?</w:t>
       </w:r>
       <w:r>
-        <w:t xml:space="preserve"> Ask it of a class where outsourcing is common and the answers are not mysterious. A task that takes six hours, due on the same night as two others. Tuition until nine. A topic nobody has been given a reason to care about. Marks for the product only. Under those conditions, handing the work to a tool is not a moral failure. It is the easiest available choice, and the lunch tray from the first book applies. Move the fruit.</w:t>
+        <w:t xml:space="preserve"> Ask it of a class where outsourcing is common and the answers are not mysterious. A task that takes six hours, due on the same night as two others. Tuition until nine. A topic nobody has been given a reason to care about. Marks for the product only. Under those conditions, handing the work to a tool is the easiest available choice, and calling it a moral failure changes nothing about the conditions. The lunch tray from the first book applies. Move the fruit.</w:t>
       </w:r>
     </w:p>
     <w:p>
@@ -7257,7 +7654,7 @@
         <w:spacing w:before="120" w:after="120"/>
       </w:pPr>
       <w:r>
-        <w:t xml:space="preserve">If the essay can be produced in the time it takes to read the title, the essay no longer tells you what a student knows. Something has to take its place, and the useful candidates are small. The question a student asked. The check they did on the answer. Two minutes of conversation about the work. The first attempt, crossings-out and all, handed in beside the final one. None of these can be produced in nine seconds, and every one shows thinking in a way a clean draft never did.</w:t>
+        <w:t xml:space="preserve">If the essay can be produced in the time it takes to read the title, the essay no longer tells you what a student knows. Something has to take its place, and the useful candidates are small: the question a student asked, the check they did on the answer, two minutes of conversation about the work, the first attempt handed in beside the final one with the crossings-out still on it. None of these can be produced in nine seconds, and every one shows thinking in a way a clean draft never did.</w:t>
       </w:r>
     </w:p>
     <w:p>
@@ -7321,7 +7718,7 @@
         <w:t xml:space="preserve">Why this example? What did you cut? Which sentence are you least sure of?</w:t>
       </w:r>
       <w:r>
-        <w:t xml:space="preserve"> In the first week she learnt three things. The students who had done the thinking answered in seconds and were slightly offended by how easy it was. Those who had outsourced it could not, and mostly knew it before they reached the desk. And nobody had to be accused of anything. The conversation did the sorting, and did it kindly.</w:t>
+        <w:t xml:space="preserve"> In the first week she learnt three things. The students who had done the thinking answered in seconds and were slightly offended by how easy it was. Those who had outsourced it could not, and mostly knew it before they reached the desk. Nobody had to be accused of anything. The conversation did the sorting, and did it kindly.</w:t>
       </w:r>
     </w:p>
     <w:p>
@@ -7345,7 +7742,7 @@
         <w:spacing w:before="120" w:after="120"/>
       </w:pPr>
       <w:r>
-        <w:t xml:space="preserve">The second book described disclosure as a small flinch. </w:t>
+        <w:t xml:space="preserve">The second book described disclosure as a small flinch: </w:t>
       </w:r>
       <w:r>
         <w:rPr>
@@ -7354,7 +7751,7 @@
         <w:t xml:space="preserve">Did you write this?</w:t>
       </w:r>
       <w:r>
-        <w:t xml:space="preserve"> And the half-second before the answer. That flinch is not the mark of a dishonest person. It is what happens when honesty is a rule to be caught breaking rather than a question that is normal to answer. A rule sorts. A question opens.</w:t>
+        <w:t xml:space="preserve"> and the half-second before the answer. The flinch is what happens when honesty is a rule to be caught breaking rather than a question that is normal to answer. A rule sorts. A question opens. Emerson's line from earlier in this book, from his essay "Education", bears repeating here: "The secret of education lies in respecting the pupil." A question put to a student assumes there is an answer worth waiting for.</w:t>
       </w:r>
     </w:p>
     <w:p>
@@ -7386,7 +7783,7 @@
         <w:t xml:space="preserve">nothing</w:t>
       </w:r>
       <w:r>
-        <w:t xml:space="preserve"> to all three has told you something too, and it isn't a crime. It's a starting point.</w:t>
+        <w:t xml:space="preserve"> to all three has told you something too, and you can start from there. Nobody flinches at a question they have been asked every week.</w:t>
       </w:r>
     </w:p>
     <w:p>
@@ -7471,7 +7868,7 @@
         <w:t xml:space="preserve">I used AI to help me.</w:t>
       </w:r>
       <w:r>
-        <w:t xml:space="preserve"> True and empty. He tries again.</w:t>
+        <w:t xml:space="preserve"> It was true and empty, and he tried again.</w:t>
       </w:r>
     </w:p>
     <w:p>
@@ -7544,15 +7941,15 @@
         <w:spacing w:before="120" w:after="120"/>
       </w:pPr>
       <w:r>
-        <w:t xml:space="preserve">The trap is that policing replaces teaching. It happens gradually and it feels responsible. A detector here, a ban there, a new rule about phones. Each step is defensible, and the sum is a school where the exam hall is the only room in which honesty is possible, because it is the only room where nobody has to be trusted.</w:t>
-      </w:r>
-    </w:p>
-    <w:p>
-      <w:pPr>
-        <w:spacing w:before="120" w:after="120"/>
-      </w:pPr>
-      <w:r>
-        <w:t xml:space="preserve">Watch who does well under those conditions. Not the students who think best. The students who hide best. The first book's narrowing question returns in a new coat: not </w:t>
+        <w:t xml:space="preserve">The trap is that policing replaces teaching. It happens gradually and it feels responsible. A detector arrives one term, a ban the next, then a new rule about phones. Each step is defensible, and the sum is a school where the exam hall is the only room in which honesty is possible, because it is the only room where nobody has to be trusted.</w:t>
+      </w:r>
+    </w:p>
+    <w:p>
+      <w:pPr>
+        <w:spacing w:before="120" w:after="120"/>
+      </w:pPr>
+      <w:r>
+        <w:t xml:space="preserve">Watch who does well under those conditions. The students who hide best do better than the students who think best. The first book's narrowing question, </w:t>
       </w:r>
       <w:r>
         <w:rPr>
@@ -7561,7 +7958,7 @@
         <w:t xml:space="preserve">What does the teacher want?</w:t>
       </w:r>
       <w:r>
-        <w:t xml:space="preserve"> but </w:t>
+        <w:t xml:space="preserve">, returns in a new coat as </w:t>
       </w:r>
       <w:r>
         <w:rPr>
@@ -7575,15 +7972,15 @@
         <w:spacing w:before="120" w:after="120"/>
       </w:pPr>
       <w:r>
-        <w:t xml:space="preserve">The remedy is not a better detector. No percentage would have spared the girl in Secondary 3, because the problem was never the accuracy of the number. It was that a number had been asked to do a teacher's job. What stays on the human side stays there: choosing what counts as evidence, weighing what a student says at the desk, deciding what to do, and owning that decision afterwards.</w:t>
-      </w:r>
-    </w:p>
-    <w:p>
-      <w:pPr>
-        <w:spacing w:before="120" w:after="120"/>
-      </w:pPr>
-      <w:r>
-        <w:t xml:space="preserve">🔍 Takeaway: A school that can only trust an exam hall has taught its students exactly where honesty is required and where it isn't.</w:t>
+        <w:t xml:space="preserve">No percentage would have spared the girl in Secondary 3, because the accuracy of the number was never the problem. What stays on the human side stays there: choosing what counts as evidence, weighing what a student says at the desk, deciding what to do, and owning that decision afterwards. A number had been asked to do a teacher's job.</w:t>
+      </w:r>
+    </w:p>
+    <w:p>
+      <w:pPr>
+        <w:spacing w:before="120" w:after="120"/>
+      </w:pPr>
+      <w:r>
+        <w:t xml:space="preserve">🔍 Takeaway: A school that can only trust an exam hall has taught its students where honesty is required and where it is optional.</w:t>
       </w:r>
     </w:p>
     <w:p>
@@ -7599,7 +7996,7 @@
         <w:spacing w:before="120" w:after="120"/>
       </w:pPr>
       <w:r>
-        <w:t xml:space="preserve">Look at the meeting, the history teacher, the oral checks, the class agreement and the science teacher who went first. In each case the first move reached for control: a detector, a ban, a trick question. Each got what it asked for, which was a way of catching people, and none of them found out whether anyone had understood anything. The second move asked a smaller question of the student, and of the school itself, and waited for a real answer. The tools in those classrooms were unchanged. What changed was what the adults decided to look at.</w:t>
+        <w:t xml:space="preserve">Look at the meeting, the history teacher, the oral checks, the class agreement and the science teacher who went first. In each case the first move reached for control: a detector, a ban, a trick question. Each got what it asked for, which was a way of catching people, and none of them found out whether anyone had understood anything. The second move asked a smaller question of the student, and of the school itself, and waited for a real answer. The detector is still installed on a laptop in that staff room. Nobody has opened it since.</w:t>
       </w:r>
     </w:p>
     <w:p>
@@ -7615,7 +8012,7 @@
         <w:spacing w:before="120" w:after="120"/>
       </w:pPr>
       <w:r>
-        <w:t xml:space="preserve">Think of the last time you suspected a piece of student work. Not the last time you were sure. The last time you had a feeling, and the feeling arrived before the evidence did.</w:t>
+        <w:t xml:space="preserve">Think of the last time you suspected a piece of student work, before you were sure of anything, when the feeling arrived ahead of the evidence.</w:t>
       </w:r>
     </w:p>
     <w:p>
@@ -7631,7 +8028,7 @@
         <w:spacing w:before="120" w:after="120"/>
       </w:pPr>
       <w:r>
-        <w:t xml:space="preserve">And what conditions had the task set up? How long was it, when was it due, and what was the mark for?</w:t>
+        <w:t xml:space="preserve">What conditions had the task set up? How long was it, when was it due, and what was the mark for?</w:t>
       </w:r>
     </w:p>
     <w:p>
@@ -7671,7 +8068,7 @@
         <w:spacing w:before="120" w:after="120"/>
       </w:pPr>
       <w:r>
-        <w:t xml:space="preserve">Then read the answers before you read the work. Not after. Before. It takes about eleven seconds per student, and it changes what you're looking for on the page.</w:t>
+        <w:t xml:space="preserve">Then read the answers before you read the work, in that order. It takes about eleven seconds per student, roughly what the second book's perfect and useless lesson plan took to arrive, and it changes what you're looking for on the page.</w:t>
       </w:r>
     </w:p>
     <w:p>
@@ -7687,7 +8084,7 @@
         <w:spacing w:before="120" w:after="120"/>
       </w:pPr>
       <w:r>
-        <w:t xml:space="preserve">You don't need a better detector. You need one more line on the page, and the habit of reading it first.</w:t>
+        <w:t xml:space="preserve">One extra line, read before the work, and the page starts telling you what the percentage never could.</w:t>
       </w:r>
     </w:p>
     <w:p>
@@ -7734,15 +8131,15 @@
         <w:spacing w:before="120" w:after="120"/>
       </w:pPr>
       <w:r>
-        <w:t xml:space="preserve">She teaches English to Secondary 3, and over one year she had rebuilt the way she worked. She redesigned her tasks so that the thinking had to happen in the room, in front of her, where a window couldn't do it for anyone. She taught her class to check: to ask who was saying this, to ask for the case against, to read a summary against the thing it claimed to summarise. She ended lessons with their questions instead of her answers. And she told them, plainly, when the tool had helped her plan and what she'd thrown out. If there is a version of this book that lives inside one classroom, it was hers.</w:t>
-      </w:r>
-    </w:p>
-    <w:p>
-      <w:pPr>
-        <w:spacing w:before="120" w:after="120"/>
-      </w:pPr>
-      <w:r>
-        <w:t xml:space="preserve">One Wednesday, after the last bell, a boy stayed behind. He was the sort of student who is easy to lose track of: never late, never loud, marks somewhere in the middle. He put his bag on a chair, took it off again, and then asked, quietly, </w:t>
+        <w:t xml:space="preserve">She teaches English to Secondary 3, and over one year she had rebuilt the way she worked. She redesigned her tasks so that the thinking had to happen in the room, in front of her, where a window couldn't do it for anyone. She taught her class to check: to ask who was saying this, to ask for the case against, to read a summary against the thing it claimed to summarise. She ended lessons with their questions instead of her answers. She told them, plainly, when the tool had helped her plan and what she'd thrown out. If there is a version of this book that lives inside one classroom, it was hers.</w:t>
+      </w:r>
+    </w:p>
+    <w:p>
+      <w:pPr>
+        <w:spacing w:before="120" w:after="120"/>
+      </w:pPr>
+      <w:r>
+        <w:t xml:space="preserve">One Wednesday, after the last bell, a boy stayed behind. He was the sort of student who is easy to lose track of: never late, never loud, marks somewhere in the middle. He put his bag on a chair, took it off again, and stood there holding it by one strap. Then he asked, quietly, </w:t>
       </w:r>
       <w:r>
         <w:rPr>
@@ -7756,7 +8153,7 @@
         <w:spacing w:before="120" w:after="120"/>
       </w:pPr>
       <w:r>
-        <w:t xml:space="preserve">She told me later that her first thought was that no window on earth had that answer. Not because the question was too hard, but because it wasn't a question about English. It was a question about him, asked to her, and the asking was most of it.</w:t>
+        <w:t xml:space="preserve">She told me later that her first thought was that no window on earth had that answer. The question was about him, he had asked it to her, and the asking was most of it.</w:t>
       </w:r>
     </w:p>
     <w:p>
@@ -7773,15 +8170,15 @@
         <w:t xml:space="preserve">Yes. I do. And I think you've been waiting a while to ask me that.</w:t>
       </w:r>
       <w:r>
-        <w:t xml:space="preserve"> He nodded. They talked for ten minutes about a paragraph he'd written in March that she still remembered, and he left.</w:t>
-      </w:r>
-    </w:p>
-    <w:p>
-      <w:pPr>
-        <w:spacing w:before="120" w:after="120"/>
-      </w:pPr>
-      <w:r>
-        <w:t xml:space="preserve">That evening she opened the tool, not for a lesson and not for marking. She typed a prompt for herself.</w:t>
+        <w:t xml:space="preserve"> He nodded. They talked for ten minutes about a paragraph he'd written in March, about his grandfather's provision shop, which she still remembered. He left with the bag over both shoulders.</w:t>
+      </w:r>
+    </w:p>
+    <w:p>
+      <w:pPr>
+        <w:spacing w:before="120" w:after="120"/>
+      </w:pPr>
+      <w:r>
+        <w:t xml:space="preserve">That evening she opened the tool, for neither a lesson nor marking. She typed a prompt for herself.</w:t>
       </w:r>
     </w:p>
     <w:p>
@@ -7812,15 +8209,7 @@
         <w:spacing w:before="120" w:after="120"/>
       </w:pPr>
       <w:r>
-        <w:t xml:space="preserve">She sat with that for a while. She had noticed a great deal. She had a year of small observations about this boy and had spoken almost none of them, because the marks were fine and the class was large and there was always someone louder. The tool had not told her anything. It had asked her the thing she'd been walking past.</w:t>
-      </w:r>
-    </w:p>
-    <w:p>
-      <w:pPr>
-        <w:spacing w:before="120" w:after="120"/>
-      </w:pPr>
-      <w:r>
-        <w:t xml:space="preserve">Between the boy's question and hers, nothing about the tool changed. What changed was who the question was for.</w:t>
+        <w:t xml:space="preserve">She sat with that for a while. She had a year of small observations about this boy and had spoken almost none of them, because the marks were fine and the class was large and there was always someone louder. She closed the window, found the March paragraph in the folder she keeps, wrote three of the things she had noticed on a slip of paper, and clipped it to the front for Thursday.</w:t>
       </w:r>
     </w:p>
     <w:p>
@@ -7860,23 +8249,23 @@
         <w:spacing w:before="120" w:after="120"/>
       </w:pPr>
       <w:r>
-        <w:t xml:space="preserve">But they were not the point. The point was attention.</w:t>
-      </w:r>
-    </w:p>
-    <w:p>
-      <w:pPr>
-        <w:spacing w:before="120" w:after="120"/>
-      </w:pPr>
-      <w:r>
-        <w:t xml:space="preserve">In the first book I said that better questions aren't about influence, they're about attention. That line has carried through all three books, and I've come to think it's the only line that had to. In a staff room it meant noticing the child instead of the behaviour. In a chat window it meant noticing what you assumed before you typed it. In a classroom where every student has an answer key, it means noticing what a child is actually doing with the answer, and what he is not doing, and what he might be about to ask if you leave a little room.</w:t>
-      </w:r>
-    </w:p>
-    <w:p>
-      <w:pPr>
-        <w:spacing w:before="120" w:after="120"/>
-      </w:pPr>
-      <w:r>
-        <w:t xml:space="preserve">The tool can't do this for you, not because it is stupid, but because attention is not a task. It's a way of being in a room with someone. Nothing that answers in eleven seconds is in the room.</w:t>
+        <w:t xml:space="preserve">The point, in all three books, was attention.</w:t>
+      </w:r>
+    </w:p>
+    <w:p>
+      <w:pPr>
+        <w:spacing w:before="120" w:after="120"/>
+      </w:pPr>
+      <w:r>
+        <w:t xml:space="preserve">In the first book I said that better questions aren't about influence, they're about attention. That line has carried through all three, and I've come to think it's the only line that had to. In a staff room it meant noticing the child instead of the behaviour. In a chat window it meant noticing what you assumed before you typed it. In a classroom where every student has an answer key, it means noticing what a child is doing with the answer, and what he is not doing, and what he might be about to ask if you leave a little room.</w:t>
+      </w:r>
+    </w:p>
+    <w:p>
+      <w:pPr>
+        <w:spacing w:before="120" w:after="120"/>
+      </w:pPr>
+      <w:r>
+        <w:t xml:space="preserve">The tool can't do this for you. Attention is not a task, so there is nothing to hand over. It's a way of being in a room with someone. Nothing that answers in eleven seconds is in the room.</w:t>
       </w:r>
     </w:p>
     <w:p>
@@ -7892,7 +8281,7 @@
         <w:spacing w:before="120" w:after="120"/>
       </w:pPr>
       <w:r>
-        <w:t xml:space="preserve">So what is actually left for a teacher? Quite a lot, and none of it is small.</w:t>
+        <w:t xml:space="preserve">So what is left for a teacher? A great deal, and none of it is small.</w:t>
       </w:r>
     </w:p>
     <w:p>
@@ -7906,7 +8295,7 @@
         <w:t xml:space="preserve">Choosing what a lesson is about.</w:t>
       </w:r>
       <w:r>
-        <w:t xml:space="preserve"> Before anything is planned or typed, a person decides what this hour is for. Not the topic, which the syllabus gives you, but the thing underneath: whether this week is for confidence or for rigour, whether that quiet boy needs to be stretched or steadied. The tool will plan faithfully for whatever you decide. It can't decide, because it doesn't know your class until you describe it, and even then it only knows the description.</w:t>
+        <w:t xml:space="preserve"> Before anything is planned or typed, a person decides what this hour is for. The syllabus gives you the topic. The thing underneath is yours: whether this week is for confidence or for rigour, whether that quiet boy needs to be stretched or steadied. The tool will plan faithfully for whatever you decide. It can't decide, because it doesn't know your class until you describe it, and even then it only knows the description.</w:t>
       </w:r>
     </w:p>
     <w:p>
@@ -7948,15 +8337,24 @@
         <w:t xml:space="preserve">Owning the result.</w:t>
       </w:r>
       <w:r>
-        <w:t xml:space="preserve"> Whatever reaches a child carries your name. If the feedback lands well, that was your judgement. If a task turned out to be one a window could finish in a minute, that was your judgement too. The tool didn't add this weight. It just made it easier to set down without noticing.</w:t>
-      </w:r>
-    </w:p>
-    <w:p>
-      <w:pPr>
-        <w:spacing w:before="120" w:after="120"/>
-      </w:pPr>
-      <w:r>
-        <w:t xml:space="preserve">The same four things belong to a student, only smaller and closer to hand. Choosing what the question is really about, before pasting it in. Weighing whether the answer that came back is one she could defend out loud to the person sitting next to her. Deciding what to do with it, which includes deciding not to use it. And putting her own name on the result, whatever helped. Every chapter of this book has been an argument that those four can be taught, in small repeated moments, the same way anything is taught. I still believe it, and I've watched it happen.</w:t>
+        <w:t xml:space="preserve"> Whatever reaches a child carries your name. Parker Palmer put the whole of it in four words in </w:t>
+      </w:r>
+      <w:r>
+        <w:rPr>
+          <w:i/>
+        </w:rPr>
+        <w:t xml:space="preserve">The Courage to Teach</w:t>
+      </w:r>
+      <w:r>
+        <w:t xml:space="preserve">: "We teach who we are." If the feedback lands well, that was your judgement. If a task turned out to be one a window could finish in a minute, that was your judgement too. The tool didn't add this weight. It only made it easier to set down without noticing.</w:t>
+      </w:r>
+    </w:p>
+    <w:p>
+      <w:pPr>
+        <w:spacing w:before="120" w:after="120"/>
+      </w:pPr>
+      <w:r>
+        <w:t xml:space="preserve">The same four things belong to a student, only smaller and closer to hand. Choosing what the question is about underneath, before pasting it in. Weighing whether the answer that came back is one she could defend out loud to the person sitting next to her. Deciding what to do with it, which includes deciding not to use it. Then putting her own name on the result, whatever helped. Every chapter of this book has been an argument that those four can be taught, in small repeated moments, the same way anything is taught. I still believe it, and I've watched it happen.</w:t>
       </w:r>
     </w:p>
     <w:p>
@@ -7997,7 +8395,7 @@
         <w:spacing w:before="120" w:after="120"/>
       </w:pPr>
       <w:r>
-        <w:t xml:space="preserve">I've thought a lot about that waiting since the tools arrived, because at first glance the tool seems to do it better. It never interrupts. It never sighs. You can leave a question sitting in the window for an hour and come back to find it still there, still willing. The Reverse Prompt from the second book was built on exactly this: </w:t>
+        <w:t xml:space="preserve">I've thought a lot about that waiting since the tools arrived, because at first glance the tool seems to do it better. It never interrupts. It never sighs. You can leave a question sitting in the window for an hour and come back to find it still there, still willing. The Reverse Prompt from the second book was built on this: </w:t>
       </w:r>
       <w:r>
         <w:rPr>
@@ -8014,15 +8412,32 @@
         <w:spacing w:before="120" w:after="120"/>
       </w:pPr>
       <w:r>
-        <w:t xml:space="preserve">But it isn't waiting. It answers instantly, and it asks patiently, and neither of those is the same thing. Waiting is what a person does with their attention, on purpose, for someone else. It costs something. That teacher in the first book could have filled the silence with the right answer in half a second, and the silence was only worth anything because she chose not to. The boy after the bell felt the four seconds precisely because they were hers to spend on him. A window can't spend anything on anyone. It has nothing to hold back.</w:t>
-      </w:r>
-    </w:p>
-    <w:p>
-      <w:pPr>
-        <w:spacing w:before="120" w:after="120"/>
-      </w:pPr>
-      <w:r>
-        <w:t xml:space="preserve">This matters for teaching in a plain, practical way. Students learn what waiting looks like by being waited for. If the only patience they ever meet is the tireless kind in a chat window, they'll learn that patience is free, and it isn't. Have you noticed how rarely, in a full timetable, anyone is waited for at all? I notice it in myself most weeks. It's usually the last thing I remember to do.</w:t>
+        <w:t xml:space="preserve">None of that is waiting, though. The window answers instantly and it asks patiently, and waiting is a third thing. Waiting is what a person does with their attention, on purpose, for someone else. It costs something. That teacher in the first book could have filled the silence with the right answer in half a second, and the silence was only worth anything because she chose not to. The boy after the bell felt the four seconds because they were hers to spend on him. A window can't spend anything on anyone. It has nothing to hold back.</w:t>
+      </w:r>
+    </w:p>
+    <w:p>
+      <w:pPr>
+        <w:spacing w:before="120" w:after="120"/>
+      </w:pPr>
+      <w:r>
+        <w:t xml:space="preserve">This matters for teaching in a plain, practical way. Haim Ginott, whose </w:t>
+      </w:r>
+      <w:r>
+        <w:rPr>
+          <w:i/>
+        </w:rPr>
+        <w:t xml:space="preserve">Teacher and Child</w:t>
+      </w:r>
+      <w:r>
+        <w:t xml:space="preserve"> I quoted earlier in this book, goes on in the same passage: "It's my personal approach that creates the climate. It's my daily mood that makes the weather." Whether a child gets waited for is weather of that kind. If the only patience they ever meet is the tireless kind in a chat window, they'll learn that patience is free, and it isn't. Students learn what waiting looks like by being waited for.</w:t>
+      </w:r>
+    </w:p>
+    <w:p>
+      <w:pPr>
+        <w:spacing w:before="120" w:after="120"/>
+      </w:pPr>
+      <w:r>
+        <w:t xml:space="preserve">Have you noticed how rarely, in a full timetable, anyone is waited for at all? I notice it in myself most weeks. It's usually the last thing I remember to do.</w:t>
       </w:r>
     </w:p>
     <w:p>
@@ -8058,7 +8473,7 @@
         <w:spacing w:before="120" w:after="120"/>
       </w:pPr>
       <w:r>
-        <w:t xml:space="preserve">Nobody flinched, and that was the lesson. The second book described the small flinch that comes with </w:t>
+        <w:t xml:space="preserve">Nobody flinched. The second book described the small flinch that comes with </w:t>
       </w:r>
       <w:r>
         <w:rPr>
@@ -8067,15 +8482,15 @@
         <w:t xml:space="preserve">Did you write this?</w:t>
       </w:r>
       <w:r>
-        <w:t xml:space="preserve">, and the choice between being embarrassed and simply saying what happened. In a classroom that choice is watched by twenty-eight people, and they learn from it faster than from anything you put on a slide. A teacher who says what she used and what she threw out is not confessing. She is showing them what ownership looks like when the help is fluent and free.</w:t>
-      </w:r>
-    </w:p>
-    <w:p>
-      <w:pPr>
-        <w:spacing w:before="120" w:after="120"/>
-      </w:pPr>
-      <w:r>
-        <w:t xml:space="preserve">This book was written the same way, and I'd rather say so than have you wonder. An AI sat in on it as a thinking and drafting partner, in the manner these chapters describe. It produced drafts, and those drafts were argued with, trimmed, rewritten, and on a few occasions deleted whole. It asked me questions I'd been avoiding, more than once. Which lines survived, which claims I trusted, and what a teacher could actually use: all of that was decided on this side of the screen, along with every mistake.</w:t>
+        <w:t xml:space="preserve">, and the choice between being embarrassed and saying what happened. In a classroom that choice is watched by twenty-eight people, and they learn from it faster than from anything you put on a slide. A teacher who says what she used and what she threw out is showing them what ownership looks like when the help is fluent and free.</w:t>
+      </w:r>
+    </w:p>
+    <w:p>
+      <w:pPr>
+        <w:spacing w:before="120" w:after="120"/>
+      </w:pPr>
+      <w:r>
+        <w:t xml:space="preserve">This book was written the same way, and I'd rather say so than have you wonder. An AI sat in on it as a thinking and drafting partner, in the manner these chapters describe. It produced drafts, and those drafts were argued with, trimmed, rewritten, and on a few occasions deleted whole. It asked me questions I'd been avoiding, more than once. Which lines survived, which claims I trusted, and what a teacher could use on a Monday morning: all of that was decided on this side of the screen, along with every mistake.</w:t>
       </w:r>
     </w:p>
     <w:p>
@@ -8107,7 +8522,7 @@
         <w:spacing w:before="120" w:after="120"/>
       </w:pPr>
       <w:r>
-        <w:t xml:space="preserve">The same shape has appeared in every chapter, and by now you could probably draw it. Someone reached for the finished thing, the marked stack, the essay, the plan, and the window handed it over without complaint. Then someone slowed down, said what was true about the real class and the real child, and asked for something smaller that pointed at understanding. What came back was useful, and it was useful because a person had changed what they were asking for, not because the window had grown wiser overnight.</w:t>
+        <w:t xml:space="preserve">The same shape has appeared in every chapter, and by now you could probably draw it. Someone reached for the finished thing, the marked stack, the essay, the plan, and the window handed it over without complaint. Then someone slowed down, said what was true about the real class and the real child, and asked for something smaller that pointed at understanding. What came back was useful, and the window had done nothing new to make it so. The person asking had.</w:t>
       </w:r>
     </w:p>
     <w:p>
@@ -8123,7 +8538,7 @@
         <w:spacing w:before="120" w:after="120"/>
       </w:pPr>
       <w:r>
-        <w:t xml:space="preserve">Picture the classroom after school. The chairs are up on the desks. Someone has wiped most of the board, and near the edge a question is still there in a student's handwriting, one of the ones they leave at the end of a lesson now. Nobody answered it. It will be there tomorrow when they come in, and that's the point. A room where a question can be left unanswered overnight, and still be there in the morning for someone to pick up, is a room that's still human.</w:t>
+        <w:t xml:space="preserve">Picture the classroom after school. The chairs are up on the desks. Someone has wiped most of the board, and near the edge a question is still there in a student's handwriting, copied up from one of the slips they write in the last two minutes of a lesson now. It began, in this book, as a sticky note on a strip of paper down one side of a room. Nobody has answered it. Someone had the nerve to leave it there overnight, and in the morning someone else will read it before the first bell. A room where a question can be left on the board all night, and still be there for a child to pick up, is a room that's still human.</w:t>
       </w:r>
     </w:p>
     <w:p>
@@ -8187,7 +8602,7 @@
         <w:spacing w:before="120" w:after="120"/>
       </w:pPr>
       <w:r>
-        <w:t xml:space="preserve">For the rest of this term, and after that for as long as it lasts, ask yourself the question the first book left you with before each lesson begins. Not before you plan it. Before you walk in.</w:t>
+        <w:t xml:space="preserve">For the rest of this term, and after that for as long as it lasts, ask yourself the question the first book left you with before each lesson begins. Ask it at the door, once the planning is finished and there is nothing left to type.</w:t>
       </w:r>
     </w:p>
     <w:p>
@@ -8225,7 +8640,7 @@
         <w:spacing w:before="120" w:after="120"/>
       </w:pPr>
       <w:r>
-        <w:t xml:space="preserve">Then wait. Longer than is comfortable. The tool will go on answering, quicker each term and more sure of itself, and it will never once do this. You don't need a better tool for it. You need a smaller habit, and a few seconds you're willing to spend on someone.</w:t>
+        <w:t xml:space="preserve">Then wait. Longer than is comfortable. The tool will go on answering, quicker each term and more sure of itself, and it will never once do this. Everything a window does will get faster. The four seconds you spend on one child cannot be made faster, and they are the part he keeps.</w:t>
       </w:r>
     </w:p>
     <w:p>
@@ -8792,6 +9207,523 @@
         <w:pStyle w:val="Heading3"/>
       </w:pPr>
       <w:r>
+        <w:t xml:space="preserve">Lines Quoted in This Book</w:t>
+      </w:r>
+    </w:p>
+    <w:p>
+      <w:pPr>
+        <w:spacing w:before="120" w:after="120"/>
+      </w:pPr>
+      <w:r>
+        <w:t xml:space="preserve">Where a chapter reaches for someone else's words, this is where they came from. A few lines are widely attributed rather than securely sourced, and the text says so where that is the case.</w:t>
+      </w:r>
+    </w:p>
+    <w:p>
+      <w:pPr>
+        <w:spacing w:before="120" w:after="120"/>
+      </w:pPr>
+      <w:r>
+        <w:t xml:space="preserve">Whitehead, A. N. (1929). </w:t>
+      </w:r>
+      <w:r>
+        <w:rPr>
+          <w:i/>
+        </w:rPr>
+        <w:t xml:space="preserve">The Aims of Education and Other Essays</w:t>
+      </w:r>
+      <w:r>
+        <w:t xml:space="preserve">. Macmillan. The source of both Whitehead lines: the well-informed man as the most useless bore, and education as the art of the utilisation of knowledge.</w:t>
+      </w:r>
+    </w:p>
+    <w:p>
+      <w:pPr>
+        <w:spacing w:before="120" w:after="120"/>
+      </w:pPr>
+      <w:r>
+        <w:t xml:space="preserve">Dewey, J. (1897). "My Pedagogic Creed." </w:t>
+      </w:r>
+      <w:r>
+        <w:rPr>
+          <w:i/>
+        </w:rPr>
+        <w:t xml:space="preserve">The School Journal</w:t>
+      </w:r>
+      <w:r>
+        <w:t xml:space="preserve">, 54(3), 77-80. Education as a process of living rather than a preparation for future living.</w:t>
+      </w:r>
+    </w:p>
+    <w:p>
+      <w:pPr>
+        <w:spacing w:before="120" w:after="120"/>
+      </w:pPr>
+      <w:r>
+        <w:t xml:space="preserve">Rabi, I. I., as told to Donald Sheff (1988). Letter to the editor, </w:t>
+      </w:r>
+      <w:r>
+        <w:rPr>
+          <w:i/>
+        </w:rPr>
+        <w:t xml:space="preserve">The New York Times</w:t>
+      </w:r>
+      <w:r>
+        <w:t xml:space="preserve">, 19 January. The story of the physicist's mother and her daily question, "Did you ask a good question today?"</w:t>
+      </w:r>
+    </w:p>
+    <w:p>
+      <w:pPr>
+        <w:spacing w:before="120" w:after="120"/>
+      </w:pPr>
+      <w:r>
+        <w:t xml:space="preserve">Postman, N. (1979). </w:t>
+      </w:r>
+      <w:r>
+        <w:rPr>
+          <w:i/>
+        </w:rPr>
+        <w:t xml:space="preserve">Teaching as a Conserving Activity</w:t>
+      </w:r>
+      <w:r>
+        <w:t xml:space="preserve">. Delacorte. The line about children entering school as question marks and leaving as periods is usually traced to Postman's writing on schooling.</w:t>
+      </w:r>
+    </w:p>
+    <w:p>
+      <w:pPr>
+        <w:spacing w:before="120" w:after="120"/>
+      </w:pPr>
+      <w:r>
+        <w:t xml:space="preserve">Duckworth, E. (1972). "The Having of Wonderful Ideas." </w:t>
+      </w:r>
+      <w:r>
+        <w:rPr>
+          <w:i/>
+        </w:rPr>
+        <w:t xml:space="preserve">Harvard Educational Review</w:t>
+      </w:r>
+      <w:r>
+        <w:t xml:space="preserve">, 42(2), 217-231. Later the title essay of her 1987 book from Teachers College Press.</w:t>
+      </w:r>
+    </w:p>
+    <w:p>
+      <w:pPr>
+        <w:spacing w:before="120" w:after="120"/>
+      </w:pPr>
+      <w:r>
+        <w:t xml:space="preserve">Epictetus. </w:t>
+      </w:r>
+      <w:r>
+        <w:rPr>
+          <w:i/>
+        </w:rPr>
+        <w:t xml:space="preserve">Discourses</w:t>
+      </w:r>
+      <w:r>
+        <w:t xml:space="preserve">, Book II. Various translations. On the impossibility of learning what one thinks one already knows.</w:t>
+      </w:r>
+    </w:p>
+    <w:p>
+      <w:pPr>
+        <w:spacing w:before="120" w:after="120"/>
+      </w:pPr>
+      <w:r>
+        <w:t xml:space="preserve">Emerson, R. W. (1876). "Education." In </w:t>
+      </w:r>
+      <w:r>
+        <w:rPr>
+          <w:i/>
+        </w:rPr>
+        <w:t xml:space="preserve">Lectures and Biographical Sketches</w:t>
+      </w:r>
+      <w:r>
+        <w:t xml:space="preserve">. Houghton Mifflin. The secret of education lies in respecting the pupil.</w:t>
+      </w:r>
+    </w:p>
+    <w:p>
+      <w:pPr>
+        <w:spacing w:before="120" w:after="120"/>
+      </w:pPr>
+      <w:r>
+        <w:t xml:space="preserve">Ginott, H. G. (1972). </w:t>
+      </w:r>
+      <w:r>
+        <w:rPr>
+          <w:i/>
+        </w:rPr>
+        <w:t xml:space="preserve">Teacher and Child</w:t>
+      </w:r>
+      <w:r>
+        <w:t xml:space="preserve">. Macmillan. The passage on the teacher as the decisive element in the classroom, whose daily mood makes the weather.</w:t>
+      </w:r>
+    </w:p>
+    <w:p>
+      <w:pPr>
+        <w:spacing w:before="120" w:after="120"/>
+      </w:pPr>
+      <w:r>
+        <w:t xml:space="preserve">Ginott, H. G. (1965). </w:t>
+      </w:r>
+      <w:r>
+        <w:rPr>
+          <w:i/>
+        </w:rPr>
+        <w:t xml:space="preserve">Between Parent and Child</w:t>
+      </w:r>
+      <w:r>
+        <w:t xml:space="preserve">. Macmillan. Children as wet cement.</w:t>
+      </w:r>
+    </w:p>
+    <w:p>
+      <w:pPr>
+        <w:spacing w:before="120" w:after="120"/>
+      </w:pPr>
+      <w:r>
+        <w:t xml:space="preserve">Confucius. </w:t>
+      </w:r>
+      <w:r>
+        <w:rPr>
+          <w:i/>
+        </w:rPr>
+        <w:t xml:space="preserve">The Analects</w:t>
+      </w:r>
+      <w:r>
+        <w:t xml:space="preserve">, Book II, in the translation by James Legge (1861). Learning without thought, and thought without learning.</w:t>
+      </w:r>
+    </w:p>
+    <w:p>
+      <w:pPr>
+        <w:spacing w:before="120" w:after="120"/>
+      </w:pPr>
+      <w:r>
+        <w:t xml:space="preserve">Plutarch. "On Listening to Lectures." In </w:t>
+      </w:r>
+      <w:r>
+        <w:rPr>
+          <w:i/>
+        </w:rPr>
+        <w:t xml:space="preserve">Moralia</w:t>
+      </w:r>
+      <w:r>
+        <w:t xml:space="preserve">. The mind as a fire to be kindled is a common rendering of a passage in this essay, and is quoted here as attributed.</w:t>
+      </w:r>
+    </w:p>
+    <w:p>
+      <w:pPr>
+        <w:spacing w:before="120" w:after="120"/>
+      </w:pPr>
+      <w:r>
+        <w:t xml:space="preserve">Rogers, F. (2003). </w:t>
+      </w:r>
+      <w:r>
+        <w:rPr>
+          <w:i/>
+        </w:rPr>
+        <w:t xml:space="preserve">The World According to Mister Rogers</w:t>
+      </w:r>
+      <w:r>
+        <w:t xml:space="preserve">. Hyperion. Anything human is mentionable, and anything mentionable is more manageable.</w:t>
+      </w:r>
+    </w:p>
+    <w:p>
+      <w:pPr>
+        <w:spacing w:before="120" w:after="120"/>
+      </w:pPr>
+      <w:r>
+        <w:t xml:space="preserve">Popper, K. R. (1963). </w:t>
+      </w:r>
+      <w:r>
+        <w:rPr>
+          <w:i/>
+        </w:rPr>
+        <w:t xml:space="preserve">Conjectures and Refutations</w:t>
+      </w:r>
+      <w:r>
+        <w:t xml:space="preserve">. Routledge. Irrefutability as a vice rather than a virtue of a theory.</w:t>
+      </w:r>
+    </w:p>
+    <w:p>
+      <w:pPr>
+        <w:spacing w:before="120" w:after="120"/>
+      </w:pPr>
+      <w:r>
+        <w:t xml:space="preserve">Sagan, C. (1980). </w:t>
+      </w:r>
+      <w:r>
+        <w:rPr>
+          <w:i/>
+        </w:rPr>
+        <w:t xml:space="preserve">Cosmos</w:t>
+      </w:r>
+      <w:r>
+        <w:t xml:space="preserve">, episode 12, "Encyclopaedia Galactica." PBS. Extraordinary claims require extraordinary evidence.</w:t>
+      </w:r>
+    </w:p>
+    <w:p>
+      <w:pPr>
+        <w:spacing w:before="120" w:after="120"/>
+      </w:pPr>
+      <w:r>
+        <w:t xml:space="preserve">Lockhart, P. (2009). </w:t>
+      </w:r>
+      <w:r>
+        <w:rPr>
+          <w:i/>
+        </w:rPr>
+        <w:t xml:space="preserve">A Mathematician's Lament</w:t>
+      </w:r>
+      <w:r>
+        <w:t xml:space="preserve">. Bellevue Literary Press. Mathematics as the art of explanation.</w:t>
+      </w:r>
+    </w:p>
+    <w:p>
+      <w:pPr>
+        <w:spacing w:before="120" w:after="120"/>
+      </w:pPr>
+      <w:r>
+        <w:t xml:space="preserve">Zinsser, W. (1988). </w:t>
+      </w:r>
+      <w:r>
+        <w:rPr>
+          <w:i/>
+        </w:rPr>
+        <w:t xml:space="preserve">Writing to Learn</w:t>
+      </w:r>
+      <w:r>
+        <w:t xml:space="preserve">. Harper &amp; Row. Writing as thinking on paper.</w:t>
+      </w:r>
+    </w:p>
+    <w:p>
+      <w:pPr>
+        <w:spacing w:before="120" w:after="120"/>
+      </w:pPr>
+      <w:r>
+        <w:t xml:space="preserve">Orwell, G. (1946). "Politics and the English Language." </w:t>
+      </w:r>
+      <w:r>
+        <w:rPr>
+          <w:i/>
+        </w:rPr>
+        <w:t xml:space="preserve">Horizon</w:t>
+      </w:r>
+      <w:r>
+        <w:t xml:space="preserve">, April. And (1946) "Why I Write." </w:t>
+      </w:r>
+      <w:r>
+        <w:rPr>
+          <w:i/>
+        </w:rPr>
+        <w:t xml:space="preserve">Gangrel</w:t>
+      </w:r>
+      <w:r>
+        <w:t xml:space="preserve">, Summer. The short word over the long one, and good prose as a window pane.</w:t>
+      </w:r>
+    </w:p>
+    <w:p>
+      <w:pPr>
+        <w:spacing w:before="120" w:after="120"/>
+      </w:pPr>
+      <w:r>
+        <w:t xml:space="preserve">Rams, D. </w:t>
+      </w:r>
+      <w:r>
+        <w:rPr>
+          <w:i/>
+        </w:rPr>
+        <w:t xml:space="preserve">Ten Principles for Good Design</w:t>
+      </w:r>
+      <w:r>
+        <w:t xml:space="preserve">. Vitsœ. Good design is as little design as possible.</w:t>
+      </w:r>
+    </w:p>
+    <w:p>
+      <w:pPr>
+        <w:spacing w:before="120" w:after="120"/>
+      </w:pPr>
+      <w:r>
+        <w:t xml:space="preserve">Palmer, P. J. (1998). </w:t>
+      </w:r>
+      <w:r>
+        <w:rPr>
+          <w:i/>
+        </w:rPr>
+        <w:t xml:space="preserve">The Courage to Teach</w:t>
+      </w:r>
+      <w:r>
+        <w:t xml:space="preserve">. Jossey-Bass. We teach who we are.</w:t>
+      </w:r>
+    </w:p>
+    <w:p>
+      <w:pPr>
+        <w:spacing w:before="120" w:after="120"/>
+      </w:pPr>
+      <w:r>
+        <w:t xml:space="preserve">Weil, S. (1942). Letter to Joë Bousquet, 13 April. In </w:t>
+      </w:r>
+      <w:r>
+        <w:rPr>
+          <w:i/>
+        </w:rPr>
+        <w:t xml:space="preserve">Correspondance</w:t>
+      </w:r>
+      <w:r>
+        <w:t xml:space="preserve">. Attention as the rarest and purest form of generosity.</w:t>
+      </w:r>
+    </w:p>
+    <w:p>
+      <w:pPr>
+        <w:spacing w:before="120" w:after="120"/>
+      </w:pPr>
+      <w:r>
+        <w:t xml:space="preserve">Feynman, R. P. (1974). "Cargo Cult Science." Caltech commencement address. The first principle is that you must not fool yourself.</w:t>
+      </w:r>
+    </w:p>
+    <w:p>
+      <w:pPr>
+        <w:spacing w:before="120" w:after="120"/>
+      </w:pPr>
+      <w:r>
+        <w:t xml:space="preserve">Russell, B. (1928). </w:t>
+      </w:r>
+      <w:r>
+        <w:rPr>
+          <w:i/>
+        </w:rPr>
+        <w:t xml:space="preserve">Sceptical Essays</w:t>
+      </w:r>
+      <w:r>
+        <w:t xml:space="preserve">. George Allen &amp; Unwin. The wish to find out, as opposed to the will to believe.</w:t>
+      </w:r>
+    </w:p>
+    <w:p>
+      <w:pPr>
+        <w:spacing w:before="120" w:after="120"/>
+      </w:pPr>
+      <w:r>
+        <w:t xml:space="preserve">Halmos, P. R. (1985). </w:t>
+      </w:r>
+      <w:r>
+        <w:rPr>
+          <w:i/>
+        </w:rPr>
+        <w:t xml:space="preserve">I Want to Be a Mathematician</w:t>
+      </w:r>
+      <w:r>
+        <w:t xml:space="preserve">. Springer. The only way to learn mathematics is to do mathematics.</w:t>
+      </w:r>
+    </w:p>
+    <w:p>
+      <w:pPr>
+        <w:spacing w:before="120" w:after="120"/>
+      </w:pPr>
+      <w:r>
+        <w:t xml:space="preserve">Montessori, M. (1936). </w:t>
+      </w:r>
+      <w:r>
+        <w:rPr>
+          <w:i/>
+        </w:rPr>
+        <w:t xml:space="preserve">The Secret of Childhood</w:t>
+      </w:r>
+      <w:r>
+        <w:t xml:space="preserve">. Longmans. Never help a child with a task at which he feels he can succeed.</w:t>
+      </w:r>
+    </w:p>
+    <w:p>
+      <w:pPr>
+        <w:spacing w:before="120" w:after="120"/>
+      </w:pPr>
+      <w:r>
+        <w:t xml:space="preserve">Ionesco, E. (1969). </w:t>
+      </w:r>
+      <w:r>
+        <w:rPr>
+          <w:i/>
+        </w:rPr>
+        <w:t xml:space="preserve">Découvertes</w:t>
+      </w:r>
+      <w:r>
+        <w:t xml:space="preserve">. Skira. It is not the answer that enlightens, but the question. Quoted as attributed, from the French.</w:t>
+      </w:r>
+    </w:p>
+    <w:p>
+      <w:pPr>
+        <w:spacing w:before="120" w:after="120"/>
+      </w:pPr>
+      <w:r>
+        <w:t xml:space="preserve">Einstein, A. (1955). Interview with William Miller, </w:t>
+      </w:r>
+      <w:r>
+        <w:rPr>
+          <w:i/>
+        </w:rPr>
+        <w:t xml:space="preserve">LIFE</w:t>
+      </w:r>
+      <w:r>
+        <w:t xml:space="preserve"> magazine, 2 May. The important thing is not to stop questioning.</w:t>
+      </w:r>
+    </w:p>
+    <w:p>
+      <w:pPr>
+        <w:spacing w:before="120" w:after="120"/>
+      </w:pPr>
+      <w:r>
+        <w:t xml:space="preserve">Rilke, R. M. (1903). Letter to Franz Xaver Kappus, 16 July. In </w:t>
+      </w:r>
+      <w:r>
+        <w:rPr>
+          <w:i/>
+        </w:rPr>
+        <w:t xml:space="preserve">Letters to a Young Poet</w:t>
+      </w:r>
+      <w:r>
+        <w:t xml:space="preserve">. Try to love the questions themselves.</w:t>
+      </w:r>
+    </w:p>
+    <w:p>
+      <w:pPr>
+        <w:spacing w:before="120" w:after="120"/>
+      </w:pPr>
+      <w:r>
+        <w:t xml:space="preserve">Voltaire. Widely attributed. Judge a man by his questions rather than by his answers. No secure source in Voltaire's works has been found, and the line is quoted as attributed.</w:t>
+      </w:r>
+    </w:p>
+    <w:p>
+      <w:pPr>
+        <w:spacing w:before="120" w:after="120"/>
+      </w:pPr>
+      <w:r>
+        <w:t xml:space="preserve">Saint-Exupéry, A. de (1939). </w:t>
+      </w:r>
+      <w:r>
+        <w:rPr>
+          <w:i/>
+        </w:rPr>
+        <w:t xml:space="preserve">Terre des hommes</w:t>
+      </w:r>
+      <w:r>
+        <w:t xml:space="preserve">. Gallimard. Perfection is achieved when there is nothing left to take away.</w:t>
+      </w:r>
+    </w:p>
+    <w:p>
+      <w:pPr>
+        <w:spacing w:before="120" w:after="120"/>
+      </w:pPr>
+      <w:r>
+        <w:t xml:space="preserve">Washington, B. T. (1901). </w:t>
+      </w:r>
+      <w:r>
+        <w:rPr>
+          <w:i/>
+        </w:rPr>
+        <w:t xml:space="preserve">Up from Slavery</w:t>
+      </w:r>
+      <w:r>
+        <w:t xml:space="preserve">. Doubleday. On placing responsibility on a person and letting them know they are trusted.</w:t>
+      </w:r>
+    </w:p>
+    <w:p>
+      <w:pPr>
+        <w:pStyle w:val="Heading3"/>
+      </w:pPr>
+      <w:r>
         <w:t xml:space="preserve">Guidance from the Tool Makers</w:t>
       </w:r>
     </w:p>
@@ -9120,7 +10052,7 @@
         <w:spacing w:before="120" w:after="120"/>
       </w:pPr>
       <w:r>
-        <w:t xml:space="preserve">Use when a student has a fluent explanation and needs to find out which sentences are resting on anything.</w:t>
+        <w:t xml:space="preserve">Use when a student has a polished explanation and needs to find out which sentences are resting on anything.</w:t>
       </w:r>
     </w:p>
     <w:p>

</xml_diff>